<commit_message>
Felesleges Termék Backlog törlése
</commit_message>
<xml_diff>
--- a/Termék Backlog.docx
+++ b/Termék Backlog.docx
@@ -1,6 +1,6 @@
 
 <file path=word/document.xml><?xml version="1.0" encoding="utf-8"?>
-<w:document xmlns:wpc="http://schemas.microsoft.com/office/word/2010/wordprocessingCanvas" xmlns:cx="http://schemas.microsoft.com/office/drawing/2014/chartex" xmlns:cx1="http://schemas.microsoft.com/office/drawing/2015/9/8/chartex" xmlns:cx2="http://schemas.microsoft.com/office/drawing/2015/10/21/chartex" xmlns:cx3="http://schemas.microsoft.com/office/drawing/2016/5/9/chartex" xmlns:cx4="http://schemas.microsoft.com/office/drawing/2016/5/10/chartex" xmlns:cx5="http://schemas.microsoft.com/office/drawing/2016/5/11/chartex" xmlns:cx6="http://schemas.microsoft.com/office/drawing/2016/5/12/chartex" xmlns:cx7="http://schemas.microsoft.com/office/drawing/2016/5/13/chartex" xmlns:cx8="http://schemas.microsoft.com/office/drawing/2016/5/14/chartex" xmlns:mc="http://schemas.openxmlformats.org/markup-compatibility/2006" xmlns:aink="http://schemas.microsoft.com/office/drawing/2016/ink" xmlns:am3d="http://schemas.microsoft.com/office/drawing/2017/model3d" xmlns:o="urn:schemas-microsoft-com:office:office" xmlns:r="http://schemas.openxmlformats.org/officeDocument/2006/relationships" xmlns:m="http://schemas.openxmlformats.org/officeDocument/2006/math" xmlns:v="urn:schemas-microsoft-com:vml" xmlns:wp14="http://schemas.microsoft.com/office/word/2010/wordprocessingDrawing" xmlns:wp="http://schemas.openxmlformats.org/drawingml/2006/wordprocessingDrawing" xmlns:w10="urn:schemas-microsoft-com:office:word" xmlns:w="http://schemas.openxmlformats.org/wordprocessingml/2006/main" xmlns:w14="http://schemas.microsoft.com/office/word/2010/wordml" xmlns:w15="http://schemas.microsoft.com/office/word/2012/wordml" xmlns:w16cid="http://schemas.microsoft.com/office/word/2016/wordml/cid" xmlns:w16se="http://schemas.microsoft.com/office/word/2015/wordml/symex" xmlns:wpg="http://schemas.microsoft.com/office/word/2010/wordprocessingGroup" xmlns:wpi="http://schemas.microsoft.com/office/word/2010/wordprocessingInk" xmlns:wne="http://schemas.microsoft.com/office/word/2006/wordml" xmlns:wps="http://schemas.microsoft.com/office/word/2010/wordprocessingShape" mc:Ignorable="w14 w15 w16se w16cid wp14">
+<w:document xmlns:wpc="http://schemas.microsoft.com/office/word/2010/wordprocessingCanvas" xmlns:cx="http://schemas.microsoft.com/office/drawing/2014/chartex" xmlns:cx1="http://schemas.microsoft.com/office/drawing/2015/9/8/chartex" xmlns:cx2="http://schemas.microsoft.com/office/drawing/2015/10/21/chartex" xmlns:cx3="http://schemas.microsoft.com/office/drawing/2016/5/9/chartex" xmlns:cx4="http://schemas.microsoft.com/office/drawing/2016/5/10/chartex" xmlns:cx5="http://schemas.microsoft.com/office/drawing/2016/5/11/chartex" xmlns:cx6="http://schemas.microsoft.com/office/drawing/2016/5/12/chartex" xmlns:cx7="http://schemas.microsoft.com/office/drawing/2016/5/13/chartex" xmlns:cx8="http://schemas.microsoft.com/office/drawing/2016/5/14/chartex" xmlns:mc="http://schemas.openxmlformats.org/markup-compatibility/2006" xmlns:aink="http://schemas.microsoft.com/office/drawing/2016/ink" xmlns:am3d="http://schemas.microsoft.com/office/drawing/2017/model3d" xmlns:o="urn:schemas-microsoft-com:office:office" xmlns:oel="http://schemas.microsoft.com/office/2019/extlst" xmlns:r="http://schemas.openxmlformats.org/officeDocument/2006/relationships" xmlns:m="http://schemas.openxmlformats.org/officeDocument/2006/math" xmlns:v="urn:schemas-microsoft-com:vml" xmlns:wp14="http://schemas.microsoft.com/office/word/2010/wordprocessingDrawing" xmlns:wp="http://schemas.openxmlformats.org/drawingml/2006/wordprocessingDrawing" xmlns:w10="urn:schemas-microsoft-com:office:word" xmlns:w="http://schemas.openxmlformats.org/wordprocessingml/2006/main" xmlns:w14="http://schemas.microsoft.com/office/word/2010/wordml" xmlns:w15="http://schemas.microsoft.com/office/word/2012/wordml" xmlns:w16cex="http://schemas.microsoft.com/office/word/2018/wordml/cex" xmlns:w16cid="http://schemas.microsoft.com/office/word/2016/wordml/cid" xmlns:w16="http://schemas.microsoft.com/office/word/2018/wordml" xmlns:w16du="http://schemas.microsoft.com/office/word/2023/wordml/word16du" xmlns:w16sdtdh="http://schemas.microsoft.com/office/word/2020/wordml/sdtdatahash" xmlns:w16sdtfl="http://schemas.microsoft.com/office/word/2024/wordml/sdtformatlock" xmlns:w16se="http://schemas.microsoft.com/office/word/2015/wordml/symex" xmlns:wpg="http://schemas.microsoft.com/office/word/2010/wordprocessingGroup" xmlns:wpi="http://schemas.microsoft.com/office/word/2010/wordprocessingInk" xmlns:wne="http://schemas.microsoft.com/office/word/2006/wordml" xmlns:wps="http://schemas.microsoft.com/office/word/2010/wordprocessingShape" mc:Ignorable="w14 w15 w16se w16cid w16 w16cex w16sdtdh w16sdtfl w16du wp14">
   <w:body>
     <w:p>
       <w:pPr>
@@ -109,23 +109,13 @@
           <w:szCs w:val="24"/>
         </w:rPr>
       </w:pPr>
-      <w:proofErr w:type="spellStart"/>
-      <w:r>
-        <w:rPr>
-          <w:rFonts w:ascii="Times New Roman" w:hAnsi="Times New Roman" w:cs="Times New Roman"/>
-          <w:sz w:val="24"/>
-          <w:szCs w:val="24"/>
-        </w:rPr>
-        <w:t>Csanádi</w:t>
-      </w:r>
-      <w:proofErr w:type="spellEnd"/>
-      <w:r>
-        <w:rPr>
-          <w:rFonts w:ascii="Times New Roman" w:hAnsi="Times New Roman" w:cs="Times New Roman"/>
-          <w:sz w:val="24"/>
-          <w:szCs w:val="24"/>
-        </w:rPr>
-        <w:t xml:space="preserve"> Kevin</w:t>
+      <w:r>
+        <w:rPr>
+          <w:rFonts w:ascii="Times New Roman" w:hAnsi="Times New Roman" w:cs="Times New Roman"/>
+          <w:sz w:val="24"/>
+          <w:szCs w:val="24"/>
+        </w:rPr>
+        <w:t>Csanádi Kevin</w:t>
       </w:r>
     </w:p>
     <w:p>
@@ -174,7 +164,6 @@
           <w:szCs w:val="24"/>
         </w:rPr>
       </w:pPr>
-      <w:proofErr w:type="spellStart"/>
       <w:r>
         <w:rPr>
           <w:rFonts w:ascii="Times New Roman" w:hAnsi="Times New Roman" w:cs="Times New Roman"/>
@@ -183,7 +172,6 @@
         </w:rPr>
         <w:t>Eventify</w:t>
       </w:r>
-      <w:proofErr w:type="spellEnd"/>
     </w:p>
     <w:p>
       <w:pPr>
@@ -290,7 +278,6 @@
         </w:rPr>
         <w:t>„</w:t>
       </w:r>
-      <w:proofErr w:type="spellStart"/>
       <w:r>
         <w:rPr>
           <w:rFonts w:ascii="Times New Roman" w:hAnsi="Times New Roman" w:cs="Times New Roman"/>
@@ -299,7 +286,6 @@
         </w:rPr>
         <w:t>event</w:t>
       </w:r>
-      <w:proofErr w:type="spellEnd"/>
       <w:r>
         <w:rPr>
           <w:rFonts w:ascii="Times New Roman" w:hAnsi="Times New Roman" w:cs="Times New Roman"/>
@@ -365,97 +351,7 @@
           <w:sz w:val="24"/>
           <w:szCs w:val="24"/>
         </w:rPr>
-        <w:t xml:space="preserve">Az oldalunk egy </w:t>
-      </w:r>
-      <w:proofErr w:type="spellStart"/>
-      <w:r>
-        <w:rPr>
-          <w:rFonts w:ascii="Times New Roman" w:hAnsi="Times New Roman" w:cs="Times New Roman"/>
-          <w:sz w:val="24"/>
-          <w:szCs w:val="24"/>
-        </w:rPr>
-        <w:t>Angular</w:t>
-      </w:r>
-      <w:proofErr w:type="spellEnd"/>
-      <w:r>
-        <w:rPr>
-          <w:rFonts w:ascii="Times New Roman" w:hAnsi="Times New Roman" w:cs="Times New Roman"/>
-          <w:sz w:val="24"/>
-          <w:szCs w:val="24"/>
-        </w:rPr>
-        <w:t xml:space="preserve"> keretrendszerben íródott HTML weboldal. A formázáshoz </w:t>
-      </w:r>
-      <w:proofErr w:type="spellStart"/>
-      <w:r>
-        <w:rPr>
-          <w:rFonts w:ascii="Times New Roman" w:hAnsi="Times New Roman" w:cs="Times New Roman"/>
-          <w:sz w:val="24"/>
-          <w:szCs w:val="24"/>
-        </w:rPr>
-        <w:t>Bootstrappet</w:t>
-      </w:r>
-      <w:proofErr w:type="spellEnd"/>
-      <w:r>
-        <w:rPr>
-          <w:rFonts w:ascii="Times New Roman" w:hAnsi="Times New Roman" w:cs="Times New Roman"/>
-          <w:sz w:val="24"/>
-          <w:szCs w:val="24"/>
-        </w:rPr>
-        <w:t xml:space="preserve"> használtunk. Node.js futtatókörnyezetben </w:t>
-      </w:r>
-      <w:proofErr w:type="spellStart"/>
-      <w:r>
-        <w:rPr>
-          <w:rFonts w:ascii="Times New Roman" w:hAnsi="Times New Roman" w:cs="Times New Roman"/>
-          <w:sz w:val="24"/>
-          <w:szCs w:val="24"/>
-        </w:rPr>
-        <w:t>npm</w:t>
-      </w:r>
-      <w:proofErr w:type="spellEnd"/>
-      <w:r>
-        <w:rPr>
-          <w:rFonts w:ascii="Times New Roman" w:hAnsi="Times New Roman" w:cs="Times New Roman"/>
-          <w:sz w:val="24"/>
-          <w:szCs w:val="24"/>
-        </w:rPr>
-        <w:t xml:space="preserve"> csomagkezelőt alkalmaztunk. Verziókövetéshez GitHub-ot, projektmenedzsmenthez pedig </w:t>
-      </w:r>
-      <w:proofErr w:type="spellStart"/>
-      <w:r>
-        <w:rPr>
-          <w:rFonts w:ascii="Times New Roman" w:hAnsi="Times New Roman" w:cs="Times New Roman"/>
-          <w:sz w:val="24"/>
-          <w:szCs w:val="24"/>
-        </w:rPr>
-        <w:t>Jira</w:t>
-      </w:r>
-      <w:proofErr w:type="spellEnd"/>
-      <w:r>
-        <w:rPr>
-          <w:rFonts w:ascii="Times New Roman" w:hAnsi="Times New Roman" w:cs="Times New Roman"/>
-          <w:sz w:val="24"/>
-          <w:szCs w:val="24"/>
-        </w:rPr>
-        <w:t xml:space="preserve">-t használtunk. A projekt fejlesztése agilis módon </w:t>
-      </w:r>
-      <w:proofErr w:type="spellStart"/>
-      <w:r>
-        <w:rPr>
-          <w:rFonts w:ascii="Times New Roman" w:hAnsi="Times New Roman" w:cs="Times New Roman"/>
-          <w:sz w:val="24"/>
-          <w:szCs w:val="24"/>
-        </w:rPr>
-        <w:t>Scrum</w:t>
-      </w:r>
-      <w:proofErr w:type="spellEnd"/>
-      <w:r>
-        <w:rPr>
-          <w:rFonts w:ascii="Times New Roman" w:hAnsi="Times New Roman" w:cs="Times New Roman"/>
-          <w:sz w:val="24"/>
-          <w:szCs w:val="24"/>
-        </w:rPr>
-        <w:t xml:space="preserve"> keretrendszerben történt.  Az oldal </w:t>
+        <w:t xml:space="preserve">Az oldalunk egy Angular keretrendszerben íródott HTML weboldal. A formázáshoz Bootstrappet használtunk. Node.js futtatókörnyezetben npm csomagkezelőt alkalmaztunk. Verziókövetéshez GitHub-ot, projektmenedzsmenthez pedig Jira-t használtunk. A projekt fejlesztése agilis módon Scrum keretrendszerben történt.  Az oldal </w:t>
       </w:r>
       <w:r>
         <w:rPr>
@@ -537,23 +433,13 @@
           <w:szCs w:val="24"/>
         </w:rPr>
       </w:pPr>
-      <w:proofErr w:type="spellStart"/>
-      <w:r>
-        <w:rPr>
-          <w:rFonts w:ascii="Times New Roman" w:hAnsi="Times New Roman" w:cs="Times New Roman"/>
-          <w:sz w:val="24"/>
-          <w:szCs w:val="24"/>
-        </w:rPr>
-        <w:t>Adminiszrátor</w:t>
-      </w:r>
-      <w:proofErr w:type="spellEnd"/>
-      <w:r>
-        <w:rPr>
-          <w:rFonts w:ascii="Times New Roman" w:hAnsi="Times New Roman" w:cs="Times New Roman"/>
-          <w:sz w:val="24"/>
-          <w:szCs w:val="24"/>
-        </w:rPr>
-        <w:t xml:space="preserve"> (alap esetben a projekt három fejlesztője)</w:t>
+      <w:r>
+        <w:rPr>
+          <w:rFonts w:ascii="Times New Roman" w:hAnsi="Times New Roman" w:cs="Times New Roman"/>
+          <w:sz w:val="24"/>
+          <w:szCs w:val="24"/>
+        </w:rPr>
+        <w:t>Adminiszrátor (alap esetben a projekt három fejlesztője)</w:t>
       </w:r>
       <w:r>
         <w:rPr>
@@ -1890,23 +1776,13 @@
           <w:szCs w:val="24"/>
         </w:rPr>
       </w:pPr>
-      <w:proofErr w:type="spellStart"/>
-      <w:r>
-        <w:rPr>
-          <w:rFonts w:ascii="Times New Roman" w:hAnsi="Times New Roman" w:cs="Times New Roman"/>
-          <w:sz w:val="24"/>
-          <w:szCs w:val="24"/>
-        </w:rPr>
-        <w:t>Bérelt</w:t>
-      </w:r>
-      <w:proofErr w:type="spellEnd"/>
-      <w:r>
-        <w:rPr>
-          <w:rFonts w:ascii="Times New Roman" w:hAnsi="Times New Roman" w:cs="Times New Roman"/>
-          <w:sz w:val="24"/>
-          <w:szCs w:val="24"/>
-        </w:rPr>
-        <w:t xml:space="preserve"> helyszínek megjelenítése.</w:t>
+      <w:r>
+        <w:rPr>
+          <w:rFonts w:ascii="Times New Roman" w:hAnsi="Times New Roman" w:cs="Times New Roman"/>
+          <w:sz w:val="24"/>
+          <w:szCs w:val="24"/>
+        </w:rPr>
+        <w:t>Bérelt helyszínek megjelenítése.</w:t>
       </w:r>
     </w:p>
     <w:p>
@@ -2081,18 +1957,8 @@
           <w:sz w:val="24"/>
           <w:szCs w:val="24"/>
         </w:rPr>
-        <w:t xml:space="preserve">A </w:t>
-      </w:r>
-      <w:proofErr w:type="spellStart"/>
-      <w:r>
-        <w:rPr>
-          <w:rFonts w:ascii="Times New Roman" w:hAnsi="Times New Roman" w:cs="Times New Roman"/>
-          <w:sz w:val="24"/>
-          <w:szCs w:val="24"/>
-        </w:rPr>
-        <w:t>navbar</w:t>
-      </w:r>
-      <w:proofErr w:type="spellEnd"/>
+        <w:t>A navbar</w:t>
+      </w:r>
       <w:r>
         <w:rPr>
           <w:rFonts w:ascii="Times New Roman" w:hAnsi="Times New Roman" w:cs="Times New Roman"/>
@@ -2305,7 +2171,6 @@
           <w:szCs w:val="40"/>
         </w:rPr>
       </w:pPr>
-      <w:proofErr w:type="spellStart"/>
       <w:r>
         <w:rPr>
           <w:rFonts w:ascii="Times New Roman" w:hAnsi="Times New Roman" w:cs="Times New Roman"/>
@@ -2313,17 +2178,7 @@
           <w:sz w:val="40"/>
           <w:szCs w:val="40"/>
         </w:rPr>
-        <w:t>Admin</w:t>
-      </w:r>
-      <w:proofErr w:type="spellEnd"/>
-      <w:r>
-        <w:rPr>
-          <w:rFonts w:ascii="Times New Roman" w:hAnsi="Times New Roman" w:cs="Times New Roman"/>
-          <w:b/>
-          <w:sz w:val="40"/>
-          <w:szCs w:val="40"/>
-        </w:rPr>
-        <w:t xml:space="preserve"> funkciók</w:t>
+        <w:t>Admin funkciók</w:t>
       </w:r>
     </w:p>
     <w:p>
@@ -2385,25 +2240,7 @@
           <w:sz w:val="24"/>
           <w:szCs w:val="24"/>
         </w:rPr>
-        <w:t xml:space="preserve">, akkor egy </w:t>
-      </w:r>
-      <w:proofErr w:type="spellStart"/>
-      <w:r>
-        <w:rPr>
-          <w:rFonts w:ascii="Times New Roman" w:hAnsi="Times New Roman" w:cs="Times New Roman"/>
-          <w:sz w:val="24"/>
-          <w:szCs w:val="24"/>
-        </w:rPr>
-        <w:t>admin</w:t>
-      </w:r>
-      <w:proofErr w:type="spellEnd"/>
-      <w:r>
-        <w:rPr>
-          <w:rFonts w:ascii="Times New Roman" w:hAnsi="Times New Roman" w:cs="Times New Roman"/>
-          <w:sz w:val="24"/>
-          <w:szCs w:val="24"/>
-        </w:rPr>
-        <w:t xml:space="preserve"> számonkérés nélkül deaktiválhatja fiókját. Ennek feloldását a későbbiekben</w:t>
+        <w:t>, akkor egy admin számonkérés nélkül deaktiválhatja fiókját. Ennek feloldását a későbbiekben</w:t>
       </w:r>
       <w:r>
         <w:rPr>
@@ -2465,25 +2302,7 @@
           <w:sz w:val="24"/>
           <w:szCs w:val="24"/>
         </w:rPr>
-        <w:t xml:space="preserve">Amennyiben egy esemény nem felel meg az előírtaknak az </w:t>
-      </w:r>
-      <w:proofErr w:type="spellStart"/>
-      <w:r>
-        <w:rPr>
-          <w:rFonts w:ascii="Times New Roman" w:hAnsi="Times New Roman" w:cs="Times New Roman"/>
-          <w:sz w:val="24"/>
-          <w:szCs w:val="24"/>
-        </w:rPr>
-        <w:t>adminoknak</w:t>
-      </w:r>
-      <w:proofErr w:type="spellEnd"/>
-      <w:r>
-        <w:rPr>
-          <w:rFonts w:ascii="Times New Roman" w:hAnsi="Times New Roman" w:cs="Times New Roman"/>
-          <w:sz w:val="24"/>
-          <w:szCs w:val="24"/>
-        </w:rPr>
-        <w:t xml:space="preserve"> jogukban áll törölni azt</w:t>
+        <w:t>Amennyiben egy esemény nem felel meg az előírtaknak az adminoknak jogukban áll törölni azt</w:t>
       </w:r>
       <w:r>
         <w:rPr>
@@ -2536,43 +2355,7 @@
           <w:sz w:val="24"/>
           <w:szCs w:val="24"/>
         </w:rPr>
-        <w:t xml:space="preserve">Minden </w:t>
-      </w:r>
-      <w:proofErr w:type="spellStart"/>
-      <w:r>
-        <w:rPr>
-          <w:rFonts w:ascii="Times New Roman" w:hAnsi="Times New Roman" w:cs="Times New Roman"/>
-          <w:sz w:val="24"/>
-          <w:szCs w:val="24"/>
-        </w:rPr>
-        <w:t>admin</w:t>
-      </w:r>
-      <w:proofErr w:type="spellEnd"/>
-      <w:r>
-        <w:rPr>
-          <w:rFonts w:ascii="Times New Roman" w:hAnsi="Times New Roman" w:cs="Times New Roman"/>
-          <w:sz w:val="24"/>
-          <w:szCs w:val="24"/>
-        </w:rPr>
-        <w:t xml:space="preserve"> tud a sima felhasználóknak „</w:t>
-      </w:r>
-      <w:proofErr w:type="spellStart"/>
-      <w:r>
-        <w:rPr>
-          <w:rFonts w:ascii="Times New Roman" w:hAnsi="Times New Roman" w:cs="Times New Roman"/>
-          <w:sz w:val="24"/>
-          <w:szCs w:val="24"/>
-        </w:rPr>
-        <w:t>admin</w:t>
-      </w:r>
-      <w:proofErr w:type="spellEnd"/>
-      <w:r>
-        <w:rPr>
-          <w:rFonts w:ascii="Times New Roman" w:hAnsi="Times New Roman" w:cs="Times New Roman"/>
-          <w:sz w:val="24"/>
-          <w:szCs w:val="24"/>
-        </w:rPr>
-        <w:t>” jogosultságot</w:t>
+        <w:t>Minden admin tud a sima felhasználóknak „admin” jogosultságot</w:t>
       </w:r>
       <w:r>
         <w:rPr>
@@ -2653,25 +2436,7 @@
           <w:sz w:val="24"/>
           <w:szCs w:val="24"/>
         </w:rPr>
-        <w:t xml:space="preserve">Szimplán megjelenítési funkció, az </w:t>
-      </w:r>
-      <w:proofErr w:type="spellStart"/>
-      <w:r>
-        <w:rPr>
-          <w:rFonts w:ascii="Times New Roman" w:hAnsi="Times New Roman" w:cs="Times New Roman"/>
-          <w:sz w:val="24"/>
-          <w:szCs w:val="24"/>
-        </w:rPr>
-        <w:t>admin</w:t>
-      </w:r>
-      <w:proofErr w:type="spellEnd"/>
-      <w:r>
-        <w:rPr>
-          <w:rFonts w:ascii="Times New Roman" w:hAnsi="Times New Roman" w:cs="Times New Roman"/>
-          <w:sz w:val="24"/>
-          <w:szCs w:val="24"/>
-        </w:rPr>
-        <w:t xml:space="preserve"> látja a legnépszerűbb felhasználókat, a rájuk érkezett értékelések alapján, a legnépszerűbb eseményeket és a hozzájuk tartozó véleményeket</w:t>
+        <w:t>Szimplán megjelenítési funkció, az admin látja a legnépszerűbb felhasználókat, a rájuk érkezett értékelések alapján, a legnépszerűbb eseményeket és a hozzájuk tartozó véleményeket</w:t>
       </w:r>
       <w:r>
         <w:rPr>
@@ -2746,43 +2511,7 @@
           <w:sz w:val="24"/>
           <w:szCs w:val="24"/>
         </w:rPr>
-        <w:t xml:space="preserve">Az oldal megnyitásakor egy </w:t>
-      </w:r>
-      <w:proofErr w:type="spellStart"/>
-      <w:r>
-        <w:rPr>
-          <w:rFonts w:ascii="Times New Roman" w:hAnsi="Times New Roman" w:cs="Times New Roman"/>
-          <w:sz w:val="24"/>
-          <w:szCs w:val="24"/>
-        </w:rPr>
-        <w:t>landing</w:t>
-      </w:r>
-      <w:proofErr w:type="spellEnd"/>
-      <w:r>
-        <w:rPr>
-          <w:rFonts w:ascii="Times New Roman" w:hAnsi="Times New Roman" w:cs="Times New Roman"/>
-          <w:sz w:val="24"/>
-          <w:szCs w:val="24"/>
-        </w:rPr>
-        <w:t xml:space="preserve"> </w:t>
-      </w:r>
-      <w:proofErr w:type="spellStart"/>
-      <w:r>
-        <w:rPr>
-          <w:rFonts w:ascii="Times New Roman" w:hAnsi="Times New Roman" w:cs="Times New Roman"/>
-          <w:sz w:val="24"/>
-          <w:szCs w:val="24"/>
-        </w:rPr>
-        <w:t>page</w:t>
-      </w:r>
-      <w:proofErr w:type="spellEnd"/>
-      <w:r>
-        <w:rPr>
-          <w:rFonts w:ascii="Times New Roman" w:hAnsi="Times New Roman" w:cs="Times New Roman"/>
-          <w:sz w:val="24"/>
-          <w:szCs w:val="24"/>
-        </w:rPr>
-        <w:t xml:space="preserve"> lesz látható. Középen az oldal neve, alatta egy motiváló szöveg, ami ösztönöz a regisztrációra és egy gomb található amire kattintva a regisztráció oldalra navigáljuk a látogatót.</w:t>
+        <w:t>Az oldal megnyitásakor egy landing page lesz látható. Középen az oldal neve, alatta egy motiváló szöveg, ami ösztönöz a regisztrációra és egy gomb található amire kattintva a regisztráció oldalra navigáljuk a látogatót.</w:t>
       </w:r>
     </w:p>
     <w:p>
@@ -3108,35 +2837,7 @@
         <w:rPr>
           <w:rFonts w:ascii="Times New Roman" w:hAnsi="Times New Roman" w:cs="Times New Roman"/>
         </w:rPr>
-        <w:t xml:space="preserve">nyeket. Az esemény létrehozása egy </w:t>
-      </w:r>
-      <w:proofErr w:type="spellStart"/>
-      <w:r>
-        <w:rPr>
-          <w:rFonts w:ascii="Times New Roman" w:hAnsi="Times New Roman" w:cs="Times New Roman"/>
-        </w:rPr>
-        <w:t>bootstrap</w:t>
-      </w:r>
-      <w:proofErr w:type="spellEnd"/>
-      <w:r>
-        <w:rPr>
-          <w:rFonts w:ascii="Times New Roman" w:hAnsi="Times New Roman" w:cs="Times New Roman"/>
-        </w:rPr>
-        <w:t xml:space="preserve">-es </w:t>
-      </w:r>
-      <w:proofErr w:type="spellStart"/>
-      <w:r>
-        <w:rPr>
-          <w:rFonts w:ascii="Times New Roman" w:hAnsi="Times New Roman" w:cs="Times New Roman"/>
-        </w:rPr>
-        <w:t>accordion</w:t>
-      </w:r>
-      <w:proofErr w:type="spellEnd"/>
-      <w:r>
-        <w:rPr>
-          <w:rFonts w:ascii="Times New Roman" w:hAnsi="Times New Roman" w:cs="Times New Roman"/>
-        </w:rPr>
-        <w:t xml:space="preserve"> ablakban fog majd történni.</w:t>
+        <w:t>nyeket. Az esemény létrehozása egy bootstrap-es modal ablakban fog majd történni.</w:t>
       </w:r>
     </w:p>
     <w:p>
@@ -3354,43 +3055,7 @@
           <w:sz w:val="24"/>
           <w:szCs w:val="24"/>
         </w:rPr>
-        <w:t xml:space="preserve">a felhasználó erre kattintva tud majd kilépni a fiókjából. Kilépés után a </w:t>
-      </w:r>
-      <w:proofErr w:type="spellStart"/>
-      <w:r>
-        <w:rPr>
-          <w:rFonts w:ascii="Times New Roman" w:hAnsi="Times New Roman" w:cs="Times New Roman"/>
-          <w:sz w:val="24"/>
-          <w:szCs w:val="24"/>
-        </w:rPr>
-        <w:t>landing</w:t>
-      </w:r>
-      <w:proofErr w:type="spellEnd"/>
-      <w:r>
-        <w:rPr>
-          <w:rFonts w:ascii="Times New Roman" w:hAnsi="Times New Roman" w:cs="Times New Roman"/>
-          <w:sz w:val="24"/>
-          <w:szCs w:val="24"/>
-        </w:rPr>
-        <w:t xml:space="preserve"> </w:t>
-      </w:r>
-      <w:proofErr w:type="spellStart"/>
-      <w:r>
-        <w:rPr>
-          <w:rFonts w:ascii="Times New Roman" w:hAnsi="Times New Roman" w:cs="Times New Roman"/>
-          <w:sz w:val="24"/>
-          <w:szCs w:val="24"/>
-        </w:rPr>
-        <w:t>page-re</w:t>
-      </w:r>
-      <w:proofErr w:type="spellEnd"/>
-      <w:r>
-        <w:rPr>
-          <w:rFonts w:ascii="Times New Roman" w:hAnsi="Times New Roman" w:cs="Times New Roman"/>
-          <w:sz w:val="24"/>
-          <w:szCs w:val="24"/>
-        </w:rPr>
-        <w:t xml:space="preserve"> navigálunk</w:t>
+        <w:t>a felhasználó erre kattintva tud majd kilépni a fiókjából. Kilépés után a landing page-re navigálunk</w:t>
       </w:r>
     </w:p>
     <w:p>
@@ -3455,25 +3120,7 @@
           <w:sz w:val="24"/>
           <w:szCs w:val="24"/>
         </w:rPr>
-        <w:t xml:space="preserve">az </w:t>
-      </w:r>
-      <w:proofErr w:type="spellStart"/>
-      <w:r>
-        <w:rPr>
-          <w:rFonts w:ascii="Times New Roman" w:hAnsi="Times New Roman" w:cs="Times New Roman"/>
-          <w:sz w:val="24"/>
-          <w:szCs w:val="24"/>
-        </w:rPr>
-        <w:t>admin</w:t>
-      </w:r>
-      <w:proofErr w:type="spellEnd"/>
-      <w:r>
-        <w:rPr>
-          <w:rFonts w:ascii="Times New Roman" w:hAnsi="Times New Roman" w:cs="Times New Roman"/>
-          <w:sz w:val="24"/>
-          <w:szCs w:val="24"/>
-        </w:rPr>
-        <w:t xml:space="preserve"> itt láthatja az összes felhasználót, változtathatja a jogosultságát és a státuszát.</w:t>
+        <w:t>az admin itt láthatja az összes felhasználót, változtathatja a jogosultságát és a státuszát.</w:t>
       </w:r>
     </w:p>
     <w:p>
@@ -3507,33 +3154,23 @@
           <w:sz w:val="24"/>
           <w:szCs w:val="24"/>
         </w:rPr>
-        <w:t xml:space="preserve"> az </w:t>
-      </w:r>
-      <w:proofErr w:type="spellStart"/>
-      <w:r>
-        <w:rPr>
-          <w:rFonts w:ascii="Times New Roman" w:hAnsi="Times New Roman" w:cs="Times New Roman"/>
-          <w:sz w:val="24"/>
-          <w:szCs w:val="24"/>
-        </w:rPr>
-        <w:t>admin</w:t>
-      </w:r>
-      <w:proofErr w:type="spellEnd"/>
-      <w:r>
-        <w:rPr>
-          <w:rFonts w:ascii="Times New Roman" w:hAnsi="Times New Roman" w:cs="Times New Roman"/>
-          <w:sz w:val="24"/>
-          <w:szCs w:val="24"/>
-        </w:rPr>
-        <w:t xml:space="preserve"> itt láthatja az összes létrehozott eseményt és ha szükséges tudja törölni azokat</w:t>
-      </w:r>
-      <w:r>
-        <w:rPr>
-          <w:rFonts w:ascii="Times New Roman" w:hAnsi="Times New Roman" w:cs="Times New Roman"/>
-          <w:sz w:val="24"/>
-          <w:szCs w:val="24"/>
-        </w:rPr>
-        <w:t>, ha nem felelnek meg az előírtaknak (lásd: Általános Felhasználási Feltételek.docx nevű fájlban)</w:t>
+        <w:t xml:space="preserve"> az admin itt láthatja az összes létrehozott eseményt és ha szükséges tudja törölni azokat</w:t>
+      </w:r>
+      <w:r>
+        <w:rPr>
+          <w:rFonts w:ascii="Times New Roman" w:hAnsi="Times New Roman" w:cs="Times New Roman"/>
+          <w:sz w:val="24"/>
+          <w:szCs w:val="24"/>
+        </w:rPr>
+        <w:t xml:space="preserve">, ha nem felelnek meg az előírtaknak </w:t>
+      </w:r>
+      <w:r>
+        <w:rPr>
+          <w:rFonts w:ascii="Times New Roman" w:hAnsi="Times New Roman" w:cs="Times New Roman"/>
+          <w:sz w:val="24"/>
+          <w:szCs w:val="24"/>
+        </w:rPr>
+        <w:t>(lásd: Általános Felhasználási Feltételek.docx nevű fájlban)</w:t>
       </w:r>
       <w:r>
         <w:rPr>
@@ -3576,27 +3213,7 @@
           <w:sz w:val="24"/>
           <w:szCs w:val="24"/>
         </w:rPr>
-        <w:t xml:space="preserve">az </w:t>
-      </w:r>
-      <w:proofErr w:type="spellStart"/>
-      <w:r>
-        <w:rPr>
-          <w:rFonts w:ascii="Times New Roman" w:hAnsi="Times New Roman" w:cs="Times New Roman"/>
-          <w:bCs/>
-          <w:sz w:val="24"/>
-          <w:szCs w:val="24"/>
-        </w:rPr>
-        <w:t>admin</w:t>
-      </w:r>
-      <w:proofErr w:type="spellEnd"/>
-      <w:r>
-        <w:rPr>
-          <w:rFonts w:ascii="Times New Roman" w:hAnsi="Times New Roman" w:cs="Times New Roman"/>
-          <w:bCs/>
-          <w:sz w:val="24"/>
-          <w:szCs w:val="24"/>
-        </w:rPr>
-        <w:t xml:space="preserve"> itt megtekintheti a legnépszerűbb felhasználókat és eseményeket értékelés és részvétel </w:t>
+        <w:t xml:space="preserve">az admin itt megtekintheti a legnépszerűbb felhasználókat és eseményeket értékelés és részvétel </w:t>
       </w:r>
       <w:r>
         <w:rPr>
@@ -3672,43 +3289,7 @@
           <w:sz w:val="24"/>
           <w:szCs w:val="24"/>
         </w:rPr>
-        <w:t xml:space="preserve">a felhasználó erre kattintva tud majd kilépni a fiókjából. Kilépés után a </w:t>
-      </w:r>
-      <w:proofErr w:type="spellStart"/>
-      <w:r>
-        <w:rPr>
-          <w:rFonts w:ascii="Times New Roman" w:hAnsi="Times New Roman" w:cs="Times New Roman"/>
-          <w:sz w:val="24"/>
-          <w:szCs w:val="24"/>
-        </w:rPr>
-        <w:t>landing</w:t>
-      </w:r>
-      <w:proofErr w:type="spellEnd"/>
-      <w:r>
-        <w:rPr>
-          <w:rFonts w:ascii="Times New Roman" w:hAnsi="Times New Roman" w:cs="Times New Roman"/>
-          <w:sz w:val="24"/>
-          <w:szCs w:val="24"/>
-        </w:rPr>
-        <w:t xml:space="preserve"> </w:t>
-      </w:r>
-      <w:proofErr w:type="spellStart"/>
-      <w:r>
-        <w:rPr>
-          <w:rFonts w:ascii="Times New Roman" w:hAnsi="Times New Roman" w:cs="Times New Roman"/>
-          <w:sz w:val="24"/>
-          <w:szCs w:val="24"/>
-        </w:rPr>
-        <w:t>page-re</w:t>
-      </w:r>
-      <w:proofErr w:type="spellEnd"/>
-      <w:r>
-        <w:rPr>
-          <w:rFonts w:ascii="Times New Roman" w:hAnsi="Times New Roman" w:cs="Times New Roman"/>
-          <w:sz w:val="24"/>
-          <w:szCs w:val="24"/>
-        </w:rPr>
-        <w:t xml:space="preserve"> navigálunk</w:t>
+        <w:t>a felhasználó erre kattintva tud majd kilépni a fiókjából. Kilépés után a landing page-re navigálunk</w:t>
       </w:r>
     </w:p>
     <w:p>
@@ -3752,46 +3333,120 @@
         </w:rPr>
         <w:tab/>
       </w:r>
-      <w:proofErr w:type="spellStart"/>
-      <w:r>
-        <w:rPr>
-          <w:rFonts w:ascii="Times New Roman" w:hAnsi="Times New Roman" w:cs="Times New Roman"/>
-          <w:b/>
-          <w:sz w:val="24"/>
-          <w:szCs w:val="24"/>
-        </w:rPr>
-        <w:t>Landing</w:t>
-      </w:r>
-      <w:proofErr w:type="spellEnd"/>
-      <w:r>
-        <w:rPr>
-          <w:rFonts w:ascii="Times New Roman" w:hAnsi="Times New Roman" w:cs="Times New Roman"/>
-          <w:b/>
+      <w:r>
+        <w:rPr>
+          <w:rFonts w:ascii="Times New Roman" w:hAnsi="Times New Roman" w:cs="Times New Roman"/>
+          <w:b/>
+          <w:sz w:val="24"/>
+          <w:szCs w:val="24"/>
+        </w:rPr>
+        <w:t>Landing page:</w:t>
+      </w:r>
+      <w:r>
+        <w:rPr>
+          <w:rFonts w:ascii="Times New Roman" w:hAnsi="Times New Roman" w:cs="Times New Roman"/>
+          <w:bCs/>
+          <w:sz w:val="24"/>
+          <w:szCs w:val="24"/>
+        </w:rPr>
+        <w:t xml:space="preserve"> az oldal megnyitásakor ezt látjuk, itt az weboldal neve olvasható középen alatta egy </w:t>
+      </w:r>
+      <w:r>
+        <w:rPr>
+          <w:rFonts w:ascii="Times New Roman" w:hAnsi="Times New Roman" w:cs="Times New Roman"/>
+          <w:bCs/>
+          <w:sz w:val="24"/>
+          <w:szCs w:val="24"/>
+        </w:rPr>
+        <w:t>gomb,</w:t>
+      </w:r>
+      <w:r>
+        <w:rPr>
+          <w:rFonts w:ascii="Times New Roman" w:hAnsi="Times New Roman" w:cs="Times New Roman"/>
+          <w:bCs/>
+          <w:sz w:val="24"/>
+          <w:szCs w:val="24"/>
+        </w:rPr>
+        <w:t xml:space="preserve"> ami átirányít a regisztrációra lejjebb görgetve láthatóvá válik a </w:t>
+      </w:r>
+      <w:r>
+        <w:rPr>
+          <w:rFonts w:ascii="Times New Roman" w:hAnsi="Times New Roman" w:cs="Times New Roman"/>
+          <w:bCs/>
+          <w:sz w:val="24"/>
+          <w:szCs w:val="24"/>
+        </w:rPr>
+        <w:t>„Belépés”, az „Események”, illetve a „Felhasználói feltételek. Aktív fiók nélkül csak böngészni tudunk az események között.</w:t>
+      </w:r>
+    </w:p>
+    <w:p>
+      <w:pPr>
+        <w:spacing w:line="360" w:lineRule="auto"/>
+        <w:jc w:val="both"/>
+        <w:rPr>
+          <w:rFonts w:ascii="Times New Roman" w:hAnsi="Times New Roman" w:cs="Times New Roman"/>
+          <w:bCs/>
+          <w:sz w:val="24"/>
+          <w:szCs w:val="24"/>
+        </w:rPr>
+      </w:pPr>
+      <w:r>
+        <w:rPr>
+          <w:rFonts w:ascii="Times New Roman" w:hAnsi="Times New Roman" w:cs="Times New Roman"/>
+          <w:b/>
+          <w:sz w:val="24"/>
+          <w:szCs w:val="24"/>
+        </w:rPr>
+        <w:tab/>
+      </w:r>
+      <w:r>
+        <w:rPr>
+          <w:rFonts w:ascii="Times New Roman" w:hAnsi="Times New Roman" w:cs="Times New Roman"/>
+          <w:b/>
+          <w:sz w:val="24"/>
+          <w:szCs w:val="24"/>
+        </w:rPr>
+        <w:t>Regisztráció:</w:t>
+      </w:r>
+      <w:r>
+        <w:rPr>
+          <w:rFonts w:ascii="Times New Roman" w:hAnsi="Times New Roman" w:cs="Times New Roman"/>
+          <w:bCs/>
+          <w:sz w:val="24"/>
+          <w:szCs w:val="24"/>
+        </w:rPr>
+        <w:t xml:space="preserve"> az oldal tetején a navigációs sav alatta az oldal közepén</w:t>
+      </w:r>
+      <w:r>
+        <w:rPr>
+          <w:rFonts w:ascii="Times New Roman" w:hAnsi="Times New Roman" w:cs="Times New Roman"/>
+          <w:bCs/>
+          <w:sz w:val="24"/>
+          <w:szCs w:val="24"/>
+        </w:rPr>
+        <w:t xml:space="preserve"> lesznek a sikeres regisztrációhoz szükséges kitöltendő mezők, melyekhez bootstrapes floating labelt fogunk alkalmazni. A mezők alatt lesz a „Regisztráció” gomb melynek megnyomása után, ha minden mezőt helyesen töltöttünk ki, ha valami hibás azt hibaüzenet formájában értesítjük a felhasználóval, elküldjük a regisztráció megerősítő emailt, melynek megerősítése után átirányítjuk a „Belépés” oldalra.</w:t>
+      </w:r>
+    </w:p>
+    <w:p>
+      <w:pPr>
+        <w:spacing w:line="360" w:lineRule="auto"/>
+        <w:jc w:val="both"/>
+        <w:rPr>
+          <w:rFonts w:ascii="Times New Roman" w:hAnsi="Times New Roman" w:cs="Times New Roman"/>
+          <w:bCs/>
+          <w:sz w:val="24"/>
+          <w:szCs w:val="24"/>
+        </w:rPr>
+      </w:pPr>
+      <w:r>
+        <w:rPr>
+          <w:rFonts w:ascii="Times New Roman" w:hAnsi="Times New Roman" w:cs="Times New Roman"/>
+          <w:bCs/>
           <w:sz w:val="24"/>
           <w:szCs w:val="24"/>
         </w:rPr>
         <w:t xml:space="preserve"> </w:t>
       </w:r>
-      <w:proofErr w:type="spellStart"/>
-      <w:r>
-        <w:rPr>
-          <w:rFonts w:ascii="Times New Roman" w:hAnsi="Times New Roman" w:cs="Times New Roman"/>
-          <w:b/>
-          <w:sz w:val="24"/>
-          <w:szCs w:val="24"/>
-        </w:rPr>
-        <w:t>page</w:t>
-      </w:r>
-      <w:proofErr w:type="spellEnd"/>
-      <w:r>
-        <w:rPr>
-          <w:rFonts w:ascii="Times New Roman" w:hAnsi="Times New Roman" w:cs="Times New Roman"/>
-          <w:b/>
-          <w:sz w:val="24"/>
-          <w:szCs w:val="24"/>
-        </w:rPr>
-        <w:t>:</w:t>
-      </w:r>
       <w:r>
         <w:rPr>
           <w:rFonts w:ascii="Times New Roman" w:hAnsi="Times New Roman" w:cs="Times New Roman"/>
@@ -3799,7 +3454,16 @@
           <w:sz w:val="24"/>
           <w:szCs w:val="24"/>
         </w:rPr>
-        <w:t xml:space="preserve"> az oldal megnyitásakor ezt látjuk, itt az weboldal neve olvasható középen</w:t>
+        <w:tab/>
+      </w:r>
+      <w:r>
+        <w:rPr>
+          <w:rFonts w:ascii="Times New Roman" w:hAnsi="Times New Roman" w:cs="Times New Roman"/>
+          <w:b/>
+          <w:sz w:val="24"/>
+          <w:szCs w:val="24"/>
+        </w:rPr>
+        <w:t>Belépés:</w:t>
       </w:r>
       <w:r>
         <w:rPr>
@@ -3808,7 +3472,7 @@
           <w:sz w:val="24"/>
           <w:szCs w:val="24"/>
         </w:rPr>
-        <w:t>. Bal oldalt</w:t>
+        <w:t xml:space="preserve"> </w:t>
       </w:r>
       <w:r>
         <w:rPr>
@@ -3817,7 +3481,7 @@
           <w:sz w:val="24"/>
           <w:szCs w:val="24"/>
         </w:rPr>
-        <w:t xml:space="preserve"> alatta </w:t>
+        <w:t>az oldal tetején a navigációs sav alatta az oldal közepén lesznek</w:t>
       </w:r>
       <w:r>
         <w:rPr>
@@ -3826,7 +3490,7 @@
           <w:sz w:val="24"/>
           <w:szCs w:val="24"/>
         </w:rPr>
-        <w:t xml:space="preserve">két </w:t>
+        <w:t xml:space="preserve"> a belépéshez kitöltendő mezők, szintén </w:t>
       </w:r>
       <w:r>
         <w:rPr>
@@ -3835,7 +3499,7 @@
           <w:sz w:val="24"/>
           <w:szCs w:val="24"/>
         </w:rPr>
-        <w:t>gomb,</w:t>
+        <w:t>bootstrapes floating labelt fogunk alkalmazni</w:t>
       </w:r>
       <w:r>
         <w:rPr>
@@ -3844,7 +3508,7 @@
           <w:sz w:val="24"/>
           <w:szCs w:val="24"/>
         </w:rPr>
-        <w:t xml:space="preserve"> ami átirányít a regisztrációra</w:t>
+        <w:t>. alatta a „Belépés” gomb, melynek megnyomása után</w:t>
       </w:r>
       <w:r>
         <w:rPr>
@@ -3853,7 +3517,7 @@
           <w:sz w:val="24"/>
           <w:szCs w:val="24"/>
         </w:rPr>
-        <w:t xml:space="preserve"> vagy a bejelentkezésre</w:t>
+        <w:t xml:space="preserve">, ha a bejelentkezési adatok megegyeznek a regisztrációkor </w:t>
       </w:r>
       <w:r>
         <w:rPr>
@@ -3862,7 +3526,8 @@
           <w:sz w:val="24"/>
           <w:szCs w:val="24"/>
         </w:rPr>
-        <w:t xml:space="preserve">, az oldal tetején lévő navigációs sávban látható még az </w:t>
+        <w:lastRenderedPageBreak/>
+        <w:t xml:space="preserve">megadott adatokkal, átirányítjuk a felhasználót az „Események” oldalra, ha a </w:t>
       </w:r>
       <w:r>
         <w:rPr>
@@ -3871,7 +3536,7 @@
           <w:sz w:val="24"/>
           <w:szCs w:val="24"/>
         </w:rPr>
-        <w:t>„Események”, illetve a „Felhasználói feltételek</w:t>
+        <w:t>bejelentkezési adatok</w:t>
       </w:r>
       <w:r>
         <w:rPr>
@@ -3880,358 +3545,7 @@
           <w:sz w:val="24"/>
           <w:szCs w:val="24"/>
         </w:rPr>
-        <w:t>” menüpont, amik a hozzájuk tartozó oldalakra navigálnak</w:t>
-      </w:r>
-      <w:r>
-        <w:rPr>
-          <w:rFonts w:ascii="Times New Roman" w:hAnsi="Times New Roman" w:cs="Times New Roman"/>
-          <w:bCs/>
-          <w:sz w:val="24"/>
-          <w:szCs w:val="24"/>
-        </w:rPr>
-        <w:t>. Aktív fiók nélkül csak böngészni tudunk az események között.</w:t>
-      </w:r>
-    </w:p>
-    <w:p>
-      <w:pPr>
-        <w:spacing w:line="360" w:lineRule="auto"/>
-        <w:jc w:val="both"/>
-        <w:rPr>
-          <w:rFonts w:ascii="Times New Roman" w:hAnsi="Times New Roman" w:cs="Times New Roman"/>
-          <w:bCs/>
-          <w:sz w:val="24"/>
-          <w:szCs w:val="24"/>
-        </w:rPr>
-      </w:pPr>
-      <w:r>
-        <w:rPr>
-          <w:rFonts w:ascii="Times New Roman" w:hAnsi="Times New Roman" w:cs="Times New Roman"/>
-          <w:b/>
-          <w:sz w:val="24"/>
-          <w:szCs w:val="24"/>
-        </w:rPr>
-        <w:tab/>
-      </w:r>
-      <w:r>
-        <w:rPr>
-          <w:rFonts w:ascii="Times New Roman" w:hAnsi="Times New Roman" w:cs="Times New Roman"/>
-          <w:b/>
-          <w:sz w:val="24"/>
-          <w:szCs w:val="24"/>
-        </w:rPr>
-        <w:t>Regisztráció:</w:t>
-      </w:r>
-      <w:r>
-        <w:rPr>
-          <w:rFonts w:ascii="Times New Roman" w:hAnsi="Times New Roman" w:cs="Times New Roman"/>
-          <w:bCs/>
-          <w:sz w:val="24"/>
-          <w:szCs w:val="24"/>
-        </w:rPr>
-        <w:t xml:space="preserve"> az oldal tetején a navigációs sav alatta az oldal közepén</w:t>
-      </w:r>
-      <w:r>
-        <w:rPr>
-          <w:rFonts w:ascii="Times New Roman" w:hAnsi="Times New Roman" w:cs="Times New Roman"/>
-          <w:bCs/>
-          <w:sz w:val="24"/>
-          <w:szCs w:val="24"/>
-        </w:rPr>
-        <w:t xml:space="preserve"> lesznek a sikeres regisztrációhoz szükséges kitöltendő mezők</w:t>
-      </w:r>
-      <w:r>
-        <w:rPr>
-          <w:rFonts w:ascii="Times New Roman" w:hAnsi="Times New Roman" w:cs="Times New Roman"/>
-          <w:bCs/>
-          <w:sz w:val="24"/>
-          <w:szCs w:val="24"/>
-        </w:rPr>
-        <w:t>: Email cím, jelszó, jelszó megerősítése, felhasználó típusa(szervezet</w:t>
-      </w:r>
-      <w:r>
-        <w:rPr>
-          <w:rFonts w:ascii="Times New Roman" w:hAnsi="Times New Roman" w:cs="Times New Roman"/>
-          <w:bCs/>
-          <w:sz w:val="24"/>
-          <w:szCs w:val="24"/>
-        </w:rPr>
-        <w:t xml:space="preserve"> vagy</w:t>
-      </w:r>
-      <w:r>
-        <w:rPr>
-          <w:rFonts w:ascii="Times New Roman" w:hAnsi="Times New Roman" w:cs="Times New Roman"/>
-          <w:bCs/>
-          <w:sz w:val="24"/>
-          <w:szCs w:val="24"/>
-        </w:rPr>
-        <w:t xml:space="preserve"> magányszemély)</w:t>
-      </w:r>
-      <w:r>
-        <w:rPr>
-          <w:rFonts w:ascii="Times New Roman" w:hAnsi="Times New Roman" w:cs="Times New Roman"/>
-          <w:bCs/>
-          <w:sz w:val="24"/>
-          <w:szCs w:val="24"/>
-        </w:rPr>
-        <w:t>, alapértelmezett helyszín(vármegye, város, irányítószám), kategóriák(három választása kötelező)</w:t>
-      </w:r>
-      <w:r>
-        <w:rPr>
-          <w:rFonts w:ascii="Times New Roman" w:hAnsi="Times New Roman" w:cs="Times New Roman"/>
-          <w:bCs/>
-          <w:sz w:val="24"/>
-          <w:szCs w:val="24"/>
-        </w:rPr>
-        <w:t xml:space="preserve"> melyekhez </w:t>
-      </w:r>
-      <w:proofErr w:type="spellStart"/>
-      <w:r>
-        <w:rPr>
-          <w:rFonts w:ascii="Times New Roman" w:hAnsi="Times New Roman" w:cs="Times New Roman"/>
-          <w:bCs/>
-          <w:sz w:val="24"/>
-          <w:szCs w:val="24"/>
-        </w:rPr>
-        <w:t>bootstrapes</w:t>
-      </w:r>
-      <w:proofErr w:type="spellEnd"/>
-      <w:r>
-        <w:rPr>
-          <w:rFonts w:ascii="Times New Roman" w:hAnsi="Times New Roman" w:cs="Times New Roman"/>
-          <w:bCs/>
-          <w:sz w:val="24"/>
-          <w:szCs w:val="24"/>
-        </w:rPr>
-        <w:t xml:space="preserve"> </w:t>
-      </w:r>
-      <w:proofErr w:type="spellStart"/>
-      <w:r>
-        <w:rPr>
-          <w:rFonts w:ascii="Times New Roman" w:hAnsi="Times New Roman" w:cs="Times New Roman"/>
-          <w:bCs/>
-          <w:sz w:val="24"/>
-          <w:szCs w:val="24"/>
-        </w:rPr>
-        <w:t>floating</w:t>
-      </w:r>
-      <w:proofErr w:type="spellEnd"/>
-      <w:r>
-        <w:rPr>
-          <w:rFonts w:ascii="Times New Roman" w:hAnsi="Times New Roman" w:cs="Times New Roman"/>
-          <w:bCs/>
-          <w:sz w:val="24"/>
-          <w:szCs w:val="24"/>
-        </w:rPr>
-        <w:t xml:space="preserve"> </w:t>
-      </w:r>
-      <w:proofErr w:type="spellStart"/>
-      <w:r>
-        <w:rPr>
-          <w:rFonts w:ascii="Times New Roman" w:hAnsi="Times New Roman" w:cs="Times New Roman"/>
-          <w:bCs/>
-          <w:sz w:val="24"/>
-          <w:szCs w:val="24"/>
-        </w:rPr>
-        <w:t>labelt</w:t>
-      </w:r>
-      <w:proofErr w:type="spellEnd"/>
-      <w:r>
-        <w:rPr>
-          <w:rFonts w:ascii="Times New Roman" w:hAnsi="Times New Roman" w:cs="Times New Roman"/>
-          <w:bCs/>
-          <w:sz w:val="24"/>
-          <w:szCs w:val="24"/>
-        </w:rPr>
-        <w:t xml:space="preserve">, </w:t>
-      </w:r>
-      <w:proofErr w:type="spellStart"/>
-      <w:r>
-        <w:rPr>
-          <w:rFonts w:ascii="Times New Roman" w:hAnsi="Times New Roman" w:cs="Times New Roman"/>
-          <w:bCs/>
-          <w:sz w:val="24"/>
-          <w:szCs w:val="24"/>
-        </w:rPr>
-        <w:t>radio</w:t>
-      </w:r>
-      <w:proofErr w:type="spellEnd"/>
-      <w:r>
-        <w:rPr>
-          <w:rFonts w:ascii="Times New Roman" w:hAnsi="Times New Roman" w:cs="Times New Roman"/>
-          <w:bCs/>
-          <w:sz w:val="24"/>
-          <w:szCs w:val="24"/>
-        </w:rPr>
-        <w:t xml:space="preserve"> </w:t>
-      </w:r>
-      <w:proofErr w:type="spellStart"/>
-      <w:r>
-        <w:rPr>
-          <w:rFonts w:ascii="Times New Roman" w:hAnsi="Times New Roman" w:cs="Times New Roman"/>
-          <w:bCs/>
-          <w:sz w:val="24"/>
-          <w:szCs w:val="24"/>
-        </w:rPr>
-        <w:t>buttont</w:t>
-      </w:r>
-      <w:proofErr w:type="spellEnd"/>
-      <w:r>
-        <w:rPr>
-          <w:rFonts w:ascii="Times New Roman" w:hAnsi="Times New Roman" w:cs="Times New Roman"/>
-          <w:bCs/>
-          <w:sz w:val="24"/>
-          <w:szCs w:val="24"/>
-        </w:rPr>
-        <w:t xml:space="preserve"> és </w:t>
-      </w:r>
-      <w:proofErr w:type="spellStart"/>
-      <w:r>
-        <w:rPr>
-          <w:rFonts w:ascii="Times New Roman" w:hAnsi="Times New Roman" w:cs="Times New Roman"/>
-          <w:bCs/>
-          <w:sz w:val="24"/>
-          <w:szCs w:val="24"/>
-        </w:rPr>
-        <w:t>selectet</w:t>
-      </w:r>
-      <w:proofErr w:type="spellEnd"/>
-      <w:r>
-        <w:rPr>
-          <w:rFonts w:ascii="Times New Roman" w:hAnsi="Times New Roman" w:cs="Times New Roman"/>
-          <w:bCs/>
-          <w:sz w:val="24"/>
-          <w:szCs w:val="24"/>
-        </w:rPr>
-        <w:t xml:space="preserve"> </w:t>
-      </w:r>
-      <w:bookmarkStart w:id="0" w:name="_GoBack"/>
-      <w:bookmarkEnd w:id="0"/>
-      <w:r>
-        <w:rPr>
-          <w:rFonts w:ascii="Times New Roman" w:hAnsi="Times New Roman" w:cs="Times New Roman"/>
-          <w:bCs/>
-          <w:sz w:val="24"/>
-          <w:szCs w:val="24"/>
-        </w:rPr>
-        <w:t>fogunk alkalmazni. A mezők alatt lesz a „Regisztráció” gomb melynek megnyomása után, ha minden mezőt helyesen töltöttünk ki, ha valami hibás azt hibaüzenet formájában értesítjük a felhasználóval, elküldjük a regisztráció megerősítő emailt, melynek megerősítése után átirányítjuk a „Belépés” oldalra.</w:t>
-      </w:r>
-    </w:p>
-    <w:p>
-      <w:pPr>
-        <w:spacing w:line="360" w:lineRule="auto"/>
-        <w:jc w:val="both"/>
-        <w:rPr>
-          <w:rFonts w:ascii="Times New Roman" w:hAnsi="Times New Roman" w:cs="Times New Roman"/>
-          <w:bCs/>
-          <w:sz w:val="24"/>
-          <w:szCs w:val="24"/>
-        </w:rPr>
-      </w:pPr>
-      <w:r>
-        <w:rPr>
-          <w:rFonts w:ascii="Times New Roman" w:hAnsi="Times New Roman" w:cs="Times New Roman"/>
-          <w:bCs/>
-          <w:sz w:val="24"/>
-          <w:szCs w:val="24"/>
-        </w:rPr>
-        <w:lastRenderedPageBreak/>
-        <w:t xml:space="preserve"> </w:t>
-      </w:r>
-      <w:r>
-        <w:rPr>
-          <w:rFonts w:ascii="Times New Roman" w:hAnsi="Times New Roman" w:cs="Times New Roman"/>
-          <w:bCs/>
-          <w:sz w:val="24"/>
-          <w:szCs w:val="24"/>
-        </w:rPr>
-        <w:tab/>
-      </w:r>
-      <w:r>
-        <w:rPr>
-          <w:rFonts w:ascii="Times New Roman" w:hAnsi="Times New Roman" w:cs="Times New Roman"/>
-          <w:b/>
-          <w:sz w:val="24"/>
-          <w:szCs w:val="24"/>
-        </w:rPr>
-        <w:t>Belépés:</w:t>
-      </w:r>
-      <w:r>
-        <w:rPr>
-          <w:rFonts w:ascii="Times New Roman" w:hAnsi="Times New Roman" w:cs="Times New Roman"/>
-          <w:bCs/>
-          <w:sz w:val="24"/>
-          <w:szCs w:val="24"/>
-        </w:rPr>
-        <w:t xml:space="preserve"> az oldal tetején a navigációs sav alatta az oldal közepén lesznek a belépéshez kitöltendő mezők, szintén </w:t>
-      </w:r>
-      <w:proofErr w:type="spellStart"/>
-      <w:r>
-        <w:rPr>
-          <w:rFonts w:ascii="Times New Roman" w:hAnsi="Times New Roman" w:cs="Times New Roman"/>
-          <w:bCs/>
-          <w:sz w:val="24"/>
-          <w:szCs w:val="24"/>
-        </w:rPr>
-        <w:t>bootstrapes</w:t>
-      </w:r>
-      <w:proofErr w:type="spellEnd"/>
-      <w:r>
-        <w:rPr>
-          <w:rFonts w:ascii="Times New Roman" w:hAnsi="Times New Roman" w:cs="Times New Roman"/>
-          <w:bCs/>
-          <w:sz w:val="24"/>
-          <w:szCs w:val="24"/>
-        </w:rPr>
-        <w:t xml:space="preserve"> </w:t>
-      </w:r>
-      <w:proofErr w:type="spellStart"/>
-      <w:r>
-        <w:rPr>
-          <w:rFonts w:ascii="Times New Roman" w:hAnsi="Times New Roman" w:cs="Times New Roman"/>
-          <w:bCs/>
-          <w:sz w:val="24"/>
-          <w:szCs w:val="24"/>
-        </w:rPr>
-        <w:t>floating</w:t>
-      </w:r>
-      <w:proofErr w:type="spellEnd"/>
-      <w:r>
-        <w:rPr>
-          <w:rFonts w:ascii="Times New Roman" w:hAnsi="Times New Roman" w:cs="Times New Roman"/>
-          <w:bCs/>
-          <w:sz w:val="24"/>
-          <w:szCs w:val="24"/>
-        </w:rPr>
-        <w:t xml:space="preserve"> </w:t>
-      </w:r>
-      <w:proofErr w:type="spellStart"/>
-      <w:r>
-        <w:rPr>
-          <w:rFonts w:ascii="Times New Roman" w:hAnsi="Times New Roman" w:cs="Times New Roman"/>
-          <w:bCs/>
-          <w:sz w:val="24"/>
-          <w:szCs w:val="24"/>
-        </w:rPr>
-        <w:t>labelt</w:t>
-      </w:r>
-      <w:proofErr w:type="spellEnd"/>
-      <w:r>
-        <w:rPr>
-          <w:rFonts w:ascii="Times New Roman" w:hAnsi="Times New Roman" w:cs="Times New Roman"/>
-          <w:bCs/>
-          <w:sz w:val="24"/>
-          <w:szCs w:val="24"/>
-        </w:rPr>
-        <w:t xml:space="preserve"> fogunk alkalmazni. alatta a „Belépés” gomb, melynek megnyomása után</w:t>
-      </w:r>
-      <w:r>
-        <w:rPr>
-          <w:rFonts w:ascii="Times New Roman" w:hAnsi="Times New Roman" w:cs="Times New Roman"/>
-          <w:bCs/>
-          <w:sz w:val="24"/>
-          <w:szCs w:val="24"/>
-        </w:rPr>
-        <w:t>, ha a bejelentkezési adatok megegyeznek a regisztrációkor megadott adatokkal, átirányítjuk a felhasználót az „Események” oldalra, ha a bejelentkezési adatok nem egyeznek akkor hibaüzenet formájában értesítjük a felhasználót.</w:t>
+        <w:t xml:space="preserve"> nem egyeznek akkor hibaüzenet formájában értesítjük a felhasználót.</w:t>
       </w:r>
     </w:p>
     <w:p>
@@ -4260,25 +3574,7 @@
           <w:sz w:val="24"/>
           <w:szCs w:val="24"/>
         </w:rPr>
-        <w:t xml:space="preserve"> a navigációs sáv alatt egy lenyitható </w:t>
-      </w:r>
-      <w:proofErr w:type="spellStart"/>
-      <w:r>
-        <w:rPr>
-          <w:rFonts w:ascii="Times New Roman" w:hAnsi="Times New Roman" w:cs="Times New Roman"/>
-          <w:sz w:val="24"/>
-          <w:szCs w:val="24"/>
-        </w:rPr>
-        <w:t>accordion</w:t>
-      </w:r>
-      <w:proofErr w:type="spellEnd"/>
-      <w:r>
-        <w:rPr>
-          <w:rFonts w:ascii="Times New Roman" w:hAnsi="Times New Roman" w:cs="Times New Roman"/>
-          <w:sz w:val="24"/>
-          <w:szCs w:val="24"/>
-        </w:rPr>
-        <w:t xml:space="preserve"> ablak fog </w:t>
+        <w:t xml:space="preserve"> a navigációs sáv alatt egy lenyitható modal ablak fog </w:t>
       </w:r>
       <w:r>
         <w:rPr>
@@ -4340,18 +3636,258 @@
           <w:sz w:val="24"/>
           <w:szCs w:val="24"/>
         </w:rPr>
-        <w:t xml:space="preserve">a navigációs sáv alatt fognak elhelyezkedni, az „Események oldalhoz hasonlóan kártyás megjelenítésben a céges profilként regisztrált felhasználók által meghirdetett bérelhető helyszínek, a kártyára kattintva olvashatók lesznek a részletek, láthatók lesznek, helyszínről feltöltött képek. Az oldal a bérlés lebonyolítására nem kínál lehetőséget, csupán hirdetőfelületként működik és csak elérhetőséget biztosít a kapcsolatfelvételre. A helyszín bérléseiről egy </w:t>
-      </w:r>
-      <w:proofErr w:type="spellStart"/>
-      <w:r>
-        <w:rPr>
-          <w:rFonts w:ascii="Times New Roman" w:hAnsi="Times New Roman" w:cs="Times New Roman"/>
-          <w:sz w:val="24"/>
-          <w:szCs w:val="24"/>
-        </w:rPr>
-        <w:t>fullcalendar</w:t>
-      </w:r>
-      <w:proofErr w:type="spellEnd"/>
+        <w:t xml:space="preserve">a navigációs sáv alatt fognak elhelyezkedni, az „Események oldalhoz hasonlóan kártyás megjelenítésben a céges profilként regisztrált felhasználók által meghirdetett bérelhető helyszínek, a kártyára kattintva olvashatók lesznek a részletek, láthatók lesznek, helyszínről feltöltött képek. Az oldal a bérlés lebonyolítására nem kínál lehetőséget, csupán hirdetőfelületként működik és csak elérhetőséget biztosít a kapcsolatfelvételre. A helyszín bérléseiről egy fullcalendar modulla naptárnézetben </w:t>
+      </w:r>
+      <w:r>
+        <w:rPr>
+          <w:rFonts w:ascii="Times New Roman" w:hAnsi="Times New Roman" w:cs="Times New Roman"/>
+          <w:sz w:val="24"/>
+          <w:szCs w:val="24"/>
+        </w:rPr>
+        <w:t>lehet majd tájékozódni, amit a helyszín üzemeltetőének kell beállítani. A céges profilként regisztált felhasználó az oldal tetején egy „Hirdetés feladása” nevű gombra kattintva tudja majd a helyszínét bérbe adásra kínálni, miután az összes szükséges adatot megadta.</w:t>
+      </w:r>
+    </w:p>
+    <w:p>
+      <w:pPr>
+        <w:spacing w:line="360" w:lineRule="auto"/>
+        <w:jc w:val="both"/>
+        <w:rPr>
+          <w:rFonts w:ascii="Times New Roman" w:hAnsi="Times New Roman" w:cs="Times New Roman"/>
+          <w:sz w:val="24"/>
+          <w:szCs w:val="24"/>
+        </w:rPr>
+      </w:pPr>
+      <w:r>
+        <w:rPr>
+          <w:rFonts w:ascii="Times New Roman" w:hAnsi="Times New Roman" w:cs="Times New Roman"/>
+          <w:sz w:val="24"/>
+          <w:szCs w:val="24"/>
+        </w:rPr>
+        <w:tab/>
+      </w:r>
+      <w:r>
+        <w:rPr>
+          <w:rFonts w:ascii="Times New Roman" w:hAnsi="Times New Roman" w:cs="Times New Roman"/>
+          <w:b/>
+          <w:bCs/>
+          <w:sz w:val="24"/>
+          <w:szCs w:val="24"/>
+        </w:rPr>
+        <w:t xml:space="preserve">Profil: </w:t>
+      </w:r>
+      <w:r>
+        <w:rPr>
+          <w:rFonts w:ascii="Times New Roman" w:hAnsi="Times New Roman" w:cs="Times New Roman"/>
+          <w:sz w:val="24"/>
+          <w:szCs w:val="24"/>
+        </w:rPr>
+        <w:t>a navigációs sáv alatt fog elhelyezkedni a felhasználónév, alatta a felhasználónév módosítása gomb, erre kattintva a felhasználó tudja módosítani a nevét egy felugró ablakban, jelszó módosítása gomb, erre kattintva lehetősége lesz a felhasználónak emailen keresztül módosítani a jelszavát, ehhez meg kell adni a regisztráció során megadott email címét és egy „Új jelszó” gomb megnyomása után</w:t>
+      </w:r>
+      <w:r>
+        <w:rPr>
+          <w:rFonts w:ascii="Times New Roman" w:hAnsi="Times New Roman" w:cs="Times New Roman"/>
+          <w:sz w:val="24"/>
+          <w:szCs w:val="24"/>
+        </w:rPr>
+        <w:t xml:space="preserve"> egy automatikusan küldött emailen keresztül módosíthatja jelszavát. Emellett megtalálható lesz még a „Létrehozott események” lista, amelyben a felhasználó megnézheti a saját eseményeit, a „Feliratkozott események” lista, ahol láthatja azokat az eseményeket, amelyeken szeretne részt venni és a „Lezárult események” lista, ahol azokat az eseményeket látja, amelyeken már részt vett ezeket egy hétig az esemény vége után tudja értékelni.</w:t>
+      </w:r>
+      <w:r>
+        <w:rPr>
+          <w:rFonts w:ascii="Times New Roman" w:hAnsi="Times New Roman" w:cs="Times New Roman"/>
+          <w:sz w:val="24"/>
+          <w:szCs w:val="24"/>
+        </w:rPr>
+        <w:t xml:space="preserve"> Céges profilként regisztrált felhasználó egy „Galéria” nevű gombra kattintva tud majd képeket feltölteni a helyszínéről. Egy „Helyszín kezelése” nevű gombra kattintva tudja a bérlési időpontokat beállítani.</w:t>
+      </w:r>
+    </w:p>
+    <w:p>
+      <w:pPr>
+        <w:spacing w:line="360" w:lineRule="auto"/>
+        <w:jc w:val="both"/>
+        <w:rPr>
+          <w:rFonts w:ascii="Times New Roman" w:hAnsi="Times New Roman" w:cs="Times New Roman"/>
+          <w:sz w:val="24"/>
+          <w:szCs w:val="24"/>
+        </w:rPr>
+      </w:pPr>
+      <w:r>
+        <w:rPr>
+          <w:rFonts w:ascii="Times New Roman" w:hAnsi="Times New Roman" w:cs="Times New Roman"/>
+          <w:sz w:val="24"/>
+          <w:szCs w:val="24"/>
+        </w:rPr>
+        <w:lastRenderedPageBreak/>
+        <w:tab/>
+      </w:r>
+      <w:r>
+        <w:rPr>
+          <w:rFonts w:ascii="Times New Roman" w:hAnsi="Times New Roman" w:cs="Times New Roman"/>
+          <w:b/>
+          <w:bCs/>
+          <w:sz w:val="24"/>
+          <w:szCs w:val="24"/>
+        </w:rPr>
+        <w:t>Felhasználói feltételek:</w:t>
+      </w:r>
+      <w:r>
+        <w:rPr>
+          <w:rFonts w:ascii="Times New Roman" w:hAnsi="Times New Roman" w:cs="Times New Roman"/>
+          <w:sz w:val="24"/>
+          <w:szCs w:val="24"/>
+        </w:rPr>
+        <w:t xml:space="preserve"> az oldal tetején navigációs sáv, alatta bekezdésekbe szedve lesznek olvashatók az „Általános Felhasználási Feltételek.docx” nevű fájlban leírt feltételek az oldal szakszerű és szabályos használatáról.</w:t>
+      </w:r>
+    </w:p>
+    <w:p>
+      <w:pPr>
+        <w:spacing w:line="360" w:lineRule="auto"/>
+        <w:jc w:val="both"/>
+        <w:rPr>
+          <w:rFonts w:ascii="Times New Roman" w:hAnsi="Times New Roman" w:cs="Times New Roman"/>
+          <w:sz w:val="24"/>
+          <w:szCs w:val="24"/>
+        </w:rPr>
+      </w:pPr>
+      <w:r>
+        <w:rPr>
+          <w:rFonts w:ascii="Times New Roman" w:hAnsi="Times New Roman" w:cs="Times New Roman"/>
+          <w:sz w:val="24"/>
+          <w:szCs w:val="24"/>
+        </w:rPr>
+        <w:tab/>
+      </w:r>
+      <w:r>
+        <w:rPr>
+          <w:rFonts w:ascii="Times New Roman" w:hAnsi="Times New Roman" w:cs="Times New Roman"/>
+          <w:b/>
+          <w:bCs/>
+          <w:sz w:val="24"/>
+          <w:szCs w:val="24"/>
+        </w:rPr>
+        <w:t xml:space="preserve">Felhasználók kezelése: </w:t>
+      </w:r>
+      <w:r>
+        <w:rPr>
+          <w:rFonts w:ascii="Times New Roman" w:hAnsi="Times New Roman" w:cs="Times New Roman"/>
+          <w:sz w:val="24"/>
+          <w:szCs w:val="24"/>
+        </w:rPr>
+        <w:t>csak adminisztrátornak. N</w:t>
+      </w:r>
+      <w:r>
+        <w:rPr>
+          <w:rFonts w:ascii="Times New Roman" w:hAnsi="Times New Roman" w:cs="Times New Roman"/>
+          <w:sz w:val="24"/>
+          <w:szCs w:val="24"/>
+        </w:rPr>
+        <w:t xml:space="preserve">avigációs sáv, alatta </w:t>
+      </w:r>
+      <w:r>
+        <w:rPr>
+          <w:rFonts w:ascii="Times New Roman" w:hAnsi="Times New Roman" w:cs="Times New Roman"/>
+          <w:sz w:val="24"/>
+          <w:szCs w:val="24"/>
+        </w:rPr>
+        <w:t>az oldal összes felhasználója listás megjelenítésben, minden felhasználó mellet található lesz egy módosítás gomb, erre a kattintva az adminnak lehetősége van a felhasználó jogosultságát és státuszát állítani, inaktívvá teheti a valamelyik tevékenységével megsérti a felhasználói feltételeket.</w:t>
+      </w:r>
+    </w:p>
+    <w:p>
+      <w:pPr>
+        <w:spacing w:line="360" w:lineRule="auto"/>
+        <w:jc w:val="both"/>
+        <w:rPr>
+          <w:rFonts w:ascii="Times New Roman" w:hAnsi="Times New Roman" w:cs="Times New Roman"/>
+          <w:sz w:val="24"/>
+          <w:szCs w:val="24"/>
+        </w:rPr>
+      </w:pPr>
+      <w:r>
+        <w:rPr>
+          <w:rFonts w:ascii="Times New Roman" w:hAnsi="Times New Roman" w:cs="Times New Roman"/>
+          <w:sz w:val="24"/>
+          <w:szCs w:val="24"/>
+        </w:rPr>
+        <w:tab/>
+      </w:r>
+      <w:r>
+        <w:rPr>
+          <w:rFonts w:ascii="Times New Roman" w:hAnsi="Times New Roman" w:cs="Times New Roman"/>
+          <w:b/>
+          <w:bCs/>
+          <w:sz w:val="24"/>
+          <w:szCs w:val="24"/>
+        </w:rPr>
+        <w:t xml:space="preserve">Események kezelése: </w:t>
+      </w:r>
+      <w:r>
+        <w:rPr>
+          <w:rFonts w:ascii="Times New Roman" w:hAnsi="Times New Roman" w:cs="Times New Roman"/>
+          <w:sz w:val="24"/>
+          <w:szCs w:val="24"/>
+        </w:rPr>
+        <w:t xml:space="preserve">csak </w:t>
+      </w:r>
+      <w:r>
+        <w:rPr>
+          <w:rFonts w:ascii="Times New Roman" w:hAnsi="Times New Roman" w:cs="Times New Roman"/>
+          <w:sz w:val="24"/>
+          <w:szCs w:val="24"/>
+        </w:rPr>
+        <w:t>adminisztrátornak</w:t>
+      </w:r>
+      <w:r>
+        <w:rPr>
+          <w:rFonts w:ascii="Times New Roman" w:hAnsi="Times New Roman" w:cs="Times New Roman"/>
+          <w:sz w:val="24"/>
+          <w:szCs w:val="24"/>
+        </w:rPr>
+        <w:t>. Navigációs sáv, alatta listás megjelenítésben az összes létrehozott esemény, mellettük egy törlés gomb, erre kattintva az admin törölheti az eseményt, ha az nem felel meg a felhasználói feltételeknek.</w:t>
+      </w:r>
+    </w:p>
+    <w:p>
+      <w:pPr>
+        <w:spacing w:line="360" w:lineRule="auto"/>
+        <w:jc w:val="both"/>
+        <w:rPr>
+          <w:rFonts w:ascii="Times New Roman" w:hAnsi="Times New Roman" w:cs="Times New Roman"/>
+          <w:sz w:val="24"/>
+          <w:szCs w:val="24"/>
+        </w:rPr>
+      </w:pPr>
+      <w:r>
+        <w:rPr>
+          <w:rFonts w:ascii="Times New Roman" w:hAnsi="Times New Roman" w:cs="Times New Roman"/>
+          <w:sz w:val="24"/>
+          <w:szCs w:val="24"/>
+        </w:rPr>
+        <w:tab/>
+      </w:r>
+      <w:r>
+        <w:rPr>
+          <w:rFonts w:ascii="Times New Roman" w:hAnsi="Times New Roman" w:cs="Times New Roman"/>
+          <w:b/>
+          <w:bCs/>
+          <w:sz w:val="24"/>
+          <w:szCs w:val="24"/>
+        </w:rPr>
+        <w:t xml:space="preserve">Statisztika: </w:t>
+      </w:r>
+      <w:r>
+        <w:rPr>
+          <w:rFonts w:ascii="Times New Roman" w:hAnsi="Times New Roman" w:cs="Times New Roman"/>
+          <w:sz w:val="24"/>
+          <w:szCs w:val="24"/>
+        </w:rPr>
+        <w:t xml:space="preserve">az oldal tetején navigációs sáv, alatta egy bootstrapes tabs komponenssel felosztott </w:t>
+      </w:r>
+      <w:r>
+        <w:rPr>
+          <w:rFonts w:ascii="Times New Roman" w:hAnsi="Times New Roman" w:cs="Times New Roman"/>
+          <w:sz w:val="24"/>
+          <w:szCs w:val="24"/>
+        </w:rPr>
+        <w:t>mező,</w:t>
+      </w:r>
       <w:r>
         <w:rPr>
           <w:rFonts w:ascii="Times New Roman" w:hAnsi="Times New Roman" w:cs="Times New Roman"/>
@@ -4360,49 +3896,13 @@
         </w:rPr>
         <w:t xml:space="preserve"> </w:t>
       </w:r>
-      <w:proofErr w:type="spellStart"/>
-      <w:r>
-        <w:rPr>
-          <w:rFonts w:ascii="Times New Roman" w:hAnsi="Times New Roman" w:cs="Times New Roman"/>
-          <w:sz w:val="24"/>
-          <w:szCs w:val="24"/>
-        </w:rPr>
-        <w:t>modulla</w:t>
-      </w:r>
-      <w:proofErr w:type="spellEnd"/>
-      <w:r>
-        <w:rPr>
-          <w:rFonts w:ascii="Times New Roman" w:hAnsi="Times New Roman" w:cs="Times New Roman"/>
-          <w:sz w:val="24"/>
-          <w:szCs w:val="24"/>
-        </w:rPr>
-        <w:t xml:space="preserve"> naptárnézetben </w:t>
-      </w:r>
-      <w:r>
-        <w:rPr>
-          <w:rFonts w:ascii="Times New Roman" w:hAnsi="Times New Roman" w:cs="Times New Roman"/>
-          <w:sz w:val="24"/>
-          <w:szCs w:val="24"/>
-        </w:rPr>
-        <w:t xml:space="preserve">lehet majd tájékozódni, amit a helyszín üzemeltetőének kell beállítani. A céges profilként </w:t>
-      </w:r>
-      <w:proofErr w:type="spellStart"/>
-      <w:r>
-        <w:rPr>
-          <w:rFonts w:ascii="Times New Roman" w:hAnsi="Times New Roman" w:cs="Times New Roman"/>
-          <w:sz w:val="24"/>
-          <w:szCs w:val="24"/>
-        </w:rPr>
-        <w:t>regisztált</w:t>
-      </w:r>
-      <w:proofErr w:type="spellEnd"/>
-      <w:r>
-        <w:rPr>
-          <w:rFonts w:ascii="Times New Roman" w:hAnsi="Times New Roman" w:cs="Times New Roman"/>
-          <w:sz w:val="24"/>
-          <w:szCs w:val="24"/>
-        </w:rPr>
-        <w:t xml:space="preserve"> felhasználó az oldal tetején egy „Hirdetés feladása” nevű gombra kattintva tudja majd a helyszínét bérbe adásra kínálni, miután az összes szükséges adatot megadta.</w:t>
+      <w:r>
+        <w:rPr>
+          <w:rFonts w:ascii="Times New Roman" w:hAnsi="Times New Roman" w:cs="Times New Roman"/>
+          <w:sz w:val="24"/>
+          <w:szCs w:val="24"/>
+        </w:rPr>
+        <w:t>ahol az egyes tab-okon a legnépszerűbb felhasználókat, eseményeket és chartjs modullal megvalósított grafikont lehet majd látni. a grafikon az eseményekre jelentleők számát fogja mutatni.</w:t>
       </w:r>
     </w:p>
     <w:p>
@@ -4431,382 +3931,6 @@
           <w:sz w:val="24"/>
           <w:szCs w:val="24"/>
         </w:rPr>
-        <w:t xml:space="preserve">Profil: </w:t>
-      </w:r>
-      <w:r>
-        <w:rPr>
-          <w:rFonts w:ascii="Times New Roman" w:hAnsi="Times New Roman" w:cs="Times New Roman"/>
-          <w:sz w:val="24"/>
-          <w:szCs w:val="24"/>
-        </w:rPr>
-        <w:t>a navigációs sáv alatt fog elhelyezkedni a felhasználónév, alatta a felhasználónév módosítása gomb, erre kattintva a felhasználó tudja módosítani a nevét egy felugró ablakban, jelszó módosítása gomb, erre kattintva lehetősége lesz a felhasználónak emailen keresztül módosítani a jelszavát, ehhez meg kell adni a regisztráció során megadott email címét és egy „Új jelszó” gomb megnyomása után</w:t>
-      </w:r>
-      <w:r>
-        <w:rPr>
-          <w:rFonts w:ascii="Times New Roman" w:hAnsi="Times New Roman" w:cs="Times New Roman"/>
-          <w:sz w:val="24"/>
-          <w:szCs w:val="24"/>
-        </w:rPr>
-        <w:t xml:space="preserve"> egy automatikusan küldött emailen keresztül módosíthatja jelszavát. Emellett megtalálható lesz még a „Létrehozott események” lista, amelyben a felhasználó megnézheti a saját eseményeit, a „Feliratkozott események” lista, ahol láthatja azokat az eseményeket, amelyeken szeretne részt venni és a „Lezárult események” lista, ahol azokat az eseményeket látja, amelyeken már részt vett ezeket egy hétig az esemény vége után tudja értékelni.</w:t>
-      </w:r>
-      <w:r>
-        <w:rPr>
-          <w:rFonts w:ascii="Times New Roman" w:hAnsi="Times New Roman" w:cs="Times New Roman"/>
-          <w:sz w:val="24"/>
-          <w:szCs w:val="24"/>
-        </w:rPr>
-        <w:t xml:space="preserve"> Céges profilként regisztrált felhasználó egy „Galéria” nevű gombra kattintva </w:t>
-      </w:r>
-      <w:r>
-        <w:rPr>
-          <w:rFonts w:ascii="Times New Roman" w:hAnsi="Times New Roman" w:cs="Times New Roman"/>
-          <w:sz w:val="24"/>
-          <w:szCs w:val="24"/>
-        </w:rPr>
-        <w:lastRenderedPageBreak/>
-        <w:t>tud majd képeket feltölteni a helyszínéről. Egy „Helyszín kezelése” nevű gombra kattintva tudja a bérlési időpontokat beállítani.</w:t>
-      </w:r>
-    </w:p>
-    <w:p>
-      <w:pPr>
-        <w:spacing w:line="360" w:lineRule="auto"/>
-        <w:jc w:val="both"/>
-        <w:rPr>
-          <w:rFonts w:ascii="Times New Roman" w:hAnsi="Times New Roman" w:cs="Times New Roman"/>
-          <w:sz w:val="24"/>
-          <w:szCs w:val="24"/>
-        </w:rPr>
-      </w:pPr>
-      <w:r>
-        <w:rPr>
-          <w:rFonts w:ascii="Times New Roman" w:hAnsi="Times New Roman" w:cs="Times New Roman"/>
-          <w:sz w:val="24"/>
-          <w:szCs w:val="24"/>
-        </w:rPr>
-        <w:tab/>
-      </w:r>
-      <w:r>
-        <w:rPr>
-          <w:rFonts w:ascii="Times New Roman" w:hAnsi="Times New Roman" w:cs="Times New Roman"/>
-          <w:b/>
-          <w:bCs/>
-          <w:sz w:val="24"/>
-          <w:szCs w:val="24"/>
-        </w:rPr>
-        <w:t>Felhasználói feltételek:</w:t>
-      </w:r>
-      <w:r>
-        <w:rPr>
-          <w:rFonts w:ascii="Times New Roman" w:hAnsi="Times New Roman" w:cs="Times New Roman"/>
-          <w:sz w:val="24"/>
-          <w:szCs w:val="24"/>
-        </w:rPr>
-        <w:t xml:space="preserve"> az oldal tetején navigációs sáv, alatta bekezdésekbe szedve lesznek olvashatók az „Általános Felhasználási Feltételek.docx” nevű fájlban leírt feltételek az oldal szakszerű és szabályos használatáról.</w:t>
-      </w:r>
-    </w:p>
-    <w:p>
-      <w:pPr>
-        <w:spacing w:line="360" w:lineRule="auto"/>
-        <w:jc w:val="both"/>
-        <w:rPr>
-          <w:rFonts w:ascii="Times New Roman" w:hAnsi="Times New Roman" w:cs="Times New Roman"/>
-          <w:sz w:val="24"/>
-          <w:szCs w:val="24"/>
-        </w:rPr>
-      </w:pPr>
-      <w:r>
-        <w:rPr>
-          <w:rFonts w:ascii="Times New Roman" w:hAnsi="Times New Roman" w:cs="Times New Roman"/>
-          <w:sz w:val="24"/>
-          <w:szCs w:val="24"/>
-        </w:rPr>
-        <w:tab/>
-      </w:r>
-      <w:r>
-        <w:rPr>
-          <w:rFonts w:ascii="Times New Roman" w:hAnsi="Times New Roman" w:cs="Times New Roman"/>
-          <w:b/>
-          <w:bCs/>
-          <w:sz w:val="24"/>
-          <w:szCs w:val="24"/>
-        </w:rPr>
-        <w:t xml:space="preserve">Felhasználók kezelése: </w:t>
-      </w:r>
-      <w:r>
-        <w:rPr>
-          <w:rFonts w:ascii="Times New Roman" w:hAnsi="Times New Roman" w:cs="Times New Roman"/>
-          <w:sz w:val="24"/>
-          <w:szCs w:val="24"/>
-        </w:rPr>
-        <w:t>csak adminisztrátornak. N</w:t>
-      </w:r>
-      <w:r>
-        <w:rPr>
-          <w:rFonts w:ascii="Times New Roman" w:hAnsi="Times New Roman" w:cs="Times New Roman"/>
-          <w:sz w:val="24"/>
-          <w:szCs w:val="24"/>
-        </w:rPr>
-        <w:t xml:space="preserve">avigációs sáv, alatta </w:t>
-      </w:r>
-      <w:r>
-        <w:rPr>
-          <w:rFonts w:ascii="Times New Roman" w:hAnsi="Times New Roman" w:cs="Times New Roman"/>
-          <w:sz w:val="24"/>
-          <w:szCs w:val="24"/>
-        </w:rPr>
-        <w:t xml:space="preserve">az oldal összes felhasználója listás megjelenítésben, minden felhasználó mellet található lesz egy módosítás gomb, erre a kattintva az </w:t>
-      </w:r>
-      <w:proofErr w:type="spellStart"/>
-      <w:r>
-        <w:rPr>
-          <w:rFonts w:ascii="Times New Roman" w:hAnsi="Times New Roman" w:cs="Times New Roman"/>
-          <w:sz w:val="24"/>
-          <w:szCs w:val="24"/>
-        </w:rPr>
-        <w:t>adminnak</w:t>
-      </w:r>
-      <w:proofErr w:type="spellEnd"/>
-      <w:r>
-        <w:rPr>
-          <w:rFonts w:ascii="Times New Roman" w:hAnsi="Times New Roman" w:cs="Times New Roman"/>
-          <w:sz w:val="24"/>
-          <w:szCs w:val="24"/>
-        </w:rPr>
-        <w:t xml:space="preserve"> lehetősége van a felhasználó jogosultságát és státuszát állítani, inaktívvá teheti a valamelyik tevékenységével megsérti a felhasználói feltételeket.</w:t>
-      </w:r>
-    </w:p>
-    <w:p>
-      <w:pPr>
-        <w:spacing w:line="360" w:lineRule="auto"/>
-        <w:jc w:val="both"/>
-        <w:rPr>
-          <w:rFonts w:ascii="Times New Roman" w:hAnsi="Times New Roman" w:cs="Times New Roman"/>
-          <w:sz w:val="24"/>
-          <w:szCs w:val="24"/>
-        </w:rPr>
-      </w:pPr>
-      <w:r>
-        <w:rPr>
-          <w:rFonts w:ascii="Times New Roman" w:hAnsi="Times New Roman" w:cs="Times New Roman"/>
-          <w:sz w:val="24"/>
-          <w:szCs w:val="24"/>
-        </w:rPr>
-        <w:tab/>
-      </w:r>
-      <w:r>
-        <w:rPr>
-          <w:rFonts w:ascii="Times New Roman" w:hAnsi="Times New Roman" w:cs="Times New Roman"/>
-          <w:b/>
-          <w:bCs/>
-          <w:sz w:val="24"/>
-          <w:szCs w:val="24"/>
-        </w:rPr>
-        <w:t xml:space="preserve">Események kezelése: </w:t>
-      </w:r>
-      <w:r>
-        <w:rPr>
-          <w:rFonts w:ascii="Times New Roman" w:hAnsi="Times New Roman" w:cs="Times New Roman"/>
-          <w:sz w:val="24"/>
-          <w:szCs w:val="24"/>
-        </w:rPr>
-        <w:t xml:space="preserve">csak adminisztrátornak. Navigációs sáv, alatta listás megjelenítésben az összes létrehozott esemény, mellettük egy törlés gomb, erre kattintva az </w:t>
-      </w:r>
-      <w:proofErr w:type="spellStart"/>
-      <w:r>
-        <w:rPr>
-          <w:rFonts w:ascii="Times New Roman" w:hAnsi="Times New Roman" w:cs="Times New Roman"/>
-          <w:sz w:val="24"/>
-          <w:szCs w:val="24"/>
-        </w:rPr>
-        <w:t>admin</w:t>
-      </w:r>
-      <w:proofErr w:type="spellEnd"/>
-      <w:r>
-        <w:rPr>
-          <w:rFonts w:ascii="Times New Roman" w:hAnsi="Times New Roman" w:cs="Times New Roman"/>
-          <w:sz w:val="24"/>
-          <w:szCs w:val="24"/>
-        </w:rPr>
-        <w:t xml:space="preserve"> törölheti az eseményt, ha az nem felel meg a felhasználói feltételeknek.</w:t>
-      </w:r>
-    </w:p>
-    <w:p>
-      <w:pPr>
-        <w:spacing w:line="360" w:lineRule="auto"/>
-        <w:jc w:val="both"/>
-        <w:rPr>
-          <w:rFonts w:ascii="Times New Roman" w:hAnsi="Times New Roman" w:cs="Times New Roman"/>
-          <w:sz w:val="24"/>
-          <w:szCs w:val="24"/>
-        </w:rPr>
-      </w:pPr>
-      <w:r>
-        <w:rPr>
-          <w:rFonts w:ascii="Times New Roman" w:hAnsi="Times New Roman" w:cs="Times New Roman"/>
-          <w:sz w:val="24"/>
-          <w:szCs w:val="24"/>
-        </w:rPr>
-        <w:tab/>
-      </w:r>
-      <w:r>
-        <w:rPr>
-          <w:rFonts w:ascii="Times New Roman" w:hAnsi="Times New Roman" w:cs="Times New Roman"/>
-          <w:b/>
-          <w:bCs/>
-          <w:sz w:val="24"/>
-          <w:szCs w:val="24"/>
-        </w:rPr>
-        <w:t xml:space="preserve">Statisztika: </w:t>
-      </w:r>
-      <w:r>
-        <w:rPr>
-          <w:rFonts w:ascii="Times New Roman" w:hAnsi="Times New Roman" w:cs="Times New Roman"/>
-          <w:sz w:val="24"/>
-          <w:szCs w:val="24"/>
-        </w:rPr>
-        <w:t xml:space="preserve">az oldal tetején navigációs sáv, alatta egy </w:t>
-      </w:r>
-      <w:proofErr w:type="spellStart"/>
-      <w:r>
-        <w:rPr>
-          <w:rFonts w:ascii="Times New Roman" w:hAnsi="Times New Roman" w:cs="Times New Roman"/>
-          <w:sz w:val="24"/>
-          <w:szCs w:val="24"/>
-        </w:rPr>
-        <w:t>bootstrapes</w:t>
-      </w:r>
-      <w:proofErr w:type="spellEnd"/>
-      <w:r>
-        <w:rPr>
-          <w:rFonts w:ascii="Times New Roman" w:hAnsi="Times New Roman" w:cs="Times New Roman"/>
-          <w:sz w:val="24"/>
-          <w:szCs w:val="24"/>
-        </w:rPr>
-        <w:t xml:space="preserve"> </w:t>
-      </w:r>
-      <w:proofErr w:type="spellStart"/>
-      <w:r>
-        <w:rPr>
-          <w:rFonts w:ascii="Times New Roman" w:hAnsi="Times New Roman" w:cs="Times New Roman"/>
-          <w:sz w:val="24"/>
-          <w:szCs w:val="24"/>
-        </w:rPr>
-        <w:t>tabs</w:t>
-      </w:r>
-      <w:proofErr w:type="spellEnd"/>
-      <w:r>
-        <w:rPr>
-          <w:rFonts w:ascii="Times New Roman" w:hAnsi="Times New Roman" w:cs="Times New Roman"/>
-          <w:sz w:val="24"/>
-          <w:szCs w:val="24"/>
-        </w:rPr>
-        <w:t xml:space="preserve"> komponenssel felosztott </w:t>
-      </w:r>
-      <w:r>
-        <w:rPr>
-          <w:rFonts w:ascii="Times New Roman" w:hAnsi="Times New Roman" w:cs="Times New Roman"/>
-          <w:sz w:val="24"/>
-          <w:szCs w:val="24"/>
-        </w:rPr>
-        <w:t>mező,</w:t>
-      </w:r>
-      <w:r>
-        <w:rPr>
-          <w:rFonts w:ascii="Times New Roman" w:hAnsi="Times New Roman" w:cs="Times New Roman"/>
-          <w:sz w:val="24"/>
-          <w:szCs w:val="24"/>
-        </w:rPr>
-        <w:t xml:space="preserve"> </w:t>
-      </w:r>
-      <w:r>
-        <w:rPr>
-          <w:rFonts w:ascii="Times New Roman" w:hAnsi="Times New Roman" w:cs="Times New Roman"/>
-          <w:sz w:val="24"/>
-          <w:szCs w:val="24"/>
-        </w:rPr>
-        <w:t xml:space="preserve">ahol az egyes </w:t>
-      </w:r>
-      <w:proofErr w:type="spellStart"/>
-      <w:r>
-        <w:rPr>
-          <w:rFonts w:ascii="Times New Roman" w:hAnsi="Times New Roman" w:cs="Times New Roman"/>
-          <w:sz w:val="24"/>
-          <w:szCs w:val="24"/>
-        </w:rPr>
-        <w:t>tab</w:t>
-      </w:r>
-      <w:proofErr w:type="spellEnd"/>
-      <w:r>
-        <w:rPr>
-          <w:rFonts w:ascii="Times New Roman" w:hAnsi="Times New Roman" w:cs="Times New Roman"/>
-          <w:sz w:val="24"/>
-          <w:szCs w:val="24"/>
-        </w:rPr>
-        <w:t xml:space="preserve">-okon a legnépszerűbb felhasználókat, eseményeket és </w:t>
-      </w:r>
-      <w:proofErr w:type="spellStart"/>
-      <w:r>
-        <w:rPr>
-          <w:rFonts w:ascii="Times New Roman" w:hAnsi="Times New Roman" w:cs="Times New Roman"/>
-          <w:sz w:val="24"/>
-          <w:szCs w:val="24"/>
-        </w:rPr>
-        <w:t>chartjs</w:t>
-      </w:r>
-      <w:proofErr w:type="spellEnd"/>
-      <w:r>
-        <w:rPr>
-          <w:rFonts w:ascii="Times New Roman" w:hAnsi="Times New Roman" w:cs="Times New Roman"/>
-          <w:sz w:val="24"/>
-          <w:szCs w:val="24"/>
-        </w:rPr>
-        <w:t xml:space="preserve"> modullal megvalósított grafikont lehet majd látni. a grafikon az eseményekre </w:t>
-      </w:r>
-      <w:proofErr w:type="spellStart"/>
-      <w:r>
-        <w:rPr>
-          <w:rFonts w:ascii="Times New Roman" w:hAnsi="Times New Roman" w:cs="Times New Roman"/>
-          <w:sz w:val="24"/>
-          <w:szCs w:val="24"/>
-        </w:rPr>
-        <w:t>jelentleők</w:t>
-      </w:r>
-      <w:proofErr w:type="spellEnd"/>
-      <w:r>
-        <w:rPr>
-          <w:rFonts w:ascii="Times New Roman" w:hAnsi="Times New Roman" w:cs="Times New Roman"/>
-          <w:sz w:val="24"/>
-          <w:szCs w:val="24"/>
-        </w:rPr>
-        <w:t xml:space="preserve"> számát fogja mutatni.</w:t>
-      </w:r>
-    </w:p>
-    <w:p>
-      <w:pPr>
-        <w:spacing w:line="360" w:lineRule="auto"/>
-        <w:jc w:val="both"/>
-        <w:rPr>
-          <w:rFonts w:ascii="Times New Roman" w:hAnsi="Times New Roman" w:cs="Times New Roman"/>
-          <w:sz w:val="24"/>
-          <w:szCs w:val="24"/>
-        </w:rPr>
-      </w:pPr>
-      <w:r>
-        <w:rPr>
-          <w:rFonts w:ascii="Times New Roman" w:hAnsi="Times New Roman" w:cs="Times New Roman"/>
-          <w:sz w:val="24"/>
-          <w:szCs w:val="24"/>
-        </w:rPr>
-        <w:tab/>
-      </w:r>
-      <w:r>
-        <w:rPr>
-          <w:rFonts w:ascii="Times New Roman" w:hAnsi="Times New Roman" w:cs="Times New Roman"/>
-          <w:b/>
-          <w:bCs/>
-          <w:sz w:val="24"/>
-          <w:szCs w:val="24"/>
-        </w:rPr>
         <w:t xml:space="preserve">Kijelentkezés: </w:t>
       </w:r>
       <w:r>
@@ -4815,43 +3939,7 @@
           <w:sz w:val="24"/>
           <w:szCs w:val="24"/>
         </w:rPr>
-        <w:t xml:space="preserve">erre a gombra kattintva kijelentkeztetjük a felhasználót a fiókjából és átirányítjuk a </w:t>
-      </w:r>
-      <w:proofErr w:type="spellStart"/>
-      <w:r>
-        <w:rPr>
-          <w:rFonts w:ascii="Times New Roman" w:hAnsi="Times New Roman" w:cs="Times New Roman"/>
-          <w:sz w:val="24"/>
-          <w:szCs w:val="24"/>
-        </w:rPr>
-        <w:t>landing</w:t>
-      </w:r>
-      <w:proofErr w:type="spellEnd"/>
-      <w:r>
-        <w:rPr>
-          <w:rFonts w:ascii="Times New Roman" w:hAnsi="Times New Roman" w:cs="Times New Roman"/>
-          <w:sz w:val="24"/>
-          <w:szCs w:val="24"/>
-        </w:rPr>
-        <w:t xml:space="preserve"> </w:t>
-      </w:r>
-      <w:proofErr w:type="spellStart"/>
-      <w:r>
-        <w:rPr>
-          <w:rFonts w:ascii="Times New Roman" w:hAnsi="Times New Roman" w:cs="Times New Roman"/>
-          <w:sz w:val="24"/>
-          <w:szCs w:val="24"/>
-        </w:rPr>
-        <w:t>page-re</w:t>
-      </w:r>
-      <w:proofErr w:type="spellEnd"/>
-      <w:r>
-        <w:rPr>
-          <w:rFonts w:ascii="Times New Roman" w:hAnsi="Times New Roman" w:cs="Times New Roman"/>
-          <w:sz w:val="24"/>
-          <w:szCs w:val="24"/>
-        </w:rPr>
-        <w:t>.</w:t>
+        <w:t>erre a gombra kattintva kijelentkeztetjük a felhasználót a fiókjából és átirányítjuk a landing page-re.</w:t>
       </w:r>
     </w:p>
     <w:p>
@@ -4908,69 +3996,15 @@
           <w:sz w:val="24"/>
           <w:szCs w:val="24"/>
         </w:rPr>
-        <w:t xml:space="preserve">Az oldalra regisztrált felhasználók adatait </w:t>
-      </w:r>
-      <w:proofErr w:type="spellStart"/>
-      <w:r>
-        <w:rPr>
-          <w:rFonts w:ascii="Times New Roman" w:hAnsi="Times New Roman" w:cs="Times New Roman"/>
-          <w:sz w:val="24"/>
-          <w:szCs w:val="24"/>
-        </w:rPr>
-        <w:t>MySql</w:t>
-      </w:r>
-      <w:proofErr w:type="spellEnd"/>
-      <w:r>
-        <w:rPr>
-          <w:rFonts w:ascii="Times New Roman" w:hAnsi="Times New Roman" w:cs="Times New Roman"/>
-          <w:sz w:val="24"/>
-          <w:szCs w:val="24"/>
-        </w:rPr>
-        <w:t xml:space="preserve"> adatbázisban tároljuk a</w:t>
-      </w:r>
-      <w:r>
-        <w:rPr>
-          <w:rFonts w:ascii="Times New Roman" w:hAnsi="Times New Roman" w:cs="Times New Roman"/>
-          <w:sz w:val="24"/>
-          <w:szCs w:val="24"/>
-        </w:rPr>
-        <w:t xml:space="preserve">z adatbázis létrehozásához </w:t>
-      </w:r>
-      <w:proofErr w:type="spellStart"/>
-      <w:r>
-        <w:rPr>
-          <w:rFonts w:ascii="Times New Roman" w:hAnsi="Times New Roman" w:cs="Times New Roman"/>
-          <w:sz w:val="24"/>
-          <w:szCs w:val="24"/>
-        </w:rPr>
-        <w:t>sequelize</w:t>
-      </w:r>
-      <w:proofErr w:type="spellEnd"/>
-      <w:r>
-        <w:rPr>
-          <w:rFonts w:ascii="Times New Roman" w:hAnsi="Times New Roman" w:cs="Times New Roman"/>
-          <w:sz w:val="24"/>
-          <w:szCs w:val="24"/>
-        </w:rPr>
-        <w:t xml:space="preserve"> </w:t>
-      </w:r>
-      <w:proofErr w:type="spellStart"/>
-      <w:r>
-        <w:rPr>
-          <w:rFonts w:ascii="Times New Roman" w:hAnsi="Times New Roman" w:cs="Times New Roman"/>
-          <w:sz w:val="24"/>
-          <w:szCs w:val="24"/>
-        </w:rPr>
-        <w:t>module</w:t>
-      </w:r>
-      <w:proofErr w:type="spellEnd"/>
-      <w:r>
-        <w:rPr>
-          <w:rFonts w:ascii="Times New Roman" w:hAnsi="Times New Roman" w:cs="Times New Roman"/>
-          <w:sz w:val="24"/>
-          <w:szCs w:val="24"/>
-        </w:rPr>
-        <w:t>-t használunk. Az adatbázis felépítése a következő szempontok szerint zajlik</w:t>
+        <w:t>Az oldalra regisztrált felhasználók adatait MySql adatbázisban tároljuk a</w:t>
+      </w:r>
+      <w:r>
+        <w:rPr>
+          <w:rFonts w:ascii="Times New Roman" w:hAnsi="Times New Roman" w:cs="Times New Roman"/>
+          <w:sz w:val="24"/>
+          <w:szCs w:val="24"/>
+        </w:rPr>
+        <w:t>z adatbázis létrehozásához sequelize module-t használunk. Az adatbázis felépítése a következő szempontok szerint zajlik</w:t>
       </w:r>
       <w:r>
         <w:rPr>
@@ -4992,25 +4026,14 @@
           <w:szCs w:val="24"/>
         </w:rPr>
       </w:pPr>
-      <w:proofErr w:type="spellStart"/>
-      <w:r>
-        <w:rPr>
-          <w:rFonts w:ascii="Times New Roman" w:hAnsi="Times New Roman" w:cs="Times New Roman"/>
-          <w:b/>
-          <w:sz w:val="24"/>
-          <w:szCs w:val="24"/>
-        </w:rPr>
-        <w:t>Users</w:t>
-      </w:r>
-      <w:proofErr w:type="spellEnd"/>
-      <w:r>
-        <w:rPr>
-          <w:rFonts w:ascii="Times New Roman" w:hAnsi="Times New Roman" w:cs="Times New Roman"/>
-          <w:b/>
-          <w:sz w:val="24"/>
-          <w:szCs w:val="24"/>
-        </w:rPr>
-        <w:t xml:space="preserve"> </w:t>
+      <w:r>
+        <w:rPr>
+          <w:rFonts w:ascii="Times New Roman" w:hAnsi="Times New Roman" w:cs="Times New Roman"/>
+          <w:b/>
+          <w:sz w:val="24"/>
+          <w:szCs w:val="24"/>
+        </w:rPr>
+        <w:t xml:space="preserve">Users </w:t>
       </w:r>
       <w:r>
         <w:rPr>
@@ -5044,7 +4067,6 @@
           <w:szCs w:val="24"/>
         </w:rPr>
       </w:pPr>
-      <w:proofErr w:type="spellStart"/>
       <w:r>
         <w:rPr>
           <w:rFonts w:ascii="Times New Roman" w:hAnsi="Times New Roman" w:cs="Times New Roman"/>
@@ -5054,7 +4076,6 @@
         </w:rPr>
         <w:t>Id</w:t>
       </w:r>
-      <w:proofErr w:type="spellEnd"/>
       <w:r>
         <w:rPr>
           <w:rFonts w:ascii="Times New Roman" w:hAnsi="Times New Roman" w:cs="Times New Roman"/>
@@ -5070,25 +4091,7 @@
           <w:sz w:val="24"/>
           <w:szCs w:val="24"/>
         </w:rPr>
-        <w:t xml:space="preserve">(egyedi azonosító, </w:t>
-      </w:r>
-      <w:proofErr w:type="spellStart"/>
-      <w:r>
-        <w:rPr>
-          <w:rFonts w:ascii="Times New Roman" w:hAnsi="Times New Roman" w:cs="Times New Roman"/>
-          <w:sz w:val="24"/>
-          <w:szCs w:val="24"/>
-        </w:rPr>
-        <w:t>varchar</w:t>
-      </w:r>
-      <w:proofErr w:type="spellEnd"/>
-      <w:r>
-        <w:rPr>
-          <w:rFonts w:ascii="Times New Roman" w:hAnsi="Times New Roman" w:cs="Times New Roman"/>
-          <w:sz w:val="24"/>
-          <w:szCs w:val="24"/>
-        </w:rPr>
-        <w:t xml:space="preserve"> 40, uuid4</w:t>
+        <w:t>(egyedi azonosító, varchar 40, uuid4</w:t>
       </w:r>
       <w:r>
         <w:rPr>
@@ -5122,51 +4125,22 @@
           <w:szCs w:val="24"/>
         </w:rPr>
       </w:pPr>
-      <w:proofErr w:type="spellStart"/>
-      <w:r>
-        <w:rPr>
-          <w:rFonts w:ascii="Times New Roman" w:hAnsi="Times New Roman" w:cs="Times New Roman"/>
-          <w:b/>
-          <w:sz w:val="24"/>
-          <w:szCs w:val="24"/>
-        </w:rPr>
-        <w:t>username</w:t>
-      </w:r>
-      <w:proofErr w:type="spellEnd"/>
-      <w:r>
-        <w:rPr>
-          <w:rFonts w:ascii="Times New Roman" w:hAnsi="Times New Roman" w:cs="Times New Roman"/>
-          <w:b/>
-          <w:sz w:val="24"/>
-          <w:szCs w:val="24"/>
-        </w:rPr>
-        <w:t xml:space="preserve"> </w:t>
-      </w:r>
-      <w:r>
-        <w:rPr>
-          <w:rFonts w:ascii="Times New Roman" w:hAnsi="Times New Roman" w:cs="Times New Roman"/>
-          <w:sz w:val="24"/>
-          <w:szCs w:val="24"/>
-        </w:rPr>
-        <w:t xml:space="preserve">(egyedi felhasználónév, </w:t>
-      </w:r>
-      <w:proofErr w:type="spellStart"/>
-      <w:r>
-        <w:rPr>
-          <w:rFonts w:ascii="Times New Roman" w:hAnsi="Times New Roman" w:cs="Times New Roman"/>
-          <w:sz w:val="24"/>
-          <w:szCs w:val="24"/>
-        </w:rPr>
-        <w:t>varchar</w:t>
-      </w:r>
-      <w:proofErr w:type="spellEnd"/>
-      <w:r>
-        <w:rPr>
-          <w:rFonts w:ascii="Times New Roman" w:hAnsi="Times New Roman" w:cs="Times New Roman"/>
-          <w:sz w:val="24"/>
-          <w:szCs w:val="24"/>
-        </w:rPr>
-        <w:t xml:space="preserve"> 2</w:t>
+      <w:r>
+        <w:rPr>
+          <w:rFonts w:ascii="Times New Roman" w:hAnsi="Times New Roman" w:cs="Times New Roman"/>
+          <w:b/>
+          <w:sz w:val="24"/>
+          <w:szCs w:val="24"/>
+        </w:rPr>
+        <w:t xml:space="preserve">username </w:t>
+      </w:r>
+      <w:r>
+        <w:rPr>
+          <w:rFonts w:ascii="Times New Roman" w:hAnsi="Times New Roman" w:cs="Times New Roman"/>
+          <w:sz w:val="24"/>
+          <w:szCs w:val="24"/>
+        </w:rPr>
+        <w:t>(egyedi felhasználónév, varchar 2</w:t>
       </w:r>
       <w:r>
         <w:rPr>
@@ -5223,25 +4197,7 @@
           <w:sz w:val="24"/>
           <w:szCs w:val="24"/>
         </w:rPr>
-        <w:t xml:space="preserve">regisztráció során megadott email címet tartalmazza, </w:t>
-      </w:r>
-      <w:proofErr w:type="spellStart"/>
-      <w:r>
-        <w:rPr>
-          <w:rFonts w:ascii="Times New Roman" w:hAnsi="Times New Roman" w:cs="Times New Roman"/>
-          <w:sz w:val="24"/>
-          <w:szCs w:val="24"/>
-        </w:rPr>
-        <w:t>varchar</w:t>
-      </w:r>
-      <w:proofErr w:type="spellEnd"/>
-      <w:r>
-        <w:rPr>
-          <w:rFonts w:ascii="Times New Roman" w:hAnsi="Times New Roman" w:cs="Times New Roman"/>
-          <w:sz w:val="24"/>
-          <w:szCs w:val="24"/>
-        </w:rPr>
-        <w:t xml:space="preserve"> 100</w:t>
+        <w:t>regisztráció során megadott email címet tartalmazza, varchar 100</w:t>
       </w:r>
       <w:r>
         <w:rPr>
@@ -5267,52 +4223,22 @@
           <w:szCs w:val="24"/>
         </w:rPr>
       </w:pPr>
-      <w:proofErr w:type="spellStart"/>
-      <w:r>
-        <w:rPr>
-          <w:rFonts w:ascii="Times New Roman" w:hAnsi="Times New Roman" w:cs="Times New Roman"/>
-          <w:b/>
-          <w:sz w:val="24"/>
-          <w:szCs w:val="24"/>
-        </w:rPr>
-        <w:lastRenderedPageBreak/>
-        <w:t>passwd</w:t>
-      </w:r>
-      <w:proofErr w:type="spellEnd"/>
-      <w:r>
-        <w:rPr>
-          <w:rFonts w:ascii="Times New Roman" w:hAnsi="Times New Roman" w:cs="Times New Roman"/>
-          <w:b/>
-          <w:sz w:val="24"/>
-          <w:szCs w:val="24"/>
-        </w:rPr>
-        <w:t xml:space="preserve"> </w:t>
-      </w:r>
-      <w:r>
-        <w:rPr>
-          <w:rFonts w:ascii="Times New Roman" w:hAnsi="Times New Roman" w:cs="Times New Roman"/>
-          <w:sz w:val="24"/>
-          <w:szCs w:val="24"/>
-        </w:rPr>
-        <w:t xml:space="preserve">(regisztráció során megadott jelszó, </w:t>
-      </w:r>
-      <w:proofErr w:type="spellStart"/>
-      <w:r>
-        <w:rPr>
-          <w:rFonts w:ascii="Times New Roman" w:hAnsi="Times New Roman" w:cs="Times New Roman"/>
-          <w:sz w:val="24"/>
-          <w:szCs w:val="24"/>
-        </w:rPr>
-        <w:t>varchar</w:t>
-      </w:r>
-      <w:proofErr w:type="spellEnd"/>
-      <w:r>
-        <w:rPr>
-          <w:rFonts w:ascii="Times New Roman" w:hAnsi="Times New Roman" w:cs="Times New Roman"/>
-          <w:sz w:val="24"/>
-          <w:szCs w:val="24"/>
-        </w:rPr>
-        <w:t xml:space="preserve"> 100, SHA-1 titkosítás)</w:t>
+      <w:r>
+        <w:rPr>
+          <w:rFonts w:ascii="Times New Roman" w:hAnsi="Times New Roman" w:cs="Times New Roman"/>
+          <w:b/>
+          <w:sz w:val="24"/>
+          <w:szCs w:val="24"/>
+        </w:rPr>
+        <w:t xml:space="preserve">passwd </w:t>
+      </w:r>
+      <w:r>
+        <w:rPr>
+          <w:rFonts w:ascii="Times New Roman" w:hAnsi="Times New Roman" w:cs="Times New Roman"/>
+          <w:sz w:val="24"/>
+          <w:szCs w:val="24"/>
+        </w:rPr>
+        <w:t>(regisztráció során megadott jelszó, varchar 100, SHA-1 titkosítás)</w:t>
       </w:r>
     </w:p>
     <w:p>
@@ -5330,7 +4256,6 @@
           <w:szCs w:val="24"/>
         </w:rPr>
       </w:pPr>
-      <w:proofErr w:type="spellStart"/>
       <w:r>
         <w:rPr>
           <w:rFonts w:ascii="Times New Roman" w:hAnsi="Times New Roman" w:cs="Times New Roman"/>
@@ -5358,7 +4283,6 @@
         </w:rPr>
         <w:t>ddress</w:t>
       </w:r>
-      <w:proofErr w:type="spellEnd"/>
       <w:r>
         <w:rPr>
           <w:rFonts w:ascii="Times New Roman" w:hAnsi="Times New Roman" w:cs="Times New Roman"/>
@@ -5374,25 +4298,7 @@
           <w:sz w:val="24"/>
           <w:szCs w:val="24"/>
         </w:rPr>
-        <w:t xml:space="preserve">(regisztráció során alapértelmezettnek megadott helyszín, nem kötelező mező, </w:t>
-      </w:r>
-      <w:proofErr w:type="spellStart"/>
-      <w:r>
-        <w:rPr>
-          <w:rFonts w:ascii="Times New Roman" w:hAnsi="Times New Roman" w:cs="Times New Roman"/>
-          <w:sz w:val="24"/>
-          <w:szCs w:val="24"/>
-        </w:rPr>
-        <w:t>varchar</w:t>
-      </w:r>
-      <w:proofErr w:type="spellEnd"/>
-      <w:r>
-        <w:rPr>
-          <w:rFonts w:ascii="Times New Roman" w:hAnsi="Times New Roman" w:cs="Times New Roman"/>
-          <w:sz w:val="24"/>
-          <w:szCs w:val="24"/>
-        </w:rPr>
-        <w:t xml:space="preserve"> 60)</w:t>
+        <w:t>(regisztráció során alapértelmezettnek megadott helyszín, nem kötelező mező, varchar 60)</w:t>
       </w:r>
     </w:p>
     <w:p>
@@ -5410,17 +4316,16 @@
           <w:szCs w:val="24"/>
         </w:rPr>
       </w:pPr>
-      <w:proofErr w:type="spellStart"/>
-      <w:r>
-        <w:rPr>
-          <w:rFonts w:ascii="Times New Roman" w:hAnsi="Times New Roman" w:cs="Times New Roman"/>
-          <w:b/>
-          <w:sz w:val="24"/>
-          <w:szCs w:val="24"/>
-        </w:rPr>
+      <w:r>
+        <w:rPr>
+          <w:rFonts w:ascii="Times New Roman" w:hAnsi="Times New Roman" w:cs="Times New Roman"/>
+          <w:b/>
+          <w:sz w:val="24"/>
+          <w:szCs w:val="24"/>
+        </w:rPr>
+        <w:lastRenderedPageBreak/>
         <w:t>favCategories</w:t>
       </w:r>
-      <w:proofErr w:type="spellEnd"/>
       <w:r>
         <w:rPr>
           <w:rFonts w:ascii="Times New Roman" w:hAnsi="Times New Roman" w:cs="Times New Roman"/>
@@ -5428,39 +4333,8 @@
           <w:sz w:val="24"/>
           <w:szCs w:val="24"/>
         </w:rPr>
-        <w:t xml:space="preserve"> (regisztráció során megadott három kedvenc kategória, </w:t>
-      </w:r>
-      <w:proofErr w:type="spellStart"/>
-      <w:r>
-        <w:rPr>
-          <w:rFonts w:ascii="Times New Roman" w:hAnsi="Times New Roman" w:cs="Times New Roman"/>
-          <w:bCs/>
-          <w:sz w:val="24"/>
-          <w:szCs w:val="24"/>
-        </w:rPr>
-        <w:t>varchar</w:t>
-      </w:r>
-      <w:proofErr w:type="spellEnd"/>
-      <w:r>
-        <w:rPr>
-          <w:rFonts w:ascii="Times New Roman" w:hAnsi="Times New Roman" w:cs="Times New Roman"/>
-          <w:bCs/>
-          <w:sz w:val="24"/>
-          <w:szCs w:val="24"/>
-        </w:rPr>
-        <w:t xml:space="preserve"> </w:t>
-      </w:r>
-      <w:proofErr w:type="gramStart"/>
-      <w:r>
-        <w:rPr>
-          <w:rFonts w:ascii="Times New Roman" w:hAnsi="Times New Roman" w:cs="Times New Roman"/>
-          <w:bCs/>
-          <w:sz w:val="24"/>
-          <w:szCs w:val="24"/>
-        </w:rPr>
-        <w:t>20 )</w:t>
-      </w:r>
-      <w:proofErr w:type="gramEnd"/>
+        <w:t xml:space="preserve"> (regisztráció során megadott három kedvenc kategória, varchar 20 )</w:t>
+      </w:r>
     </w:p>
     <w:p>
       <w:pPr>
@@ -5477,7 +4351,6 @@
           <w:szCs w:val="24"/>
         </w:rPr>
       </w:pPr>
-      <w:proofErr w:type="spellStart"/>
       <w:r>
         <w:rPr>
           <w:rFonts w:ascii="Times New Roman" w:hAnsi="Times New Roman" w:cs="Times New Roman"/>
@@ -5487,68 +4360,13 @@
         </w:rPr>
         <w:t>role</w:t>
       </w:r>
-      <w:proofErr w:type="spellEnd"/>
-      <w:r>
-        <w:rPr>
-          <w:rFonts w:ascii="Times New Roman" w:hAnsi="Times New Roman" w:cs="Times New Roman"/>
-          <w:sz w:val="24"/>
-          <w:szCs w:val="24"/>
-        </w:rPr>
-        <w:t xml:space="preserve"> (felhasználó jogosultsága, </w:t>
-      </w:r>
-      <w:proofErr w:type="spellStart"/>
-      <w:r>
-        <w:rPr>
-          <w:rFonts w:ascii="Times New Roman" w:hAnsi="Times New Roman" w:cs="Times New Roman"/>
-          <w:sz w:val="24"/>
-          <w:szCs w:val="24"/>
-        </w:rPr>
-        <w:t>admin</w:t>
-      </w:r>
-      <w:proofErr w:type="spellEnd"/>
-      <w:r>
-        <w:rPr>
-          <w:rFonts w:ascii="Times New Roman" w:hAnsi="Times New Roman" w:cs="Times New Roman"/>
-          <w:sz w:val="24"/>
-          <w:szCs w:val="24"/>
-        </w:rPr>
-        <w:t>/</w:t>
-      </w:r>
-      <w:proofErr w:type="spellStart"/>
-      <w:r>
-        <w:rPr>
-          <w:rFonts w:ascii="Times New Roman" w:hAnsi="Times New Roman" w:cs="Times New Roman"/>
-          <w:sz w:val="24"/>
-          <w:szCs w:val="24"/>
-        </w:rPr>
-        <w:t>user</w:t>
-      </w:r>
-      <w:proofErr w:type="spellEnd"/>
-      <w:r>
-        <w:rPr>
-          <w:rFonts w:ascii="Times New Roman" w:hAnsi="Times New Roman" w:cs="Times New Roman"/>
-          <w:sz w:val="24"/>
-          <w:szCs w:val="24"/>
-        </w:rPr>
-        <w:t xml:space="preserve">, </w:t>
-      </w:r>
-      <w:proofErr w:type="spellStart"/>
-      <w:r>
-        <w:rPr>
-          <w:rFonts w:ascii="Times New Roman" w:hAnsi="Times New Roman" w:cs="Times New Roman"/>
-          <w:sz w:val="24"/>
-          <w:szCs w:val="24"/>
-        </w:rPr>
-        <w:t>varchar</w:t>
-      </w:r>
-      <w:proofErr w:type="spellEnd"/>
-      <w:r>
-        <w:rPr>
-          <w:rFonts w:ascii="Times New Roman" w:hAnsi="Times New Roman" w:cs="Times New Roman"/>
-          <w:sz w:val="24"/>
-          <w:szCs w:val="24"/>
-        </w:rPr>
-        <w:t xml:space="preserve"> 10)</w:t>
+      <w:r>
+        <w:rPr>
+          <w:rFonts w:ascii="Times New Roman" w:hAnsi="Times New Roman" w:cs="Times New Roman"/>
+          <w:sz w:val="24"/>
+          <w:szCs w:val="24"/>
+        </w:rPr>
+        <w:t xml:space="preserve"> (felhasználó jogosultsága, admin/user, varchar 10)</w:t>
       </w:r>
     </w:p>
     <w:p>
@@ -5589,25 +4407,7 @@
           <w:sz w:val="24"/>
           <w:szCs w:val="24"/>
         </w:rPr>
-        <w:t xml:space="preserve">fiók aktivitására utal, aktív/inaktív, </w:t>
-      </w:r>
-      <w:proofErr w:type="spellStart"/>
-      <w:r>
-        <w:rPr>
-          <w:rFonts w:ascii="Times New Roman" w:hAnsi="Times New Roman" w:cs="Times New Roman"/>
-          <w:sz w:val="24"/>
-          <w:szCs w:val="24"/>
-        </w:rPr>
-        <w:t>varchar</w:t>
-      </w:r>
-      <w:proofErr w:type="spellEnd"/>
-      <w:r>
-        <w:rPr>
-          <w:rFonts w:ascii="Times New Roman" w:hAnsi="Times New Roman" w:cs="Times New Roman"/>
-          <w:sz w:val="24"/>
-          <w:szCs w:val="24"/>
-        </w:rPr>
-        <w:t xml:space="preserve"> 20</w:t>
+        <w:t>fiók aktivitására utal, aktív/inaktív, varchar 20</w:t>
       </w:r>
       <w:r>
         <w:rPr>
@@ -5628,25 +4428,14 @@
           <w:szCs w:val="24"/>
         </w:rPr>
       </w:pPr>
-      <w:proofErr w:type="spellStart"/>
-      <w:r>
-        <w:rPr>
-          <w:rFonts w:ascii="Times New Roman" w:hAnsi="Times New Roman" w:cs="Times New Roman"/>
-          <w:b/>
-          <w:sz w:val="24"/>
-          <w:szCs w:val="24"/>
-        </w:rPr>
-        <w:t>Categories</w:t>
-      </w:r>
-      <w:proofErr w:type="spellEnd"/>
-      <w:r>
-        <w:rPr>
-          <w:rFonts w:ascii="Times New Roman" w:hAnsi="Times New Roman" w:cs="Times New Roman"/>
-          <w:b/>
-          <w:sz w:val="24"/>
-          <w:szCs w:val="24"/>
-        </w:rPr>
-        <w:t xml:space="preserve"> </w:t>
+      <w:r>
+        <w:rPr>
+          <w:rFonts w:ascii="Times New Roman" w:hAnsi="Times New Roman" w:cs="Times New Roman"/>
+          <w:b/>
+          <w:sz w:val="24"/>
+          <w:szCs w:val="24"/>
+        </w:rPr>
+        <w:t xml:space="preserve">Categories </w:t>
       </w:r>
       <w:r>
         <w:rPr>
@@ -5672,25 +4461,14 @@
           <w:szCs w:val="24"/>
         </w:rPr>
       </w:pPr>
-      <w:proofErr w:type="spellStart"/>
-      <w:r>
-        <w:rPr>
-          <w:rFonts w:ascii="Times New Roman" w:hAnsi="Times New Roman" w:cs="Times New Roman"/>
-          <w:b/>
-          <w:sz w:val="24"/>
-          <w:szCs w:val="24"/>
-        </w:rPr>
-        <w:t>Id</w:t>
-      </w:r>
-      <w:proofErr w:type="spellEnd"/>
-      <w:r>
-        <w:rPr>
-          <w:rFonts w:ascii="Times New Roman" w:hAnsi="Times New Roman" w:cs="Times New Roman"/>
-          <w:b/>
-          <w:sz w:val="24"/>
-          <w:szCs w:val="24"/>
-        </w:rPr>
-        <w:t xml:space="preserve"> </w:t>
+      <w:r>
+        <w:rPr>
+          <w:rFonts w:ascii="Times New Roman" w:hAnsi="Times New Roman" w:cs="Times New Roman"/>
+          <w:b/>
+          <w:sz w:val="24"/>
+          <w:szCs w:val="24"/>
+        </w:rPr>
+        <w:t xml:space="preserve">Id </w:t>
       </w:r>
       <w:r>
         <w:rPr>
@@ -5715,51 +4493,22 @@
           <w:szCs w:val="24"/>
         </w:rPr>
       </w:pPr>
-      <w:proofErr w:type="spellStart"/>
-      <w:r>
-        <w:rPr>
-          <w:rFonts w:ascii="Times New Roman" w:hAnsi="Times New Roman" w:cs="Times New Roman"/>
-          <w:b/>
-          <w:sz w:val="24"/>
-          <w:szCs w:val="24"/>
-        </w:rPr>
-        <w:t>name</w:t>
-      </w:r>
-      <w:proofErr w:type="spellEnd"/>
-      <w:r>
-        <w:rPr>
-          <w:rFonts w:ascii="Times New Roman" w:hAnsi="Times New Roman" w:cs="Times New Roman"/>
-          <w:b/>
-          <w:sz w:val="24"/>
-          <w:szCs w:val="24"/>
-        </w:rPr>
-        <w:t xml:space="preserve"> </w:t>
-      </w:r>
-      <w:r>
-        <w:rPr>
-          <w:rFonts w:ascii="Times New Roman" w:hAnsi="Times New Roman" w:cs="Times New Roman"/>
-          <w:sz w:val="24"/>
-          <w:szCs w:val="24"/>
-        </w:rPr>
-        <w:t xml:space="preserve">(kategóriák nevei, </w:t>
-      </w:r>
-      <w:proofErr w:type="spellStart"/>
-      <w:r>
-        <w:rPr>
-          <w:rFonts w:ascii="Times New Roman" w:hAnsi="Times New Roman" w:cs="Times New Roman"/>
-          <w:sz w:val="24"/>
-          <w:szCs w:val="24"/>
-        </w:rPr>
-        <w:t>varchar</w:t>
-      </w:r>
-      <w:proofErr w:type="spellEnd"/>
-      <w:r>
-        <w:rPr>
-          <w:rFonts w:ascii="Times New Roman" w:hAnsi="Times New Roman" w:cs="Times New Roman"/>
-          <w:sz w:val="24"/>
-          <w:szCs w:val="24"/>
-        </w:rPr>
-        <w:t xml:space="preserve"> 40)</w:t>
+      <w:r>
+        <w:rPr>
+          <w:rFonts w:ascii="Times New Roman" w:hAnsi="Times New Roman" w:cs="Times New Roman"/>
+          <w:b/>
+          <w:sz w:val="24"/>
+          <w:szCs w:val="24"/>
+        </w:rPr>
+        <w:t xml:space="preserve">name </w:t>
+      </w:r>
+      <w:r>
+        <w:rPr>
+          <w:rFonts w:ascii="Times New Roman" w:hAnsi="Times New Roman" w:cs="Times New Roman"/>
+          <w:sz w:val="24"/>
+          <w:szCs w:val="24"/>
+        </w:rPr>
+        <w:t>(kategóriák nevei, varchar 40)</w:t>
       </w:r>
     </w:p>
     <w:p>
@@ -5772,7 +4521,6 @@
           <w:szCs w:val="24"/>
         </w:rPr>
       </w:pPr>
-      <w:proofErr w:type="spellStart"/>
       <w:r>
         <w:rPr>
           <w:rFonts w:ascii="Times New Roman" w:hAnsi="Times New Roman" w:cs="Times New Roman"/>
@@ -5782,7 +4530,6 @@
         </w:rPr>
         <w:t>Locations</w:t>
       </w:r>
-      <w:proofErr w:type="spellEnd"/>
       <w:r>
         <w:rPr>
           <w:rFonts w:ascii="Times New Roman" w:hAnsi="Times New Roman" w:cs="Times New Roman"/>
@@ -5814,7 +4561,6 @@
           <w:szCs w:val="24"/>
         </w:rPr>
       </w:pPr>
-      <w:proofErr w:type="spellStart"/>
       <w:r>
         <w:rPr>
           <w:rFonts w:ascii="Times New Roman" w:hAnsi="Times New Roman" w:cs="Times New Roman"/>
@@ -5824,7 +4570,6 @@
         </w:rPr>
         <w:t>Id</w:t>
       </w:r>
-      <w:proofErr w:type="spellEnd"/>
       <w:r>
         <w:rPr>
           <w:rFonts w:ascii="Times New Roman" w:hAnsi="Times New Roman" w:cs="Times New Roman"/>
@@ -5873,7 +4618,6 @@
           <w:szCs w:val="24"/>
         </w:rPr>
       </w:pPr>
-      <w:proofErr w:type="spellStart"/>
       <w:r>
         <w:rPr>
           <w:rFonts w:ascii="Times New Roman" w:hAnsi="Times New Roman" w:cs="Times New Roman"/>
@@ -5883,32 +4627,13 @@
         </w:rPr>
         <w:t>regionName</w:t>
       </w:r>
-      <w:proofErr w:type="spellEnd"/>
-      <w:r>
-        <w:rPr>
-          <w:rFonts w:ascii="Times New Roman" w:hAnsi="Times New Roman" w:cs="Times New Roman"/>
-          <w:sz w:val="24"/>
-          <w:szCs w:val="24"/>
-        </w:rPr>
-        <w:t xml:space="preserve"> (vármegye neve, </w:t>
-      </w:r>
-      <w:proofErr w:type="spellStart"/>
-      <w:r>
-        <w:rPr>
-          <w:rFonts w:ascii="Times New Roman" w:hAnsi="Times New Roman" w:cs="Times New Roman"/>
-          <w:sz w:val="24"/>
-          <w:szCs w:val="24"/>
-        </w:rPr>
-        <w:t>varchar</w:t>
-      </w:r>
-      <w:proofErr w:type="spellEnd"/>
-      <w:r>
-        <w:rPr>
-          <w:rFonts w:ascii="Times New Roman" w:hAnsi="Times New Roman" w:cs="Times New Roman"/>
-          <w:sz w:val="24"/>
-          <w:szCs w:val="24"/>
-        </w:rPr>
-        <w:t xml:space="preserve"> 100)</w:t>
+      <w:r>
+        <w:rPr>
+          <w:rFonts w:ascii="Times New Roman" w:hAnsi="Times New Roman" w:cs="Times New Roman"/>
+          <w:sz w:val="24"/>
+          <w:szCs w:val="24"/>
+        </w:rPr>
+        <w:t xml:space="preserve"> (vármegye neve, varchar 100)</w:t>
       </w:r>
     </w:p>
     <w:p>
@@ -5925,51 +4650,22 @@
           <w:szCs w:val="24"/>
         </w:rPr>
       </w:pPr>
-      <w:proofErr w:type="spellStart"/>
-      <w:r>
-        <w:rPr>
-          <w:rFonts w:ascii="Times New Roman" w:hAnsi="Times New Roman" w:cs="Times New Roman"/>
-          <w:b/>
-          <w:sz w:val="24"/>
-          <w:szCs w:val="24"/>
-        </w:rPr>
-        <w:t>cityName</w:t>
-      </w:r>
-      <w:proofErr w:type="spellEnd"/>
-      <w:r>
-        <w:rPr>
-          <w:rFonts w:ascii="Times New Roman" w:hAnsi="Times New Roman" w:cs="Times New Roman"/>
-          <w:b/>
-          <w:sz w:val="24"/>
-          <w:szCs w:val="24"/>
-        </w:rPr>
-        <w:t xml:space="preserve"> </w:t>
-      </w:r>
-      <w:r>
-        <w:rPr>
-          <w:rFonts w:ascii="Times New Roman" w:hAnsi="Times New Roman" w:cs="Times New Roman"/>
-          <w:sz w:val="24"/>
-          <w:szCs w:val="24"/>
-        </w:rPr>
-        <w:t xml:space="preserve">(város neve, </w:t>
-      </w:r>
-      <w:proofErr w:type="spellStart"/>
-      <w:r>
-        <w:rPr>
-          <w:rFonts w:ascii="Times New Roman" w:hAnsi="Times New Roman" w:cs="Times New Roman"/>
-          <w:sz w:val="24"/>
-          <w:szCs w:val="24"/>
-        </w:rPr>
-        <w:t>varchar</w:t>
-      </w:r>
-      <w:proofErr w:type="spellEnd"/>
-      <w:r>
-        <w:rPr>
-          <w:rFonts w:ascii="Times New Roman" w:hAnsi="Times New Roman" w:cs="Times New Roman"/>
-          <w:sz w:val="24"/>
-          <w:szCs w:val="24"/>
-        </w:rPr>
-        <w:t xml:space="preserve"> 100)</w:t>
+      <w:r>
+        <w:rPr>
+          <w:rFonts w:ascii="Times New Roman" w:hAnsi="Times New Roman" w:cs="Times New Roman"/>
+          <w:b/>
+          <w:sz w:val="24"/>
+          <w:szCs w:val="24"/>
+        </w:rPr>
+        <w:t xml:space="preserve">cityName </w:t>
+      </w:r>
+      <w:r>
+        <w:rPr>
+          <w:rFonts w:ascii="Times New Roman" w:hAnsi="Times New Roman" w:cs="Times New Roman"/>
+          <w:sz w:val="24"/>
+          <w:szCs w:val="24"/>
+        </w:rPr>
+        <w:t>(város neve, varchar 100)</w:t>
       </w:r>
     </w:p>
     <w:p>
@@ -5986,25 +4682,14 @@
           <w:szCs w:val="24"/>
         </w:rPr>
       </w:pPr>
-      <w:proofErr w:type="spellStart"/>
-      <w:r>
-        <w:rPr>
-          <w:rFonts w:ascii="Times New Roman" w:hAnsi="Times New Roman" w:cs="Times New Roman"/>
-          <w:b/>
-          <w:sz w:val="24"/>
-          <w:szCs w:val="24"/>
-        </w:rPr>
-        <w:t>postCode</w:t>
-      </w:r>
-      <w:proofErr w:type="spellEnd"/>
-      <w:r>
-        <w:rPr>
-          <w:rFonts w:ascii="Times New Roman" w:hAnsi="Times New Roman" w:cs="Times New Roman"/>
-          <w:b/>
-          <w:sz w:val="24"/>
-          <w:szCs w:val="24"/>
-        </w:rPr>
-        <w:t xml:space="preserve"> </w:t>
+      <w:r>
+        <w:rPr>
+          <w:rFonts w:ascii="Times New Roman" w:hAnsi="Times New Roman" w:cs="Times New Roman"/>
+          <w:b/>
+          <w:sz w:val="24"/>
+          <w:szCs w:val="24"/>
+        </w:rPr>
+        <w:t xml:space="preserve">postCode </w:t>
       </w:r>
       <w:r>
         <w:rPr>
@@ -6020,25 +4705,7 @@
           <w:sz w:val="24"/>
           <w:szCs w:val="24"/>
         </w:rPr>
-        <w:t xml:space="preserve">város irányító száma, </w:t>
-      </w:r>
-      <w:proofErr w:type="spellStart"/>
-      <w:r>
-        <w:rPr>
-          <w:rFonts w:ascii="Times New Roman" w:hAnsi="Times New Roman" w:cs="Times New Roman"/>
-          <w:sz w:val="24"/>
-          <w:szCs w:val="24"/>
-        </w:rPr>
-        <w:t>varchar</w:t>
-      </w:r>
-      <w:proofErr w:type="spellEnd"/>
-      <w:r>
-        <w:rPr>
-          <w:rFonts w:ascii="Times New Roman" w:hAnsi="Times New Roman" w:cs="Times New Roman"/>
-          <w:sz w:val="24"/>
-          <w:szCs w:val="24"/>
-        </w:rPr>
-        <w:t xml:space="preserve"> 4</w:t>
+        <w:t>város irányító száma, varchar 4</w:t>
       </w:r>
       <w:r>
         <w:rPr>
@@ -6060,7 +4727,6 @@
           <w:szCs w:val="24"/>
         </w:rPr>
       </w:pPr>
-      <w:proofErr w:type="spellStart"/>
       <w:r>
         <w:rPr>
           <w:rFonts w:ascii="Times New Roman" w:hAnsi="Times New Roman" w:cs="Times New Roman"/>
@@ -6079,7 +4745,6 @@
         </w:rPr>
         <w:t>s</w:t>
       </w:r>
-      <w:proofErr w:type="spellEnd"/>
     </w:p>
     <w:p>
       <w:pPr>
@@ -6096,7 +4761,6 @@
           <w:szCs w:val="24"/>
         </w:rPr>
       </w:pPr>
-      <w:proofErr w:type="spellStart"/>
       <w:r>
         <w:rPr>
           <w:rFonts w:ascii="Times New Roman" w:hAnsi="Times New Roman" w:cs="Times New Roman"/>
@@ -6106,7 +4770,6 @@
         </w:rPr>
         <w:t>Id</w:t>
       </w:r>
-      <w:proofErr w:type="spellEnd"/>
       <w:r>
         <w:rPr>
           <w:rFonts w:ascii="Times New Roman" w:hAnsi="Times New Roman" w:cs="Times New Roman"/>
@@ -6131,51 +4794,22 @@
           <w:szCs w:val="24"/>
         </w:rPr>
       </w:pPr>
-      <w:proofErr w:type="spellStart"/>
-      <w:r>
-        <w:rPr>
-          <w:rFonts w:ascii="Times New Roman" w:hAnsi="Times New Roman" w:cs="Times New Roman"/>
-          <w:b/>
-          <w:sz w:val="24"/>
-          <w:szCs w:val="24"/>
-        </w:rPr>
-        <w:t>userId</w:t>
-      </w:r>
-      <w:proofErr w:type="spellEnd"/>
-      <w:r>
-        <w:rPr>
-          <w:rFonts w:ascii="Times New Roman" w:hAnsi="Times New Roman" w:cs="Times New Roman"/>
-          <w:b/>
-          <w:sz w:val="24"/>
-          <w:szCs w:val="24"/>
-        </w:rPr>
-        <w:t xml:space="preserve"> </w:t>
-      </w:r>
-      <w:r>
-        <w:rPr>
-          <w:rFonts w:ascii="Times New Roman" w:hAnsi="Times New Roman" w:cs="Times New Roman"/>
-          <w:sz w:val="24"/>
-          <w:szCs w:val="24"/>
-        </w:rPr>
-        <w:t xml:space="preserve">(felhasználó azonosítója, </w:t>
-      </w:r>
-      <w:proofErr w:type="spellStart"/>
-      <w:r>
-        <w:rPr>
-          <w:rFonts w:ascii="Times New Roman" w:hAnsi="Times New Roman" w:cs="Times New Roman"/>
-          <w:sz w:val="24"/>
-          <w:szCs w:val="24"/>
-        </w:rPr>
-        <w:t>varchar</w:t>
-      </w:r>
-      <w:proofErr w:type="spellEnd"/>
-      <w:r>
-        <w:rPr>
-          <w:rFonts w:ascii="Times New Roman" w:hAnsi="Times New Roman" w:cs="Times New Roman"/>
-          <w:sz w:val="24"/>
-          <w:szCs w:val="24"/>
-        </w:rPr>
-        <w:t xml:space="preserve"> 40, uuid4, FK)</w:t>
+      <w:r>
+        <w:rPr>
+          <w:rFonts w:ascii="Times New Roman" w:hAnsi="Times New Roman" w:cs="Times New Roman"/>
+          <w:b/>
+          <w:sz w:val="24"/>
+          <w:szCs w:val="24"/>
+        </w:rPr>
+        <w:t xml:space="preserve">userId </w:t>
+      </w:r>
+      <w:r>
+        <w:rPr>
+          <w:rFonts w:ascii="Times New Roman" w:hAnsi="Times New Roman" w:cs="Times New Roman"/>
+          <w:sz w:val="24"/>
+          <w:szCs w:val="24"/>
+        </w:rPr>
+        <w:t>(felhasználó azonosítója, varchar 40, uuid4, FK)</w:t>
       </w:r>
     </w:p>
     <w:p>
@@ -6193,51 +4827,22 @@
           <w:szCs w:val="24"/>
         </w:rPr>
       </w:pPr>
-      <w:proofErr w:type="spellStart"/>
-      <w:r>
-        <w:rPr>
-          <w:rFonts w:ascii="Times New Roman" w:hAnsi="Times New Roman" w:cs="Times New Roman"/>
-          <w:b/>
-          <w:sz w:val="24"/>
-          <w:szCs w:val="24"/>
-        </w:rPr>
-        <w:t>rating</w:t>
-      </w:r>
-      <w:proofErr w:type="spellEnd"/>
-      <w:r>
-        <w:rPr>
-          <w:rFonts w:ascii="Times New Roman" w:hAnsi="Times New Roman" w:cs="Times New Roman"/>
-          <w:b/>
-          <w:sz w:val="24"/>
-          <w:szCs w:val="24"/>
-        </w:rPr>
-        <w:t xml:space="preserve"> </w:t>
-      </w:r>
-      <w:r>
-        <w:rPr>
-          <w:rFonts w:ascii="Times New Roman" w:hAnsi="Times New Roman" w:cs="Times New Roman"/>
-          <w:sz w:val="24"/>
-          <w:szCs w:val="24"/>
-        </w:rPr>
-        <w:t xml:space="preserve">(felhasználó értékelése </w:t>
-      </w:r>
-      <w:proofErr w:type="spellStart"/>
-      <w:r>
-        <w:rPr>
-          <w:rFonts w:ascii="Times New Roman" w:hAnsi="Times New Roman" w:cs="Times New Roman"/>
-          <w:sz w:val="24"/>
-          <w:szCs w:val="24"/>
-        </w:rPr>
-        <w:t>varchar</w:t>
-      </w:r>
-      <w:proofErr w:type="spellEnd"/>
-      <w:r>
-        <w:rPr>
-          <w:rFonts w:ascii="Times New Roman" w:hAnsi="Times New Roman" w:cs="Times New Roman"/>
-          <w:sz w:val="24"/>
-          <w:szCs w:val="24"/>
-        </w:rPr>
-        <w:t xml:space="preserve"> 1, 1-5ig terjedő szám)</w:t>
+      <w:r>
+        <w:rPr>
+          <w:rFonts w:ascii="Times New Roman" w:hAnsi="Times New Roman" w:cs="Times New Roman"/>
+          <w:b/>
+          <w:sz w:val="24"/>
+          <w:szCs w:val="24"/>
+        </w:rPr>
+        <w:t xml:space="preserve">rating </w:t>
+      </w:r>
+      <w:r>
+        <w:rPr>
+          <w:rFonts w:ascii="Times New Roman" w:hAnsi="Times New Roman" w:cs="Times New Roman"/>
+          <w:sz w:val="24"/>
+          <w:szCs w:val="24"/>
+        </w:rPr>
+        <w:t>(felhasználó értékelése varchar 1, 1-5ig terjedő szám)</w:t>
       </w:r>
     </w:p>
     <w:p>
@@ -6251,7 +4856,6 @@
           <w:szCs w:val="24"/>
         </w:rPr>
       </w:pPr>
-      <w:proofErr w:type="spellStart"/>
       <w:r>
         <w:rPr>
           <w:rFonts w:ascii="Times New Roman" w:hAnsi="Times New Roman" w:cs="Times New Roman"/>
@@ -6270,7 +4874,6 @@
         </w:rPr>
         <w:t>s</w:t>
       </w:r>
-      <w:proofErr w:type="spellEnd"/>
     </w:p>
     <w:p>
       <w:pPr>
@@ -6287,7 +4890,6 @@
           <w:szCs w:val="24"/>
         </w:rPr>
       </w:pPr>
-      <w:proofErr w:type="spellStart"/>
       <w:r>
         <w:rPr>
           <w:rFonts w:ascii="Times New Roman" w:hAnsi="Times New Roman" w:cs="Times New Roman"/>
@@ -6297,7 +4899,6 @@
         </w:rPr>
         <w:t>Id</w:t>
       </w:r>
-      <w:proofErr w:type="spellEnd"/>
       <w:r>
         <w:rPr>
           <w:rFonts w:ascii="Times New Roman" w:hAnsi="Times New Roman" w:cs="Times New Roman"/>
@@ -6322,51 +4923,22 @@
           <w:szCs w:val="24"/>
         </w:rPr>
       </w:pPr>
-      <w:proofErr w:type="spellStart"/>
-      <w:r>
-        <w:rPr>
-          <w:rFonts w:ascii="Times New Roman" w:hAnsi="Times New Roman" w:cs="Times New Roman"/>
-          <w:b/>
-          <w:sz w:val="24"/>
-          <w:szCs w:val="24"/>
-        </w:rPr>
-        <w:t>eventId</w:t>
-      </w:r>
-      <w:proofErr w:type="spellEnd"/>
-      <w:r>
-        <w:rPr>
-          <w:rFonts w:ascii="Times New Roman" w:hAnsi="Times New Roman" w:cs="Times New Roman"/>
-          <w:b/>
-          <w:sz w:val="24"/>
-          <w:szCs w:val="24"/>
-        </w:rPr>
-        <w:t xml:space="preserve"> </w:t>
-      </w:r>
-      <w:r>
-        <w:rPr>
-          <w:rFonts w:ascii="Times New Roman" w:hAnsi="Times New Roman" w:cs="Times New Roman"/>
-          <w:sz w:val="24"/>
-          <w:szCs w:val="24"/>
-        </w:rPr>
-        <w:t xml:space="preserve">(esemény azonosítója, </w:t>
-      </w:r>
-      <w:proofErr w:type="spellStart"/>
-      <w:r>
-        <w:rPr>
-          <w:rFonts w:ascii="Times New Roman" w:hAnsi="Times New Roman" w:cs="Times New Roman"/>
-          <w:sz w:val="24"/>
-          <w:szCs w:val="24"/>
-        </w:rPr>
-        <w:t>varchar</w:t>
-      </w:r>
-      <w:proofErr w:type="spellEnd"/>
-      <w:r>
-        <w:rPr>
-          <w:rFonts w:ascii="Times New Roman" w:hAnsi="Times New Roman" w:cs="Times New Roman"/>
-          <w:sz w:val="24"/>
-          <w:szCs w:val="24"/>
-        </w:rPr>
-        <w:t xml:space="preserve"> 40, uuid4, FK)</w:t>
+      <w:r>
+        <w:rPr>
+          <w:rFonts w:ascii="Times New Roman" w:hAnsi="Times New Roman" w:cs="Times New Roman"/>
+          <w:b/>
+          <w:sz w:val="24"/>
+          <w:szCs w:val="24"/>
+        </w:rPr>
+        <w:t xml:space="preserve">eventId </w:t>
+      </w:r>
+      <w:r>
+        <w:rPr>
+          <w:rFonts w:ascii="Times New Roman" w:hAnsi="Times New Roman" w:cs="Times New Roman"/>
+          <w:sz w:val="24"/>
+          <w:szCs w:val="24"/>
+        </w:rPr>
+        <w:t>(esemény azonosítója, varchar 40, uuid4, FK)</w:t>
       </w:r>
       <w:r>
         <w:rPr>
@@ -6393,51 +4965,22 @@
           <w:szCs w:val="24"/>
         </w:rPr>
       </w:pPr>
-      <w:proofErr w:type="spellStart"/>
-      <w:r>
-        <w:rPr>
-          <w:rFonts w:ascii="Times New Roman" w:hAnsi="Times New Roman" w:cs="Times New Roman"/>
-          <w:b/>
-          <w:sz w:val="24"/>
-          <w:szCs w:val="24"/>
-        </w:rPr>
-        <w:t>rating</w:t>
-      </w:r>
-      <w:proofErr w:type="spellEnd"/>
-      <w:r>
-        <w:rPr>
-          <w:rFonts w:ascii="Times New Roman" w:hAnsi="Times New Roman" w:cs="Times New Roman"/>
-          <w:b/>
-          <w:sz w:val="24"/>
-          <w:szCs w:val="24"/>
-        </w:rPr>
-        <w:t xml:space="preserve"> </w:t>
-      </w:r>
-      <w:r>
-        <w:rPr>
-          <w:rFonts w:ascii="Times New Roman" w:hAnsi="Times New Roman" w:cs="Times New Roman"/>
-          <w:sz w:val="24"/>
-          <w:szCs w:val="24"/>
-        </w:rPr>
-        <w:t xml:space="preserve">(felhasználó értékelése </w:t>
-      </w:r>
-      <w:proofErr w:type="spellStart"/>
-      <w:r>
-        <w:rPr>
-          <w:rFonts w:ascii="Times New Roman" w:hAnsi="Times New Roman" w:cs="Times New Roman"/>
-          <w:sz w:val="24"/>
-          <w:szCs w:val="24"/>
-        </w:rPr>
-        <w:t>varchar</w:t>
-      </w:r>
-      <w:proofErr w:type="spellEnd"/>
-      <w:r>
-        <w:rPr>
-          <w:rFonts w:ascii="Times New Roman" w:hAnsi="Times New Roman" w:cs="Times New Roman"/>
-          <w:sz w:val="24"/>
-          <w:szCs w:val="24"/>
-        </w:rPr>
-        <w:t xml:space="preserve"> 1, 1-5ig terjedő szám)</w:t>
+      <w:r>
+        <w:rPr>
+          <w:rFonts w:ascii="Times New Roman" w:hAnsi="Times New Roman" w:cs="Times New Roman"/>
+          <w:b/>
+          <w:sz w:val="24"/>
+          <w:szCs w:val="24"/>
+        </w:rPr>
+        <w:t xml:space="preserve">rating </w:t>
+      </w:r>
+      <w:r>
+        <w:rPr>
+          <w:rFonts w:ascii="Times New Roman" w:hAnsi="Times New Roman" w:cs="Times New Roman"/>
+          <w:sz w:val="24"/>
+          <w:szCs w:val="24"/>
+        </w:rPr>
+        <w:t>(felhasználó értékelése varchar 1, 1-5ig terjedő szám)</w:t>
       </w:r>
     </w:p>
     <w:p>
@@ -6450,7 +4993,6 @@
           <w:szCs w:val="24"/>
         </w:rPr>
       </w:pPr>
-      <w:proofErr w:type="spellStart"/>
       <w:r>
         <w:rPr>
           <w:rFonts w:ascii="Times New Roman" w:hAnsi="Times New Roman" w:cs="Times New Roman"/>
@@ -6469,7 +5011,6 @@
         </w:rPr>
         <w:t>s</w:t>
       </w:r>
-      <w:proofErr w:type="spellEnd"/>
       <w:r>
         <w:rPr>
           <w:rFonts w:ascii="Times New Roman" w:hAnsi="Times New Roman" w:cs="Times New Roman"/>
@@ -6511,51 +5052,22 @@
           <w:szCs w:val="24"/>
         </w:rPr>
       </w:pPr>
-      <w:proofErr w:type="spellStart"/>
-      <w:r>
-        <w:rPr>
-          <w:rFonts w:ascii="Times New Roman" w:hAnsi="Times New Roman" w:cs="Times New Roman"/>
-          <w:b/>
-          <w:sz w:val="24"/>
-          <w:szCs w:val="24"/>
-        </w:rPr>
-        <w:t>Id</w:t>
-      </w:r>
-      <w:proofErr w:type="spellEnd"/>
-      <w:r>
-        <w:rPr>
-          <w:rFonts w:ascii="Times New Roman" w:hAnsi="Times New Roman" w:cs="Times New Roman"/>
-          <w:b/>
-          <w:sz w:val="24"/>
-          <w:szCs w:val="24"/>
-        </w:rPr>
-        <w:t xml:space="preserve"> </w:t>
-      </w:r>
-      <w:r>
-        <w:rPr>
-          <w:rFonts w:ascii="Times New Roman" w:hAnsi="Times New Roman" w:cs="Times New Roman"/>
-          <w:sz w:val="24"/>
-          <w:szCs w:val="24"/>
-        </w:rPr>
-        <w:t xml:space="preserve">(egyedi azonosító, </w:t>
-      </w:r>
-      <w:proofErr w:type="spellStart"/>
-      <w:r>
-        <w:rPr>
-          <w:rFonts w:ascii="Times New Roman" w:hAnsi="Times New Roman" w:cs="Times New Roman"/>
-          <w:sz w:val="24"/>
-          <w:szCs w:val="24"/>
-        </w:rPr>
-        <w:t>varchar</w:t>
-      </w:r>
-      <w:proofErr w:type="spellEnd"/>
-      <w:r>
-        <w:rPr>
-          <w:rFonts w:ascii="Times New Roman" w:hAnsi="Times New Roman" w:cs="Times New Roman"/>
-          <w:sz w:val="24"/>
-          <w:szCs w:val="24"/>
-        </w:rPr>
-        <w:t xml:space="preserve"> 40, uuid4, PK)</w:t>
+      <w:r>
+        <w:rPr>
+          <w:rFonts w:ascii="Times New Roman" w:hAnsi="Times New Roman" w:cs="Times New Roman"/>
+          <w:b/>
+          <w:sz w:val="24"/>
+          <w:szCs w:val="24"/>
+        </w:rPr>
+        <w:t xml:space="preserve">Id </w:t>
+      </w:r>
+      <w:r>
+        <w:rPr>
+          <w:rFonts w:ascii="Times New Roman" w:hAnsi="Times New Roman" w:cs="Times New Roman"/>
+          <w:sz w:val="24"/>
+          <w:szCs w:val="24"/>
+        </w:rPr>
+        <w:t>(egyedi azonosító, varchar 40, uuid4, PK)</w:t>
       </w:r>
     </w:p>
     <w:p>
@@ -6573,51 +5085,22 @@
           <w:szCs w:val="24"/>
         </w:rPr>
       </w:pPr>
-      <w:proofErr w:type="spellStart"/>
-      <w:r>
-        <w:rPr>
-          <w:rFonts w:ascii="Times New Roman" w:hAnsi="Times New Roman" w:cs="Times New Roman"/>
-          <w:b/>
-          <w:sz w:val="24"/>
-          <w:szCs w:val="24"/>
-        </w:rPr>
-        <w:t>userId</w:t>
-      </w:r>
-      <w:proofErr w:type="spellEnd"/>
-      <w:r>
-        <w:rPr>
-          <w:rFonts w:ascii="Times New Roman" w:hAnsi="Times New Roman" w:cs="Times New Roman"/>
-          <w:b/>
-          <w:sz w:val="24"/>
-          <w:szCs w:val="24"/>
-        </w:rPr>
-        <w:t xml:space="preserve"> </w:t>
-      </w:r>
-      <w:r>
-        <w:rPr>
-          <w:rFonts w:ascii="Times New Roman" w:hAnsi="Times New Roman" w:cs="Times New Roman"/>
-          <w:sz w:val="24"/>
-          <w:szCs w:val="24"/>
-        </w:rPr>
-        <w:t xml:space="preserve">(felhasználó azonosítója, </w:t>
-      </w:r>
-      <w:proofErr w:type="spellStart"/>
-      <w:r>
-        <w:rPr>
-          <w:rFonts w:ascii="Times New Roman" w:hAnsi="Times New Roman" w:cs="Times New Roman"/>
-          <w:sz w:val="24"/>
-          <w:szCs w:val="24"/>
-        </w:rPr>
-        <w:t>varchar</w:t>
-      </w:r>
-      <w:proofErr w:type="spellEnd"/>
-      <w:r>
-        <w:rPr>
-          <w:rFonts w:ascii="Times New Roman" w:hAnsi="Times New Roman" w:cs="Times New Roman"/>
-          <w:sz w:val="24"/>
-          <w:szCs w:val="24"/>
-        </w:rPr>
-        <w:t xml:space="preserve"> 40, uuid4, FK)</w:t>
+      <w:r>
+        <w:rPr>
+          <w:rFonts w:ascii="Times New Roman" w:hAnsi="Times New Roman" w:cs="Times New Roman"/>
+          <w:b/>
+          <w:sz w:val="24"/>
+          <w:szCs w:val="24"/>
+        </w:rPr>
+        <w:t xml:space="preserve">userId </w:t>
+      </w:r>
+      <w:r>
+        <w:rPr>
+          <w:rFonts w:ascii="Times New Roman" w:hAnsi="Times New Roman" w:cs="Times New Roman"/>
+          <w:sz w:val="24"/>
+          <w:szCs w:val="24"/>
+        </w:rPr>
+        <w:t>(felhasználó azonosítója, varchar 40, uuid4, FK)</w:t>
       </w:r>
     </w:p>
     <w:p>
@@ -6635,25 +5118,14 @@
           <w:szCs w:val="24"/>
         </w:rPr>
       </w:pPr>
-      <w:proofErr w:type="spellStart"/>
-      <w:r>
-        <w:rPr>
-          <w:rFonts w:ascii="Times New Roman" w:hAnsi="Times New Roman" w:cs="Times New Roman"/>
-          <w:b/>
-          <w:sz w:val="24"/>
-          <w:szCs w:val="24"/>
-        </w:rPr>
-        <w:t>catId</w:t>
-      </w:r>
-      <w:proofErr w:type="spellEnd"/>
-      <w:r>
-        <w:rPr>
-          <w:rFonts w:ascii="Times New Roman" w:hAnsi="Times New Roman" w:cs="Times New Roman"/>
-          <w:b/>
-          <w:sz w:val="24"/>
-          <w:szCs w:val="24"/>
-        </w:rPr>
-        <w:t xml:space="preserve"> </w:t>
+      <w:r>
+        <w:rPr>
+          <w:rFonts w:ascii="Times New Roman" w:hAnsi="Times New Roman" w:cs="Times New Roman"/>
+          <w:b/>
+          <w:sz w:val="24"/>
+          <w:szCs w:val="24"/>
+        </w:rPr>
+        <w:t xml:space="preserve">catId </w:t>
       </w:r>
       <w:r>
         <w:rPr>
@@ -6679,18 +5151,15 @@
           <w:szCs w:val="24"/>
         </w:rPr>
       </w:pPr>
-      <w:proofErr w:type="spellStart"/>
-      <w:r>
-        <w:rPr>
-          <w:rFonts w:ascii="Times New Roman" w:hAnsi="Times New Roman" w:cs="Times New Roman"/>
-          <w:b/>
-          <w:sz w:val="24"/>
-          <w:szCs w:val="24"/>
-        </w:rPr>
-        <w:lastRenderedPageBreak/>
+      <w:r>
+        <w:rPr>
+          <w:rFonts w:ascii="Times New Roman" w:hAnsi="Times New Roman" w:cs="Times New Roman"/>
+          <w:b/>
+          <w:sz w:val="24"/>
+          <w:szCs w:val="24"/>
+        </w:rPr>
         <w:t>eventStart</w:t>
       </w:r>
-      <w:proofErr w:type="spellEnd"/>
       <w:r>
         <w:rPr>
           <w:rFonts w:ascii="Times New Roman" w:hAnsi="Times New Roman" w:cs="Times New Roman"/>
@@ -6715,25 +5184,14 @@
           <w:szCs w:val="24"/>
         </w:rPr>
       </w:pPr>
-      <w:proofErr w:type="spellStart"/>
-      <w:r>
-        <w:rPr>
-          <w:rFonts w:ascii="Times New Roman" w:hAnsi="Times New Roman" w:cs="Times New Roman"/>
-          <w:b/>
-          <w:sz w:val="24"/>
-          <w:szCs w:val="24"/>
-        </w:rPr>
-        <w:t>eventEnd</w:t>
-      </w:r>
-      <w:proofErr w:type="spellEnd"/>
-      <w:r>
-        <w:rPr>
-          <w:rFonts w:ascii="Times New Roman" w:hAnsi="Times New Roman" w:cs="Times New Roman"/>
-          <w:b/>
-          <w:sz w:val="24"/>
-          <w:szCs w:val="24"/>
-        </w:rPr>
-        <w:t xml:space="preserve"> </w:t>
+      <w:r>
+        <w:rPr>
+          <w:rFonts w:ascii="Times New Roman" w:hAnsi="Times New Roman" w:cs="Times New Roman"/>
+          <w:b/>
+          <w:sz w:val="24"/>
+          <w:szCs w:val="24"/>
+        </w:rPr>
+        <w:t xml:space="preserve">eventEnd </w:t>
       </w:r>
       <w:r>
         <w:rPr>
@@ -6775,51 +5233,22 @@
           <w:szCs w:val="24"/>
         </w:rPr>
       </w:pPr>
-      <w:proofErr w:type="spellStart"/>
-      <w:r>
-        <w:rPr>
-          <w:rFonts w:ascii="Times New Roman" w:hAnsi="Times New Roman" w:cs="Times New Roman"/>
-          <w:b/>
-          <w:sz w:val="24"/>
-          <w:szCs w:val="24"/>
-        </w:rPr>
-        <w:t>eventAddress</w:t>
-      </w:r>
-      <w:proofErr w:type="spellEnd"/>
-      <w:r>
-        <w:rPr>
-          <w:rFonts w:ascii="Times New Roman" w:hAnsi="Times New Roman" w:cs="Times New Roman"/>
-          <w:b/>
-          <w:sz w:val="24"/>
-          <w:szCs w:val="24"/>
-        </w:rPr>
-        <w:t xml:space="preserve"> </w:t>
-      </w:r>
-      <w:r>
-        <w:rPr>
-          <w:rFonts w:ascii="Times New Roman" w:hAnsi="Times New Roman" w:cs="Times New Roman"/>
-          <w:sz w:val="24"/>
-          <w:szCs w:val="24"/>
-        </w:rPr>
-        <w:t xml:space="preserve">(az esemény helyszíne, </w:t>
-      </w:r>
-      <w:proofErr w:type="spellStart"/>
-      <w:r>
-        <w:rPr>
-          <w:rFonts w:ascii="Times New Roman" w:hAnsi="Times New Roman" w:cs="Times New Roman"/>
-          <w:sz w:val="24"/>
-          <w:szCs w:val="24"/>
-        </w:rPr>
-        <w:t>varchar</w:t>
-      </w:r>
-      <w:proofErr w:type="spellEnd"/>
-      <w:r>
-        <w:rPr>
-          <w:rFonts w:ascii="Times New Roman" w:hAnsi="Times New Roman" w:cs="Times New Roman"/>
-          <w:sz w:val="24"/>
-          <w:szCs w:val="24"/>
-        </w:rPr>
-        <w:t xml:space="preserve"> 50)</w:t>
+      <w:r>
+        <w:rPr>
+          <w:rFonts w:ascii="Times New Roman" w:hAnsi="Times New Roman" w:cs="Times New Roman"/>
+          <w:b/>
+          <w:sz w:val="24"/>
+          <w:szCs w:val="24"/>
+        </w:rPr>
+        <w:t xml:space="preserve">eventAddress </w:t>
+      </w:r>
+      <w:r>
+        <w:rPr>
+          <w:rFonts w:ascii="Times New Roman" w:hAnsi="Times New Roman" w:cs="Times New Roman"/>
+          <w:sz w:val="24"/>
+          <w:szCs w:val="24"/>
+        </w:rPr>
+        <w:t>(az esemény helyszíne, varchar 50)</w:t>
       </w:r>
     </w:p>
     <w:p>
@@ -6836,25 +5265,14 @@
           <w:szCs w:val="24"/>
         </w:rPr>
       </w:pPr>
-      <w:proofErr w:type="spellStart"/>
-      <w:r>
-        <w:rPr>
-          <w:rFonts w:ascii="Times New Roman" w:hAnsi="Times New Roman" w:cs="Times New Roman"/>
-          <w:b/>
-          <w:sz w:val="24"/>
-          <w:szCs w:val="24"/>
-        </w:rPr>
-        <w:t>eventDate</w:t>
-      </w:r>
-      <w:proofErr w:type="spellEnd"/>
-      <w:r>
-        <w:rPr>
-          <w:rFonts w:ascii="Times New Roman" w:hAnsi="Times New Roman" w:cs="Times New Roman"/>
-          <w:b/>
-          <w:sz w:val="24"/>
-          <w:szCs w:val="24"/>
-        </w:rPr>
-        <w:t xml:space="preserve"> </w:t>
+      <w:r>
+        <w:rPr>
+          <w:rFonts w:ascii="Times New Roman" w:hAnsi="Times New Roman" w:cs="Times New Roman"/>
+          <w:b/>
+          <w:sz w:val="24"/>
+          <w:szCs w:val="24"/>
+        </w:rPr>
+        <w:t xml:space="preserve">eventDate </w:t>
       </w:r>
       <w:r>
         <w:rPr>
@@ -6895,7 +5313,6 @@
           <w:szCs w:val="24"/>
         </w:rPr>
       </w:pPr>
-      <w:proofErr w:type="spellStart"/>
       <w:r>
         <w:rPr>
           <w:rFonts w:ascii="Times New Roman" w:hAnsi="Times New Roman" w:cs="Times New Roman"/>
@@ -6905,18 +5322,7 @@
           <w:szCs w:val="24"/>
         </w:rPr>
         <w:lastRenderedPageBreak/>
-        <w:t>RentLocations</w:t>
-      </w:r>
-      <w:proofErr w:type="spellEnd"/>
-      <w:r>
-        <w:rPr>
-          <w:rFonts w:ascii="Times New Roman" w:hAnsi="Times New Roman" w:cs="Times New Roman"/>
-          <w:b/>
-          <w:bCs/>
-          <w:sz w:val="24"/>
-          <w:szCs w:val="24"/>
-        </w:rPr>
-        <w:t xml:space="preserve"> </w:t>
+        <w:t xml:space="preserve">RentLocations </w:t>
       </w:r>
       <w:r>
         <w:rPr>
@@ -6942,51 +5348,22 @@
           <w:szCs w:val="24"/>
         </w:rPr>
       </w:pPr>
-      <w:proofErr w:type="spellStart"/>
-      <w:r>
-        <w:rPr>
-          <w:rFonts w:ascii="Times New Roman" w:hAnsi="Times New Roman" w:cs="Times New Roman"/>
-          <w:b/>
-          <w:sz w:val="24"/>
-          <w:szCs w:val="24"/>
-        </w:rPr>
-        <w:t>Id</w:t>
-      </w:r>
-      <w:proofErr w:type="spellEnd"/>
-      <w:r>
-        <w:rPr>
-          <w:rFonts w:ascii="Times New Roman" w:hAnsi="Times New Roman" w:cs="Times New Roman"/>
-          <w:b/>
-          <w:sz w:val="24"/>
-          <w:szCs w:val="24"/>
-        </w:rPr>
-        <w:t xml:space="preserve"> </w:t>
-      </w:r>
-      <w:r>
-        <w:rPr>
-          <w:rFonts w:ascii="Times New Roman" w:hAnsi="Times New Roman" w:cs="Times New Roman"/>
-          <w:sz w:val="24"/>
-          <w:szCs w:val="24"/>
-        </w:rPr>
-        <w:t xml:space="preserve">(egyedi azonosító, </w:t>
-      </w:r>
-      <w:proofErr w:type="spellStart"/>
-      <w:r>
-        <w:rPr>
-          <w:rFonts w:ascii="Times New Roman" w:hAnsi="Times New Roman" w:cs="Times New Roman"/>
-          <w:sz w:val="24"/>
-          <w:szCs w:val="24"/>
-        </w:rPr>
-        <w:t>varchar</w:t>
-      </w:r>
-      <w:proofErr w:type="spellEnd"/>
-      <w:r>
-        <w:rPr>
-          <w:rFonts w:ascii="Times New Roman" w:hAnsi="Times New Roman" w:cs="Times New Roman"/>
-          <w:sz w:val="24"/>
-          <w:szCs w:val="24"/>
-        </w:rPr>
-        <w:t xml:space="preserve"> 40, uuid4, PK)</w:t>
+      <w:r>
+        <w:rPr>
+          <w:rFonts w:ascii="Times New Roman" w:hAnsi="Times New Roman" w:cs="Times New Roman"/>
+          <w:b/>
+          <w:sz w:val="24"/>
+          <w:szCs w:val="24"/>
+        </w:rPr>
+        <w:t xml:space="preserve">Id </w:t>
+      </w:r>
+      <w:r>
+        <w:rPr>
+          <w:rFonts w:ascii="Times New Roman" w:hAnsi="Times New Roman" w:cs="Times New Roman"/>
+          <w:sz w:val="24"/>
+          <w:szCs w:val="24"/>
+        </w:rPr>
+        <w:t>(egyedi azonosító, varchar 40, uuid4, PK)</w:t>
       </w:r>
     </w:p>
     <w:p>
@@ -7004,51 +5381,22 @@
           <w:szCs w:val="24"/>
         </w:rPr>
       </w:pPr>
-      <w:proofErr w:type="spellStart"/>
-      <w:r>
-        <w:rPr>
-          <w:rFonts w:ascii="Times New Roman" w:hAnsi="Times New Roman" w:cs="Times New Roman"/>
-          <w:b/>
-          <w:sz w:val="24"/>
-          <w:szCs w:val="24"/>
-        </w:rPr>
-        <w:t>userId</w:t>
-      </w:r>
-      <w:proofErr w:type="spellEnd"/>
-      <w:r>
-        <w:rPr>
-          <w:rFonts w:ascii="Times New Roman" w:hAnsi="Times New Roman" w:cs="Times New Roman"/>
-          <w:b/>
-          <w:sz w:val="24"/>
-          <w:szCs w:val="24"/>
-        </w:rPr>
-        <w:t xml:space="preserve"> </w:t>
-      </w:r>
-      <w:r>
-        <w:rPr>
-          <w:rFonts w:ascii="Times New Roman" w:hAnsi="Times New Roman" w:cs="Times New Roman"/>
-          <w:sz w:val="24"/>
-          <w:szCs w:val="24"/>
-        </w:rPr>
-        <w:t xml:space="preserve">(felhasználó azonosítója, </w:t>
-      </w:r>
-      <w:proofErr w:type="spellStart"/>
-      <w:r>
-        <w:rPr>
-          <w:rFonts w:ascii="Times New Roman" w:hAnsi="Times New Roman" w:cs="Times New Roman"/>
-          <w:sz w:val="24"/>
-          <w:szCs w:val="24"/>
-        </w:rPr>
-        <w:t>varchar</w:t>
-      </w:r>
-      <w:proofErr w:type="spellEnd"/>
-      <w:r>
-        <w:rPr>
-          <w:rFonts w:ascii="Times New Roman" w:hAnsi="Times New Roman" w:cs="Times New Roman"/>
-          <w:sz w:val="24"/>
-          <w:szCs w:val="24"/>
-        </w:rPr>
-        <w:t xml:space="preserve"> 40, uuid4, FK)</w:t>
+      <w:r>
+        <w:rPr>
+          <w:rFonts w:ascii="Times New Roman" w:hAnsi="Times New Roman" w:cs="Times New Roman"/>
+          <w:b/>
+          <w:sz w:val="24"/>
+          <w:szCs w:val="24"/>
+        </w:rPr>
+        <w:t xml:space="preserve">userId </w:t>
+      </w:r>
+      <w:r>
+        <w:rPr>
+          <w:rFonts w:ascii="Times New Roman" w:hAnsi="Times New Roman" w:cs="Times New Roman"/>
+          <w:sz w:val="24"/>
+          <w:szCs w:val="24"/>
+        </w:rPr>
+        <w:t>(felhasználó azonosítója, varchar 40, uuid4, FK)</w:t>
       </w:r>
     </w:p>
     <w:p>
@@ -7065,7 +5413,6 @@
           <w:szCs w:val="24"/>
         </w:rPr>
       </w:pPr>
-      <w:proofErr w:type="spellStart"/>
       <w:r>
         <w:rPr>
           <w:rFonts w:ascii="Times New Roman" w:hAnsi="Times New Roman" w:cs="Times New Roman"/>
@@ -7076,32 +5423,13 @@
         </w:rPr>
         <w:t>capacity</w:t>
       </w:r>
-      <w:proofErr w:type="spellEnd"/>
-      <w:r>
-        <w:rPr>
-          <w:rFonts w:ascii="Times New Roman" w:hAnsi="Times New Roman" w:cs="Times New Roman"/>
-          <w:sz w:val="24"/>
-          <w:szCs w:val="24"/>
-        </w:rPr>
-        <w:t xml:space="preserve"> (a helyszín befogadóképessége, </w:t>
-      </w:r>
-      <w:proofErr w:type="spellStart"/>
-      <w:r>
-        <w:rPr>
-          <w:rFonts w:ascii="Times New Roman" w:hAnsi="Times New Roman" w:cs="Times New Roman"/>
-          <w:sz w:val="24"/>
-          <w:szCs w:val="24"/>
-        </w:rPr>
-        <w:t>varchar</w:t>
-      </w:r>
-      <w:proofErr w:type="spellEnd"/>
-      <w:r>
-        <w:rPr>
-          <w:rFonts w:ascii="Times New Roman" w:hAnsi="Times New Roman" w:cs="Times New Roman"/>
-          <w:sz w:val="24"/>
-          <w:szCs w:val="24"/>
-        </w:rPr>
-        <w:t xml:space="preserve"> 10)</w:t>
+      <w:r>
+        <w:rPr>
+          <w:rFonts w:ascii="Times New Roman" w:hAnsi="Times New Roman" w:cs="Times New Roman"/>
+          <w:sz w:val="24"/>
+          <w:szCs w:val="24"/>
+        </w:rPr>
+        <w:t xml:space="preserve"> (a helyszín befogadóképessége, varchar 10)</w:t>
       </w:r>
     </w:p>
     <w:p>
@@ -7118,7 +5446,6 @@
           <w:szCs w:val="24"/>
         </w:rPr>
       </w:pPr>
-      <w:proofErr w:type="spellStart"/>
       <w:r>
         <w:rPr>
           <w:rFonts w:ascii="Times New Roman" w:hAnsi="Times New Roman" w:cs="Times New Roman"/>
@@ -7129,7 +5456,6 @@
         </w:rPr>
         <w:t>contact</w:t>
       </w:r>
-      <w:proofErr w:type="spellEnd"/>
       <w:r>
         <w:rPr>
           <w:rFonts w:ascii="Times New Roman" w:hAnsi="Times New Roman" w:cs="Times New Roman"/>
@@ -7146,25 +5472,7 @@
           <w:sz w:val="24"/>
           <w:szCs w:val="24"/>
         </w:rPr>
-        <w:t xml:space="preserve">(a bérbeadó elérhetőségei (email, telefon), </w:t>
-      </w:r>
-      <w:proofErr w:type="spellStart"/>
-      <w:r>
-        <w:rPr>
-          <w:rFonts w:ascii="Times New Roman" w:hAnsi="Times New Roman" w:cs="Times New Roman"/>
-          <w:sz w:val="24"/>
-          <w:szCs w:val="24"/>
-        </w:rPr>
-        <w:t>varchar</w:t>
-      </w:r>
-      <w:proofErr w:type="spellEnd"/>
-      <w:r>
-        <w:rPr>
-          <w:rFonts w:ascii="Times New Roman" w:hAnsi="Times New Roman" w:cs="Times New Roman"/>
-          <w:sz w:val="24"/>
-          <w:szCs w:val="24"/>
-        </w:rPr>
-        <w:t xml:space="preserve"> 100)</w:t>
+        <w:t>(a bérbeadó elérhetőségei (email, telefon), varchar 100)</w:t>
       </w:r>
     </w:p>
     <w:p>
@@ -7181,7 +5489,6 @@
           <w:szCs w:val="24"/>
         </w:rPr>
       </w:pPr>
-      <w:proofErr w:type="spellStart"/>
       <w:r>
         <w:rPr>
           <w:rFonts w:ascii="Times New Roman" w:hAnsi="Times New Roman" w:cs="Times New Roman"/>
@@ -7192,7 +5499,6 @@
         </w:rPr>
         <w:t>price</w:t>
       </w:r>
-      <w:proofErr w:type="spellEnd"/>
       <w:r>
         <w:rPr>
           <w:rFonts w:ascii="Times New Roman" w:hAnsi="Times New Roman" w:cs="Times New Roman"/>
@@ -7209,25 +5515,7 @@
           <w:sz w:val="24"/>
           <w:szCs w:val="24"/>
         </w:rPr>
-        <w:t xml:space="preserve">(a helyszín bérlési ára, </w:t>
-      </w:r>
-      <w:proofErr w:type="spellStart"/>
-      <w:r>
-        <w:rPr>
-          <w:rFonts w:ascii="Times New Roman" w:hAnsi="Times New Roman" w:cs="Times New Roman"/>
-          <w:sz w:val="24"/>
-          <w:szCs w:val="24"/>
-        </w:rPr>
-        <w:t>varchar</w:t>
-      </w:r>
-      <w:proofErr w:type="spellEnd"/>
-      <w:r>
-        <w:rPr>
-          <w:rFonts w:ascii="Times New Roman" w:hAnsi="Times New Roman" w:cs="Times New Roman"/>
-          <w:sz w:val="24"/>
-          <w:szCs w:val="24"/>
-        </w:rPr>
-        <w:t xml:space="preserve"> 50)</w:t>
+        <w:t>(a helyszín bérlési ára, varchar 50)</w:t>
       </w:r>
     </w:p>
     <w:p>
@@ -7244,7 +5532,6 @@
           <w:szCs w:val="24"/>
         </w:rPr>
       </w:pPr>
-      <w:proofErr w:type="spellStart"/>
       <w:r>
         <w:rPr>
           <w:rFonts w:ascii="Times New Roman" w:hAnsi="Times New Roman" w:cs="Times New Roman"/>
@@ -7255,7 +5542,6 @@
         </w:rPr>
         <w:t>rentAddress</w:t>
       </w:r>
-      <w:proofErr w:type="spellEnd"/>
       <w:r>
         <w:rPr>
           <w:rFonts w:ascii="Times New Roman" w:hAnsi="Times New Roman" w:cs="Times New Roman"/>
@@ -7264,23 +5550,21 @@
         </w:rPr>
         <w:t xml:space="preserve"> (a helyszín pontos címe, </w:t>
       </w:r>
-      <w:proofErr w:type="spellStart"/>
-      <w:r>
-        <w:rPr>
-          <w:rFonts w:ascii="Times New Roman" w:hAnsi="Times New Roman" w:cs="Times New Roman"/>
-          <w:sz w:val="24"/>
-          <w:szCs w:val="24"/>
-        </w:rPr>
-        <w:t>varchar</w:t>
-      </w:r>
-      <w:proofErr w:type="spellEnd"/>
-      <w:r>
-        <w:rPr>
-          <w:rFonts w:ascii="Times New Roman" w:hAnsi="Times New Roman" w:cs="Times New Roman"/>
-          <w:sz w:val="24"/>
-          <w:szCs w:val="24"/>
-        </w:rPr>
-        <w:t xml:space="preserve"> 50)</w:t>
+      <w:r>
+        <w:rPr>
+          <w:rFonts w:ascii="Times New Roman" w:hAnsi="Times New Roman" w:cs="Times New Roman"/>
+          <w:sz w:val="24"/>
+          <w:szCs w:val="24"/>
+        </w:rPr>
+        <w:t>varchar 50</w:t>
+      </w:r>
+      <w:r>
+        <w:rPr>
+          <w:rFonts w:ascii="Times New Roman" w:hAnsi="Times New Roman" w:cs="Times New Roman"/>
+          <w:sz w:val="24"/>
+          <w:szCs w:val="24"/>
+        </w:rPr>
+        <w:t>)</w:t>
       </w:r>
     </w:p>
     <w:p>
@@ -7297,7 +5581,6 @@
           <w:szCs w:val="24"/>
         </w:rPr>
       </w:pPr>
-      <w:proofErr w:type="spellStart"/>
       <w:r>
         <w:rPr>
           <w:rFonts w:ascii="Times New Roman" w:hAnsi="Times New Roman" w:cs="Times New Roman"/>
@@ -7308,50 +5591,13 @@
         </w:rPr>
         <w:t>rentCategories</w:t>
       </w:r>
-      <w:proofErr w:type="spellEnd"/>
-      <w:r>
-        <w:rPr>
-          <w:rFonts w:ascii="Times New Roman" w:hAnsi="Times New Roman" w:cs="Times New Roman"/>
-          <w:sz w:val="24"/>
-          <w:szCs w:val="24"/>
-        </w:rPr>
-        <w:t xml:space="preserve"> (a helyszínen rendezhető </w:t>
-      </w:r>
-      <w:proofErr w:type="spellStart"/>
-      <w:r>
-        <w:rPr>
-          <w:rFonts w:ascii="Times New Roman" w:hAnsi="Times New Roman" w:cs="Times New Roman"/>
-          <w:sz w:val="24"/>
-          <w:szCs w:val="24"/>
-        </w:rPr>
-        <w:t>katégóriák</w:t>
-      </w:r>
-      <w:proofErr w:type="spellEnd"/>
-      <w:r>
-        <w:rPr>
-          <w:rFonts w:ascii="Times New Roman" w:hAnsi="Times New Roman" w:cs="Times New Roman"/>
-          <w:sz w:val="24"/>
-          <w:szCs w:val="24"/>
-        </w:rPr>
-        <w:t xml:space="preserve">, </w:t>
-      </w:r>
-      <w:proofErr w:type="spellStart"/>
-      <w:r>
-        <w:rPr>
-          <w:rFonts w:ascii="Times New Roman" w:hAnsi="Times New Roman" w:cs="Times New Roman"/>
-          <w:sz w:val="24"/>
-          <w:szCs w:val="24"/>
-        </w:rPr>
-        <w:t>varchar</w:t>
-      </w:r>
-      <w:proofErr w:type="spellEnd"/>
-      <w:r>
-        <w:rPr>
-          <w:rFonts w:ascii="Times New Roman" w:hAnsi="Times New Roman" w:cs="Times New Roman"/>
-          <w:sz w:val="24"/>
-          <w:szCs w:val="24"/>
-        </w:rPr>
-        <w:t xml:space="preserve"> 20)</w:t>
+      <w:r>
+        <w:rPr>
+          <w:rFonts w:ascii="Times New Roman" w:hAnsi="Times New Roman" w:cs="Times New Roman"/>
+          <w:sz w:val="24"/>
+          <w:szCs w:val="24"/>
+        </w:rPr>
+        <w:t xml:space="preserve"> (a helyszínen rendezhető katégóriák, varchar 20)</w:t>
       </w:r>
     </w:p>
     <w:sectPr>
@@ -7365,7 +5611,7 @@
 </file>
 
 <file path=word/endnotes.xml><?xml version="1.0" encoding="utf-8"?>
-<w:endnotes xmlns:wpc="http://schemas.microsoft.com/office/word/2010/wordprocessingCanvas" xmlns:cx="http://schemas.microsoft.com/office/drawing/2014/chartex" xmlns:cx1="http://schemas.microsoft.com/office/drawing/2015/9/8/chartex" xmlns:cx2="http://schemas.microsoft.com/office/drawing/2015/10/21/chartex" xmlns:cx3="http://schemas.microsoft.com/office/drawing/2016/5/9/chartex" xmlns:cx4="http://schemas.microsoft.com/office/drawing/2016/5/10/chartex" xmlns:cx5="http://schemas.microsoft.com/office/drawing/2016/5/11/chartex" xmlns:cx6="http://schemas.microsoft.com/office/drawing/2016/5/12/chartex" xmlns:cx7="http://schemas.microsoft.com/office/drawing/2016/5/13/chartex" xmlns:cx8="http://schemas.microsoft.com/office/drawing/2016/5/14/chartex" xmlns:mc="http://schemas.openxmlformats.org/markup-compatibility/2006" xmlns:aink="http://schemas.microsoft.com/office/drawing/2016/ink" xmlns:am3d="http://schemas.microsoft.com/office/drawing/2017/model3d" xmlns:o="urn:schemas-microsoft-com:office:office" xmlns:r="http://schemas.openxmlformats.org/officeDocument/2006/relationships" xmlns:m="http://schemas.openxmlformats.org/officeDocument/2006/math" xmlns:v="urn:schemas-microsoft-com:vml" xmlns:wp14="http://schemas.microsoft.com/office/word/2010/wordprocessingDrawing" xmlns:wp="http://schemas.openxmlformats.org/drawingml/2006/wordprocessingDrawing" xmlns:w10="urn:schemas-microsoft-com:office:word" xmlns:w="http://schemas.openxmlformats.org/wordprocessingml/2006/main" xmlns:w14="http://schemas.microsoft.com/office/word/2010/wordml" xmlns:w15="http://schemas.microsoft.com/office/word/2012/wordml" xmlns:w16cid="http://schemas.microsoft.com/office/word/2016/wordml/cid" xmlns:w16se="http://schemas.microsoft.com/office/word/2015/wordml/symex" xmlns:wpg="http://schemas.microsoft.com/office/word/2010/wordprocessingGroup" xmlns:wpi="http://schemas.microsoft.com/office/word/2010/wordprocessingInk" xmlns:wne="http://schemas.microsoft.com/office/word/2006/wordml" xmlns:wps="http://schemas.microsoft.com/office/word/2010/wordprocessingShape" mc:Ignorable="w14 w15 w16se w16cid wp14">
+<w:endnotes xmlns:wpc="http://schemas.microsoft.com/office/word/2010/wordprocessingCanvas" xmlns:cx="http://schemas.microsoft.com/office/drawing/2014/chartex" xmlns:cx1="http://schemas.microsoft.com/office/drawing/2015/9/8/chartex" xmlns:cx2="http://schemas.microsoft.com/office/drawing/2015/10/21/chartex" xmlns:cx3="http://schemas.microsoft.com/office/drawing/2016/5/9/chartex" xmlns:cx4="http://schemas.microsoft.com/office/drawing/2016/5/10/chartex" xmlns:cx5="http://schemas.microsoft.com/office/drawing/2016/5/11/chartex" xmlns:cx6="http://schemas.microsoft.com/office/drawing/2016/5/12/chartex" xmlns:cx7="http://schemas.microsoft.com/office/drawing/2016/5/13/chartex" xmlns:cx8="http://schemas.microsoft.com/office/drawing/2016/5/14/chartex" xmlns:mc="http://schemas.openxmlformats.org/markup-compatibility/2006" xmlns:aink="http://schemas.microsoft.com/office/drawing/2016/ink" xmlns:am3d="http://schemas.microsoft.com/office/drawing/2017/model3d" xmlns:o="urn:schemas-microsoft-com:office:office" xmlns:oel="http://schemas.microsoft.com/office/2019/extlst" xmlns:r="http://schemas.openxmlformats.org/officeDocument/2006/relationships" xmlns:m="http://schemas.openxmlformats.org/officeDocument/2006/math" xmlns:v="urn:schemas-microsoft-com:vml" xmlns:wp14="http://schemas.microsoft.com/office/word/2010/wordprocessingDrawing" xmlns:wp="http://schemas.openxmlformats.org/drawingml/2006/wordprocessingDrawing" xmlns:w10="urn:schemas-microsoft-com:office:word" xmlns:w="http://schemas.openxmlformats.org/wordprocessingml/2006/main" xmlns:w14="http://schemas.microsoft.com/office/word/2010/wordml" xmlns:w15="http://schemas.microsoft.com/office/word/2012/wordml" xmlns:w16cex="http://schemas.microsoft.com/office/word/2018/wordml/cex" xmlns:w16cid="http://schemas.microsoft.com/office/word/2016/wordml/cid" xmlns:w16="http://schemas.microsoft.com/office/word/2018/wordml" xmlns:w16du="http://schemas.microsoft.com/office/word/2023/wordml/word16du" xmlns:w16sdtdh="http://schemas.microsoft.com/office/word/2020/wordml/sdtdatahash" xmlns:w16sdtfl="http://schemas.microsoft.com/office/word/2024/wordml/sdtformatlock" xmlns:w16se="http://schemas.microsoft.com/office/word/2015/wordml/symex" xmlns:wpg="http://schemas.microsoft.com/office/word/2010/wordprocessingGroup" xmlns:wpi="http://schemas.microsoft.com/office/word/2010/wordprocessingInk" xmlns:wne="http://schemas.microsoft.com/office/word/2006/wordml" xmlns:wps="http://schemas.microsoft.com/office/word/2010/wordprocessingShape" mc:Ignorable="w14 w15 w16se w16cid w16 w16cex w16sdtdh w16sdtfl w16du wp14">
   <w:endnote w:type="separator" w:id="-1">
     <w:p>
       <w:pPr>
@@ -7390,7 +5636,7 @@
 </file>
 
 <file path=word/footer1.xml><?xml version="1.0" encoding="utf-8"?>
-<w:ftr xmlns:wpc="http://schemas.microsoft.com/office/word/2010/wordprocessingCanvas" xmlns:cx="http://schemas.microsoft.com/office/drawing/2014/chartex" xmlns:cx1="http://schemas.microsoft.com/office/drawing/2015/9/8/chartex" xmlns:cx2="http://schemas.microsoft.com/office/drawing/2015/10/21/chartex" xmlns:cx3="http://schemas.microsoft.com/office/drawing/2016/5/9/chartex" xmlns:cx4="http://schemas.microsoft.com/office/drawing/2016/5/10/chartex" xmlns:cx5="http://schemas.microsoft.com/office/drawing/2016/5/11/chartex" xmlns:cx6="http://schemas.microsoft.com/office/drawing/2016/5/12/chartex" xmlns:cx7="http://schemas.microsoft.com/office/drawing/2016/5/13/chartex" xmlns:cx8="http://schemas.microsoft.com/office/drawing/2016/5/14/chartex" xmlns:mc="http://schemas.openxmlformats.org/markup-compatibility/2006" xmlns:aink="http://schemas.microsoft.com/office/drawing/2016/ink" xmlns:am3d="http://schemas.microsoft.com/office/drawing/2017/model3d" xmlns:o="urn:schemas-microsoft-com:office:office" xmlns:r="http://schemas.openxmlformats.org/officeDocument/2006/relationships" xmlns:m="http://schemas.openxmlformats.org/officeDocument/2006/math" xmlns:v="urn:schemas-microsoft-com:vml" xmlns:wp14="http://schemas.microsoft.com/office/word/2010/wordprocessingDrawing" xmlns:wp="http://schemas.openxmlformats.org/drawingml/2006/wordprocessingDrawing" xmlns:w10="urn:schemas-microsoft-com:office:word" xmlns:w="http://schemas.openxmlformats.org/wordprocessingml/2006/main" xmlns:w14="http://schemas.microsoft.com/office/word/2010/wordml" xmlns:w15="http://schemas.microsoft.com/office/word/2012/wordml" xmlns:w16cid="http://schemas.microsoft.com/office/word/2016/wordml/cid" xmlns:w16se="http://schemas.microsoft.com/office/word/2015/wordml/symex" xmlns:wpg="http://schemas.microsoft.com/office/word/2010/wordprocessingGroup" xmlns:wpi="http://schemas.microsoft.com/office/word/2010/wordprocessingInk" xmlns:wne="http://schemas.microsoft.com/office/word/2006/wordml" xmlns:wps="http://schemas.microsoft.com/office/word/2010/wordprocessingShape" mc:Ignorable="w14 w15 w16se w16cid wp14">
+<w:ftr xmlns:wpc="http://schemas.microsoft.com/office/word/2010/wordprocessingCanvas" xmlns:cx="http://schemas.microsoft.com/office/drawing/2014/chartex" xmlns:cx1="http://schemas.microsoft.com/office/drawing/2015/9/8/chartex" xmlns:cx2="http://schemas.microsoft.com/office/drawing/2015/10/21/chartex" xmlns:cx3="http://schemas.microsoft.com/office/drawing/2016/5/9/chartex" xmlns:cx4="http://schemas.microsoft.com/office/drawing/2016/5/10/chartex" xmlns:cx5="http://schemas.microsoft.com/office/drawing/2016/5/11/chartex" xmlns:cx6="http://schemas.microsoft.com/office/drawing/2016/5/12/chartex" xmlns:cx7="http://schemas.microsoft.com/office/drawing/2016/5/13/chartex" xmlns:cx8="http://schemas.microsoft.com/office/drawing/2016/5/14/chartex" xmlns:mc="http://schemas.openxmlformats.org/markup-compatibility/2006" xmlns:aink="http://schemas.microsoft.com/office/drawing/2016/ink" xmlns:am3d="http://schemas.microsoft.com/office/drawing/2017/model3d" xmlns:o="urn:schemas-microsoft-com:office:office" xmlns:oel="http://schemas.microsoft.com/office/2019/extlst" xmlns:r="http://schemas.openxmlformats.org/officeDocument/2006/relationships" xmlns:m="http://schemas.openxmlformats.org/officeDocument/2006/math" xmlns:v="urn:schemas-microsoft-com:vml" xmlns:wp14="http://schemas.microsoft.com/office/word/2010/wordprocessingDrawing" xmlns:wp="http://schemas.openxmlformats.org/drawingml/2006/wordprocessingDrawing" xmlns:w10="urn:schemas-microsoft-com:office:word" xmlns:w="http://schemas.openxmlformats.org/wordprocessingml/2006/main" xmlns:w14="http://schemas.microsoft.com/office/word/2010/wordml" xmlns:w15="http://schemas.microsoft.com/office/word/2012/wordml" xmlns:w16cex="http://schemas.microsoft.com/office/word/2018/wordml/cex" xmlns:w16cid="http://schemas.microsoft.com/office/word/2016/wordml/cid" xmlns:w16="http://schemas.microsoft.com/office/word/2018/wordml" xmlns:w16du="http://schemas.microsoft.com/office/word/2023/wordml/word16du" xmlns:w16sdtdh="http://schemas.microsoft.com/office/word/2020/wordml/sdtdatahash" xmlns:w16sdtfl="http://schemas.microsoft.com/office/word/2024/wordml/sdtformatlock" xmlns:w16se="http://schemas.microsoft.com/office/word/2015/wordml/symex" xmlns:wpg="http://schemas.microsoft.com/office/word/2010/wordprocessingGroup" xmlns:wpi="http://schemas.microsoft.com/office/word/2010/wordprocessingInk" xmlns:wne="http://schemas.microsoft.com/office/word/2006/wordml" xmlns:wps="http://schemas.microsoft.com/office/word/2010/wordprocessingShape" mc:Ignorable="w14 w15 w16se w16cid w16 w16cex w16sdtdh w16sdtfl w16du wp14">
   <w:sdt>
     <w:sdtPr>
       <w:id w:val="-1918085540"/>
@@ -7399,7 +5645,6 @@
         <w:docPartUnique/>
       </w:docPartObj>
     </w:sdtPr>
-    <w:sdtEndPr/>
     <w:sdtContent>
       <w:p>
         <w:pPr>
@@ -7433,7 +5678,7 @@
 </file>
 
 <file path=word/footnotes.xml><?xml version="1.0" encoding="utf-8"?>
-<w:footnotes xmlns:wpc="http://schemas.microsoft.com/office/word/2010/wordprocessingCanvas" xmlns:cx="http://schemas.microsoft.com/office/drawing/2014/chartex" xmlns:cx1="http://schemas.microsoft.com/office/drawing/2015/9/8/chartex" xmlns:cx2="http://schemas.microsoft.com/office/drawing/2015/10/21/chartex" xmlns:cx3="http://schemas.microsoft.com/office/drawing/2016/5/9/chartex" xmlns:cx4="http://schemas.microsoft.com/office/drawing/2016/5/10/chartex" xmlns:cx5="http://schemas.microsoft.com/office/drawing/2016/5/11/chartex" xmlns:cx6="http://schemas.microsoft.com/office/drawing/2016/5/12/chartex" xmlns:cx7="http://schemas.microsoft.com/office/drawing/2016/5/13/chartex" xmlns:cx8="http://schemas.microsoft.com/office/drawing/2016/5/14/chartex" xmlns:mc="http://schemas.openxmlformats.org/markup-compatibility/2006" xmlns:aink="http://schemas.microsoft.com/office/drawing/2016/ink" xmlns:am3d="http://schemas.microsoft.com/office/drawing/2017/model3d" xmlns:o="urn:schemas-microsoft-com:office:office" xmlns:r="http://schemas.openxmlformats.org/officeDocument/2006/relationships" xmlns:m="http://schemas.openxmlformats.org/officeDocument/2006/math" xmlns:v="urn:schemas-microsoft-com:vml" xmlns:wp14="http://schemas.microsoft.com/office/word/2010/wordprocessingDrawing" xmlns:wp="http://schemas.openxmlformats.org/drawingml/2006/wordprocessingDrawing" xmlns:w10="urn:schemas-microsoft-com:office:word" xmlns:w="http://schemas.openxmlformats.org/wordprocessingml/2006/main" xmlns:w14="http://schemas.microsoft.com/office/word/2010/wordml" xmlns:w15="http://schemas.microsoft.com/office/word/2012/wordml" xmlns:w16cid="http://schemas.microsoft.com/office/word/2016/wordml/cid" xmlns:w16se="http://schemas.microsoft.com/office/word/2015/wordml/symex" xmlns:wpg="http://schemas.microsoft.com/office/word/2010/wordprocessingGroup" xmlns:wpi="http://schemas.microsoft.com/office/word/2010/wordprocessingInk" xmlns:wne="http://schemas.microsoft.com/office/word/2006/wordml" xmlns:wps="http://schemas.microsoft.com/office/word/2010/wordprocessingShape" mc:Ignorable="w14 w15 w16se w16cid wp14">
+<w:footnotes xmlns:wpc="http://schemas.microsoft.com/office/word/2010/wordprocessingCanvas" xmlns:cx="http://schemas.microsoft.com/office/drawing/2014/chartex" xmlns:cx1="http://schemas.microsoft.com/office/drawing/2015/9/8/chartex" xmlns:cx2="http://schemas.microsoft.com/office/drawing/2015/10/21/chartex" xmlns:cx3="http://schemas.microsoft.com/office/drawing/2016/5/9/chartex" xmlns:cx4="http://schemas.microsoft.com/office/drawing/2016/5/10/chartex" xmlns:cx5="http://schemas.microsoft.com/office/drawing/2016/5/11/chartex" xmlns:cx6="http://schemas.microsoft.com/office/drawing/2016/5/12/chartex" xmlns:cx7="http://schemas.microsoft.com/office/drawing/2016/5/13/chartex" xmlns:cx8="http://schemas.microsoft.com/office/drawing/2016/5/14/chartex" xmlns:mc="http://schemas.openxmlformats.org/markup-compatibility/2006" xmlns:aink="http://schemas.microsoft.com/office/drawing/2016/ink" xmlns:am3d="http://schemas.microsoft.com/office/drawing/2017/model3d" xmlns:o="urn:schemas-microsoft-com:office:office" xmlns:oel="http://schemas.microsoft.com/office/2019/extlst" xmlns:r="http://schemas.openxmlformats.org/officeDocument/2006/relationships" xmlns:m="http://schemas.openxmlformats.org/officeDocument/2006/math" xmlns:v="urn:schemas-microsoft-com:vml" xmlns:wp14="http://schemas.microsoft.com/office/word/2010/wordprocessingDrawing" xmlns:wp="http://schemas.openxmlformats.org/drawingml/2006/wordprocessingDrawing" xmlns:w10="urn:schemas-microsoft-com:office:word" xmlns:w="http://schemas.openxmlformats.org/wordprocessingml/2006/main" xmlns:w14="http://schemas.microsoft.com/office/word/2010/wordml" xmlns:w15="http://schemas.microsoft.com/office/word/2012/wordml" xmlns:w16cex="http://schemas.microsoft.com/office/word/2018/wordml/cex" xmlns:w16cid="http://schemas.microsoft.com/office/word/2016/wordml/cid" xmlns:w16="http://schemas.microsoft.com/office/word/2018/wordml" xmlns:w16du="http://schemas.microsoft.com/office/word/2023/wordml/word16du" xmlns:w16sdtdh="http://schemas.microsoft.com/office/word/2020/wordml/sdtdatahash" xmlns:w16sdtfl="http://schemas.microsoft.com/office/word/2024/wordml/sdtformatlock" xmlns:w16se="http://schemas.microsoft.com/office/word/2015/wordml/symex" xmlns:wpg="http://schemas.microsoft.com/office/word/2010/wordprocessingGroup" xmlns:wpi="http://schemas.microsoft.com/office/word/2010/wordprocessingInk" xmlns:wne="http://schemas.microsoft.com/office/word/2006/wordml" xmlns:wps="http://schemas.microsoft.com/office/word/2010/wordprocessingShape" mc:Ignorable="w14 w15 w16se w16cid w16 w16cex w16sdtdh w16sdtfl w16du wp14">
   <w:footnote w:type="separator" w:id="-1">
     <w:p>
       <w:pPr>
@@ -7458,7 +5703,7 @@
 </file>
 
 <file path=word/numbering.xml><?xml version="1.0" encoding="utf-8"?>
-<w:numbering xmlns:wpc="http://schemas.microsoft.com/office/word/2010/wordprocessingCanvas" xmlns:cx="http://schemas.microsoft.com/office/drawing/2014/chartex" xmlns:cx1="http://schemas.microsoft.com/office/drawing/2015/9/8/chartex" xmlns:cx2="http://schemas.microsoft.com/office/drawing/2015/10/21/chartex" xmlns:cx3="http://schemas.microsoft.com/office/drawing/2016/5/9/chartex" xmlns:cx4="http://schemas.microsoft.com/office/drawing/2016/5/10/chartex" xmlns:cx5="http://schemas.microsoft.com/office/drawing/2016/5/11/chartex" xmlns:cx6="http://schemas.microsoft.com/office/drawing/2016/5/12/chartex" xmlns:cx7="http://schemas.microsoft.com/office/drawing/2016/5/13/chartex" xmlns:cx8="http://schemas.microsoft.com/office/drawing/2016/5/14/chartex" xmlns:mc="http://schemas.openxmlformats.org/markup-compatibility/2006" xmlns:aink="http://schemas.microsoft.com/office/drawing/2016/ink" xmlns:am3d="http://schemas.microsoft.com/office/drawing/2017/model3d" xmlns:o="urn:schemas-microsoft-com:office:office" xmlns:r="http://schemas.openxmlformats.org/officeDocument/2006/relationships" xmlns:m="http://schemas.openxmlformats.org/officeDocument/2006/math" xmlns:v="urn:schemas-microsoft-com:vml" xmlns:wp14="http://schemas.microsoft.com/office/word/2010/wordprocessingDrawing" xmlns:wp="http://schemas.openxmlformats.org/drawingml/2006/wordprocessingDrawing" xmlns:w10="urn:schemas-microsoft-com:office:word" xmlns:w="http://schemas.openxmlformats.org/wordprocessingml/2006/main" xmlns:w14="http://schemas.microsoft.com/office/word/2010/wordml" xmlns:w15="http://schemas.microsoft.com/office/word/2012/wordml" xmlns:w16cid="http://schemas.microsoft.com/office/word/2016/wordml/cid" xmlns:w16se="http://schemas.microsoft.com/office/word/2015/wordml/symex" xmlns:wpg="http://schemas.microsoft.com/office/word/2010/wordprocessingGroup" xmlns:wpi="http://schemas.microsoft.com/office/word/2010/wordprocessingInk" xmlns:wne="http://schemas.microsoft.com/office/word/2006/wordml" xmlns:wps="http://schemas.microsoft.com/office/word/2010/wordprocessingShape" mc:Ignorable="w14 w15 w16se w16cid wp14">
+<w:numbering xmlns:wpc="http://schemas.microsoft.com/office/word/2010/wordprocessingCanvas" xmlns:cx="http://schemas.microsoft.com/office/drawing/2014/chartex" xmlns:cx1="http://schemas.microsoft.com/office/drawing/2015/9/8/chartex" xmlns:cx2="http://schemas.microsoft.com/office/drawing/2015/10/21/chartex" xmlns:cx3="http://schemas.microsoft.com/office/drawing/2016/5/9/chartex" xmlns:cx4="http://schemas.microsoft.com/office/drawing/2016/5/10/chartex" xmlns:cx5="http://schemas.microsoft.com/office/drawing/2016/5/11/chartex" xmlns:cx6="http://schemas.microsoft.com/office/drawing/2016/5/12/chartex" xmlns:cx7="http://schemas.microsoft.com/office/drawing/2016/5/13/chartex" xmlns:cx8="http://schemas.microsoft.com/office/drawing/2016/5/14/chartex" xmlns:mc="http://schemas.openxmlformats.org/markup-compatibility/2006" xmlns:aink="http://schemas.microsoft.com/office/drawing/2016/ink" xmlns:am3d="http://schemas.microsoft.com/office/drawing/2017/model3d" xmlns:o="urn:schemas-microsoft-com:office:office" xmlns:oel="http://schemas.microsoft.com/office/2019/extlst" xmlns:r="http://schemas.openxmlformats.org/officeDocument/2006/relationships" xmlns:m="http://schemas.openxmlformats.org/officeDocument/2006/math" xmlns:v="urn:schemas-microsoft-com:vml" xmlns:wp14="http://schemas.microsoft.com/office/word/2010/wordprocessingDrawing" xmlns:wp="http://schemas.openxmlformats.org/drawingml/2006/wordprocessingDrawing" xmlns:w10="urn:schemas-microsoft-com:office:word" xmlns:w="http://schemas.openxmlformats.org/wordprocessingml/2006/main" xmlns:w14="http://schemas.microsoft.com/office/word/2010/wordml" xmlns:w15="http://schemas.microsoft.com/office/word/2012/wordml" xmlns:w16cex="http://schemas.microsoft.com/office/word/2018/wordml/cex" xmlns:w16cid="http://schemas.microsoft.com/office/word/2016/wordml/cid" xmlns:w16="http://schemas.microsoft.com/office/word/2018/wordml" xmlns:w16du="http://schemas.microsoft.com/office/word/2023/wordml/word16du" xmlns:w16sdtdh="http://schemas.microsoft.com/office/word/2020/wordml/sdtdatahash" xmlns:w16sdtfl="http://schemas.microsoft.com/office/word/2024/wordml/sdtformatlock" xmlns:w16se="http://schemas.microsoft.com/office/word/2015/wordml/symex" xmlns:wpg="http://schemas.microsoft.com/office/word/2010/wordprocessingGroup" xmlns:wpi="http://schemas.microsoft.com/office/word/2010/wordprocessingInk" xmlns:wne="http://schemas.microsoft.com/office/word/2006/wordml" xmlns:wps="http://schemas.microsoft.com/office/word/2010/wordprocessingShape" mc:Ignorable="w14 w15 w16se w16cid w16 w16cex w16sdtdh w16sdtfl w16du wp14">
   <w:abstractNum w:abstractNumId="0" w15:restartNumberingAfterBreak="0">
     <w:nsid w:val="0295446A"/>
     <w:multiLevelType w:val="hybridMultilevel"/>
@@ -11570,122 +9815,122 @@
       </w:rPr>
     </w:lvl>
   </w:abstractNum>
-  <w:num w:numId="1">
+  <w:num w:numId="1" w16cid:durableId="994921312">
     <w:abstractNumId w:val="14"/>
   </w:num>
-  <w:num w:numId="2">
+  <w:num w:numId="2" w16cid:durableId="749736600">
     <w:abstractNumId w:val="13"/>
   </w:num>
-  <w:num w:numId="3">
+  <w:num w:numId="3" w16cid:durableId="1254167965">
     <w:abstractNumId w:val="15"/>
   </w:num>
-  <w:num w:numId="4">
+  <w:num w:numId="4" w16cid:durableId="261256173">
     <w:abstractNumId w:val="0"/>
   </w:num>
-  <w:num w:numId="5">
+  <w:num w:numId="5" w16cid:durableId="262419482">
     <w:abstractNumId w:val="25"/>
   </w:num>
-  <w:num w:numId="6">
+  <w:num w:numId="6" w16cid:durableId="927882735">
     <w:abstractNumId w:val="10"/>
   </w:num>
-  <w:num w:numId="7">
+  <w:num w:numId="7" w16cid:durableId="766119016">
     <w:abstractNumId w:val="11"/>
   </w:num>
-  <w:num w:numId="8">
+  <w:num w:numId="8" w16cid:durableId="1347632378">
     <w:abstractNumId w:val="33"/>
   </w:num>
-  <w:num w:numId="9">
+  <w:num w:numId="9" w16cid:durableId="692342973">
     <w:abstractNumId w:val="17"/>
   </w:num>
-  <w:num w:numId="10">
+  <w:num w:numId="10" w16cid:durableId="1951087643">
     <w:abstractNumId w:val="22"/>
   </w:num>
-  <w:num w:numId="11">
+  <w:num w:numId="11" w16cid:durableId="694382079">
     <w:abstractNumId w:val="34"/>
   </w:num>
-  <w:num w:numId="12">
+  <w:num w:numId="12" w16cid:durableId="680352141">
     <w:abstractNumId w:val="27"/>
   </w:num>
-  <w:num w:numId="13">
+  <w:num w:numId="13" w16cid:durableId="331685270">
     <w:abstractNumId w:val="8"/>
   </w:num>
-  <w:num w:numId="14">
+  <w:num w:numId="14" w16cid:durableId="367876436">
     <w:abstractNumId w:val="3"/>
   </w:num>
-  <w:num w:numId="15">
+  <w:num w:numId="15" w16cid:durableId="1329475982">
     <w:abstractNumId w:val="4"/>
   </w:num>
-  <w:num w:numId="16">
+  <w:num w:numId="16" w16cid:durableId="1517235816">
     <w:abstractNumId w:val="7"/>
   </w:num>
-  <w:num w:numId="17">
+  <w:num w:numId="17" w16cid:durableId="166212563">
     <w:abstractNumId w:val="6"/>
   </w:num>
-  <w:num w:numId="18">
+  <w:num w:numId="18" w16cid:durableId="1462924091">
     <w:abstractNumId w:val="24"/>
   </w:num>
-  <w:num w:numId="19">
+  <w:num w:numId="19" w16cid:durableId="336008109">
     <w:abstractNumId w:val="35"/>
   </w:num>
-  <w:num w:numId="20">
+  <w:num w:numId="20" w16cid:durableId="1838643429">
     <w:abstractNumId w:val="16"/>
   </w:num>
-  <w:num w:numId="21">
+  <w:num w:numId="21" w16cid:durableId="1515068980">
     <w:abstractNumId w:val="29"/>
   </w:num>
-  <w:num w:numId="22">
+  <w:num w:numId="22" w16cid:durableId="260526165">
     <w:abstractNumId w:val="26"/>
   </w:num>
-  <w:num w:numId="23">
+  <w:num w:numId="23" w16cid:durableId="715005412">
     <w:abstractNumId w:val="31"/>
   </w:num>
-  <w:num w:numId="24">
+  <w:num w:numId="24" w16cid:durableId="1064328135">
     <w:abstractNumId w:val="19"/>
   </w:num>
-  <w:num w:numId="25">
+  <w:num w:numId="25" w16cid:durableId="287589999">
     <w:abstractNumId w:val="23"/>
   </w:num>
-  <w:num w:numId="26">
+  <w:num w:numId="26" w16cid:durableId="1995179523">
     <w:abstractNumId w:val="30"/>
   </w:num>
-  <w:num w:numId="27">
+  <w:num w:numId="27" w16cid:durableId="251402625">
     <w:abstractNumId w:val="12"/>
   </w:num>
-  <w:num w:numId="28">
+  <w:num w:numId="28" w16cid:durableId="594871109">
     <w:abstractNumId w:val="20"/>
   </w:num>
-  <w:num w:numId="29">
+  <w:num w:numId="29" w16cid:durableId="40637075">
     <w:abstractNumId w:val="9"/>
   </w:num>
-  <w:num w:numId="30">
+  <w:num w:numId="30" w16cid:durableId="401635553">
     <w:abstractNumId w:val="2"/>
   </w:num>
-  <w:num w:numId="31">
+  <w:num w:numId="31" w16cid:durableId="1306395837">
     <w:abstractNumId w:val="1"/>
   </w:num>
-  <w:num w:numId="32">
+  <w:num w:numId="32" w16cid:durableId="1614284322">
     <w:abstractNumId w:val="32"/>
   </w:num>
-  <w:num w:numId="33">
+  <w:num w:numId="33" w16cid:durableId="1047295402">
     <w:abstractNumId w:val="21"/>
   </w:num>
-  <w:num w:numId="34">
+  <w:num w:numId="34" w16cid:durableId="1123039045">
     <w:abstractNumId w:val="36"/>
   </w:num>
-  <w:num w:numId="35">
+  <w:num w:numId="35" w16cid:durableId="1819179126">
     <w:abstractNumId w:val="18"/>
   </w:num>
-  <w:num w:numId="36">
+  <w:num w:numId="36" w16cid:durableId="1666788120">
     <w:abstractNumId w:val="5"/>
   </w:num>
-  <w:num w:numId="37">
+  <w:num w:numId="37" w16cid:durableId="1066610756">
     <w:abstractNumId w:val="28"/>
   </w:num>
 </w:numbering>
 </file>
 
 <file path=word/styles.xml><?xml version="1.0" encoding="utf-8"?>
-<w:styles xmlns:mc="http://schemas.openxmlformats.org/markup-compatibility/2006" xmlns:r="http://schemas.openxmlformats.org/officeDocument/2006/relationships" xmlns:w="http://schemas.openxmlformats.org/wordprocessingml/2006/main" xmlns:w14="http://schemas.microsoft.com/office/word/2010/wordml" xmlns:w15="http://schemas.microsoft.com/office/word/2012/wordml" xmlns:w16cid="http://schemas.microsoft.com/office/word/2016/wordml/cid" xmlns:w16se="http://schemas.microsoft.com/office/word/2015/wordml/symex" mc:Ignorable="w14 w15 w16se w16cid">
+<w:styles xmlns:mc="http://schemas.openxmlformats.org/markup-compatibility/2006" xmlns:r="http://schemas.openxmlformats.org/officeDocument/2006/relationships" xmlns:w="http://schemas.openxmlformats.org/wordprocessingml/2006/main" xmlns:w14="http://schemas.microsoft.com/office/word/2010/wordml" xmlns:w15="http://schemas.microsoft.com/office/word/2012/wordml" xmlns:w16cex="http://schemas.microsoft.com/office/word/2018/wordml/cex" xmlns:w16cid="http://schemas.microsoft.com/office/word/2016/wordml/cid" xmlns:w16="http://schemas.microsoft.com/office/word/2018/wordml" xmlns:w16du="http://schemas.microsoft.com/office/word/2023/wordml/word16du" xmlns:w16sdtdh="http://schemas.microsoft.com/office/word/2020/wordml/sdtdatahash" xmlns:w16sdtfl="http://schemas.microsoft.com/office/word/2024/wordml/sdtformatlock" xmlns:w16se="http://schemas.microsoft.com/office/word/2015/wordml/symex" mc:Ignorable="w14 w15 w16se w16cid w16 w16cex w16sdtdh w16sdtfl w16du">
   <w:docDefaults>
     <w:rPrDefault>
       <w:rPr>
@@ -11703,7 +9948,7 @@
       </w:pPr>
     </w:pPrDefault>
   </w:docDefaults>
-  <w:latentStyles w:defLockedState="0" w:defUIPriority="99" w:defSemiHidden="0" w:defUnhideWhenUsed="0" w:defQFormat="0" w:count="375">
+  <w:latentStyles w:defLockedState="0" w:defUIPriority="99" w:defSemiHidden="0" w:defUnhideWhenUsed="0" w:defQFormat="0" w:count="376">
     <w:lsdException w:name="Normal" w:uiPriority="0" w:qFormat="1"/>
     <w:lsdException w:name="heading 1" w:uiPriority="9" w:qFormat="1"/>
     <w:lsdException w:name="heading 2" w:semiHidden="1" w:uiPriority="9" w:unhideWhenUsed="1" w:qFormat="1"/>
@@ -12079,6 +10324,7 @@
     <w:lsdException w:name="Smart Hyperlink" w:semiHidden="1" w:unhideWhenUsed="1"/>
     <w:lsdException w:name="Hashtag" w:semiHidden="1" w:unhideWhenUsed="1"/>
     <w:lsdException w:name="Unresolved Mention" w:semiHidden="1" w:unhideWhenUsed="1"/>
+    <w:lsdException w:name="Smart Link" w:semiHidden="1" w:unhideWhenUsed="1"/>
   </w:latentStyles>
   <w:style w:type="paragraph" w:default="1" w:styleId="Norml">
     <w:name w:val="Normal"/>
@@ -12970,7 +11216,7 @@
 </file>
 
 <file path=customXml/itemProps1.xml><?xml version="1.0" encoding="utf-8"?>
-<ds:datastoreItem xmlns:ds="http://schemas.openxmlformats.org/officeDocument/2006/customXml" ds:itemID="{E84574ED-4AC7-4765-96F8-215C6B2828AB}">
+<ds:datastoreItem xmlns:ds="http://schemas.openxmlformats.org/officeDocument/2006/customXml" ds:itemID="{6FE05396-C039-4728-8088-E3E7DDAAC21E}">
   <ds:schemaRefs>
     <ds:schemaRef ds:uri="http://schemas.openxmlformats.org/officeDocument/2006/bibliography"/>
   </ds:schemaRefs>

</xml_diff>